<commit_message>
CF ajustado - repositorio
</commit_message>
<xml_diff>
--- a/fuentes/12310040_CF1_DU.docx
+++ b/fuentes/12310040_CF1_DU.docx
@@ -1,6 +1,6 @@
 
 <file path=word/document.xml><?xml version="1.0" encoding="utf-8"?>
-<w:document xmlns:wpc="http://schemas.microsoft.com/office/word/2010/wordprocessingCanvas" xmlns:cx="http://schemas.microsoft.com/office/drawing/2014/chartex" xmlns:cx1="http://schemas.microsoft.com/office/drawing/2015/9/8/chartex" xmlns:cx2="http://schemas.microsoft.com/office/drawing/2015/10/21/chartex" xmlns:cx3="http://schemas.microsoft.com/office/drawing/2016/5/9/chartex" xmlns:cx4="http://schemas.microsoft.com/office/drawing/2016/5/10/chartex" xmlns:cx5="http://schemas.microsoft.com/office/drawing/2016/5/11/chartex" xmlns:cx6="http://schemas.microsoft.com/office/drawing/2016/5/12/chartex" xmlns:cx7="http://schemas.microsoft.com/office/drawing/2016/5/13/chartex" xmlns:cx8="http://schemas.microsoft.com/office/drawing/2016/5/14/chartex" xmlns:mc="http://schemas.openxmlformats.org/markup-compatibility/2006" xmlns:aink="http://schemas.microsoft.com/office/drawing/2016/ink" xmlns:am3d="http://schemas.microsoft.com/office/drawing/2017/model3d" xmlns:o="urn:schemas-microsoft-com:office:office" xmlns:r="http://schemas.openxmlformats.org/officeDocument/2006/relationships" xmlns:m="http://schemas.openxmlformats.org/officeDocument/2006/math" xmlns:v="urn:schemas-microsoft-com:vml" xmlns:wp14="http://schemas.microsoft.com/office/word/2010/wordprocessingDrawing" xmlns:wp="http://schemas.openxmlformats.org/drawingml/2006/wordprocessingDrawing" xmlns:w10="urn:schemas-microsoft-com:office:word" xmlns:w="http://schemas.openxmlformats.org/wordprocessingml/2006/main" xmlns:w14="http://schemas.microsoft.com/office/word/2010/wordml" xmlns:w15="http://schemas.microsoft.com/office/word/2012/wordml" xmlns:w16cex="http://schemas.microsoft.com/office/word/2018/wordml/cex" xmlns:w16cid="http://schemas.microsoft.com/office/word/2016/wordml/cid" xmlns:w16="http://schemas.microsoft.com/office/word/2018/wordml" xmlns:w16sdtdh="http://schemas.microsoft.com/office/word/2020/wordml/sdtdatahash" xmlns:w16se="http://schemas.microsoft.com/office/word/2015/wordml/symex" xmlns:wpg="http://schemas.microsoft.com/office/word/2010/wordprocessingGroup" xmlns:wpi="http://schemas.microsoft.com/office/word/2010/wordprocessingInk" xmlns:wne="http://schemas.microsoft.com/office/word/2006/wordml" xmlns:wps="http://schemas.microsoft.com/office/word/2010/wordprocessingShape" mc:Ignorable="w14 w15 w16se w16cid w16 w16cex w16sdtdh wp14">
+<w:document xmlns:wpc="http://schemas.microsoft.com/office/word/2010/wordprocessingCanvas" xmlns:cx="http://schemas.microsoft.com/office/drawing/2014/chartex" xmlns:cx1="http://schemas.microsoft.com/office/drawing/2015/9/8/chartex" xmlns:cx2="http://schemas.microsoft.com/office/drawing/2015/10/21/chartex" xmlns:cx3="http://schemas.microsoft.com/office/drawing/2016/5/9/chartex" xmlns:cx4="http://schemas.microsoft.com/office/drawing/2016/5/10/chartex" xmlns:cx5="http://schemas.microsoft.com/office/drawing/2016/5/11/chartex" xmlns:cx6="http://schemas.microsoft.com/office/drawing/2016/5/12/chartex" xmlns:cx7="http://schemas.microsoft.com/office/drawing/2016/5/13/chartex" xmlns:cx8="http://schemas.microsoft.com/office/drawing/2016/5/14/chartex" xmlns:mc="http://schemas.openxmlformats.org/markup-compatibility/2006" xmlns:aink="http://schemas.microsoft.com/office/drawing/2016/ink" xmlns:am3d="http://schemas.microsoft.com/office/drawing/2017/model3d" xmlns:o="urn:schemas-microsoft-com:office:office" xmlns:oel="http://schemas.microsoft.com/office/2019/extlst" xmlns:r="http://schemas.openxmlformats.org/officeDocument/2006/relationships" xmlns:m="http://schemas.openxmlformats.org/officeDocument/2006/math" xmlns:v="urn:schemas-microsoft-com:vml" xmlns:wp14="http://schemas.microsoft.com/office/word/2010/wordprocessingDrawing" xmlns:wp="http://schemas.openxmlformats.org/drawingml/2006/wordprocessingDrawing" xmlns:w10="urn:schemas-microsoft-com:office:word" xmlns:w="http://schemas.openxmlformats.org/wordprocessingml/2006/main" xmlns:w14="http://schemas.microsoft.com/office/word/2010/wordml" xmlns:w15="http://schemas.microsoft.com/office/word/2012/wordml" xmlns:w16cex="http://schemas.microsoft.com/office/word/2018/wordml/cex" xmlns:w16cid="http://schemas.microsoft.com/office/word/2016/wordml/cid" xmlns:w16="http://schemas.microsoft.com/office/word/2018/wordml" xmlns:w16du="http://schemas.microsoft.com/office/word/2023/wordml/word16du" xmlns:w16sdtdh="http://schemas.microsoft.com/office/word/2020/wordml/sdtdatahash" xmlns:w16sdtfl="http://schemas.microsoft.com/office/word/2024/wordml/sdtformatlock" xmlns:w16se="http://schemas.microsoft.com/office/word/2015/wordml/symex" xmlns:wpg="http://schemas.microsoft.com/office/word/2010/wordprocessingGroup" xmlns:wpi="http://schemas.microsoft.com/office/word/2010/wordprocessingInk" xmlns:wne="http://schemas.microsoft.com/office/word/2006/wordml" xmlns:wps="http://schemas.microsoft.com/office/word/2010/wordprocessingShape" mc:Ignorable="w14 w15 w16se w16cid w16 w16cex w16sdtdh w16sdtfl w16du wp14">
   <w:body>
     <w:p>
       <w:pPr>
@@ -234,7 +234,7 @@
                 <v:stroke joinstyle="miter"/>
                 <v:path gradientshapeok="t" o:connecttype="rect"/>
               </v:shapetype>
-              <v:shape id="Cuadro de texto 2" o:spid="_x0000_s1026" type="#_x0000_t202" alt="&quot;&quot;" style="position:absolute;left:0;text-align:left;margin-left:-19.2pt;margin-top:27.15pt;width:549pt;height:154.5pt;z-index:251663360;visibility:visible;mso-wrap-style:square;mso-width-percent:0;mso-height-percent:0;mso-wrap-distance-left:9pt;mso-wrap-distance-top:3.6pt;mso-wrap-distance-right:9pt;mso-wrap-distance-bottom:3.6pt;mso-position-horizontal:absolute;mso-position-horizontal-relative:text;mso-position-vertical:absolute;mso-position-vertical-relative:text;mso-width-percent:0;mso-height-percent:0;mso-width-relative:margin;mso-height-relative:margin;v-text-anchor:top" o:gfxdata="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" filled="f" stroked="f">
+              <v:shape id="Cuadro de texto 2" o:spid="_x0000_s1026" type="#_x0000_t202" alt="&quot;&quot;" style="position:absolute;left:0;text-align:left;margin-left:-19.2pt;margin-top:27.15pt;width:549pt;height:154.5pt;z-index:251663360;visibility:visible;mso-wrap-style:square;mso-width-percent:0;mso-height-percent:0;mso-wrap-distance-left:9pt;mso-wrap-distance-top:3.6pt;mso-wrap-distance-right:9pt;mso-wrap-distance-bottom:3.6pt;mso-position-horizontal:absolute;mso-position-horizontal-relative:text;mso-position-vertical:absolute;mso-position-vertical-relative:text;mso-width-percent:0;mso-height-percent:0;mso-width-relative:margin;mso-height-relative:margin;v-text-anchor:top" o:gfxdata="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" filled="f" stroked="f">
                 <v:textbox>
                   <w:txbxContent>
                     <w:p>
@@ -353,9 +353,9 @@
               </wp:anchor>
             </w:drawing>
           </mc:Choice>
-          <mc:Fallback xmlns:oel="http://schemas.microsoft.com/office/2019/extlst">
+          <mc:Fallback xmlns:asvg="http://schemas.microsoft.com/office/drawing/2016/SVG/main" xmlns:a14="http://schemas.microsoft.com/office/drawing/2010/main" xmlns:pic="http://schemas.openxmlformats.org/drawingml/2006/picture" xmlns:adec="http://schemas.microsoft.com/office/drawing/2017/decorative" xmlns:a="http://schemas.openxmlformats.org/drawingml/2006/main">
             <w:pict>
-              <v:rect w14:anchorId="44ECBD1E" id="Rectángulo 3" o:spid="_x0000_s1026" alt="&quot;&quot;" style="position:absolute;margin-left:-55.95pt;margin-top:26.4pt;width:613.85pt;height:164.25pt;z-index:-251655168;visibility:visible;mso-wrap-style:square;mso-height-percent:0;mso-wrap-distance-left:9pt;mso-wrap-distance-top:0;mso-wrap-distance-right:9pt;mso-wrap-distance-bottom:0;mso-position-horizontal:absolute;mso-position-horizontal-relative:text;mso-position-vertical:absolute;mso-position-vertical-relative:text;mso-height-percent:0;mso-height-relative:margin;v-text-anchor:middle" o:gfxdata="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" fillcolor="#00314d" stroked="f" strokeweight="1pt"/>
+              <v:rect id="Rectángulo 3" style="position:absolute;margin-left:-55.95pt;margin-top:26.4pt;width:613.85pt;height:164.25pt;z-index:-251655168;visibility:visible;mso-wrap-style:square;mso-height-percent:0;mso-wrap-distance-left:9pt;mso-wrap-distance-top:0;mso-wrap-distance-right:9pt;mso-wrap-distance-bottom:0;mso-position-horizontal:absolute;mso-position-horizontal-relative:text;mso-position-vertical:absolute;mso-position-vertical-relative:text;mso-height-percent:0;mso-height-relative:margin;v-text-anchor:middle" alt="&quot;&quot;" o:spid="_x0000_s1026" fillcolor="#00314d" stroked="f" strokeweight="1pt" w14:anchorId="44ECBD1E" o:gfxdata="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"/>
             </w:pict>
           </mc:Fallback>
         </mc:AlternateContent>
@@ -457,25 +457,7 @@
       </w:r>
     </w:p>
     <w:p>
-      <w:pPr>
-        <w:pBdr>
-          <w:bottom w:val="single" w:sz="12" w:space="1" w:color="auto"/>
-        </w:pBdr>
-        <w:ind w:left="708" w:firstLine="1"/>
-        <w:rPr>
-          <w:rFonts w:ascii="Calibri" w:hAnsi="Calibri"/>
-          <w:color w:val="000000" w:themeColor="text1"/>
-          <w:kern w:val="0"/>
-          <w14:ligatures w14:val="none"/>
-        </w:rPr>
-      </w:pPr>
-      <w:r>
-        <w:rPr>
-          <w:rFonts w:ascii="Calibri" w:hAnsi="Calibri"/>
-          <w:color w:val="000000" w:themeColor="text1"/>
-          <w:kern w:val="0"/>
-          <w14:ligatures w14:val="none"/>
-        </w:rPr>
+      <w:r>
         <w:t>Este componente describe y orienta al aprendiz en la identificación de necesidades del entorno desde su contexto profesional. Así mismo, fortalece habilidades para reconocer e identificar los elementos fundamentales para el desarrollo de proyectos.</w:t>
       </w:r>
     </w:p>
@@ -552,7 +534,6 @@
           <w:docPartUnique/>
         </w:docPartObj>
       </w:sdtPr>
-      <w:sdtEndPr/>
       <w:sdtContent>
         <w:p>
           <w:pPr>
@@ -1120,7 +1101,7 @@
                 <w:noProof/>
                 <w:webHidden/>
               </w:rPr>
-              <w:t>13</w:t>
+              <w:t>12</w:t>
             </w:r>
             <w:r>
               <w:rPr>
@@ -1408,7 +1389,7 @@
                 <w:noProof/>
                 <w:webHidden/>
               </w:rPr>
-              <w:t>20</w:t>
+              <w:t>19</w:t>
             </w:r>
             <w:r>
               <w:rPr>
@@ -1506,7 +1487,7 @@
                 <w:noProof/>
                 <w:webHidden/>
               </w:rPr>
-              <w:t>22</w:t>
+              <w:t>21</w:t>
             </w:r>
             <w:r>
               <w:rPr>
@@ -1604,7 +1585,7 @@
                 <w:noProof/>
                 <w:webHidden/>
               </w:rPr>
-              <w:t>24</w:t>
+              <w:t>23</w:t>
             </w:r>
             <w:r>
               <w:rPr>
@@ -1702,7 +1683,7 @@
                 <w:noProof/>
                 <w:webHidden/>
               </w:rPr>
-              <w:t>27</w:t>
+              <w:t>25</w:t>
             </w:r>
             <w:r>
               <w:rPr>
@@ -1794,7 +1775,7 @@
                 <w:noProof/>
                 <w:webHidden/>
               </w:rPr>
-              <w:t>30</w:t>
+              <w:t>28</w:t>
             </w:r>
             <w:r>
               <w:rPr>
@@ -1892,7 +1873,7 @@
                 <w:noProof/>
                 <w:webHidden/>
               </w:rPr>
-              <w:t>31</w:t>
+              <w:t>29</w:t>
             </w:r>
             <w:r>
               <w:rPr>
@@ -1990,7 +1971,7 @@
                 <w:noProof/>
                 <w:webHidden/>
               </w:rPr>
-              <w:t>34</w:t>
+              <w:t>32</w:t>
             </w:r>
             <w:r>
               <w:rPr>
@@ -2088,7 +2069,7 @@
                 <w:noProof/>
                 <w:webHidden/>
               </w:rPr>
-              <w:t>40</w:t>
+              <w:t>37</w:t>
             </w:r>
             <w:r>
               <w:rPr>
@@ -2186,7 +2167,7 @@
                 <w:noProof/>
                 <w:webHidden/>
               </w:rPr>
-              <w:t>42</w:t>
+              <w:t>39</w:t>
             </w:r>
             <w:r>
               <w:rPr>
@@ -2259,7 +2240,7 @@
                 <w:noProof/>
                 <w:webHidden/>
               </w:rPr>
-              <w:t>45</w:t>
+              <w:t>42</w:t>
             </w:r>
             <w:r>
               <w:rPr>
@@ -2332,7 +2313,7 @@
                 <w:noProof/>
                 <w:webHidden/>
               </w:rPr>
-              <w:t>46</w:t>
+              <w:t>43</w:t>
             </w:r>
             <w:r>
               <w:rPr>
@@ -2405,7 +2386,7 @@
                 <w:noProof/>
                 <w:webHidden/>
               </w:rPr>
-              <w:t>48</w:t>
+              <w:t>45</w:t>
             </w:r>
             <w:r>
               <w:rPr>
@@ -2478,7 +2459,7 @@
                 <w:noProof/>
                 <w:webHidden/>
               </w:rPr>
-              <w:t>49</w:t>
+              <w:t>46</w:t>
             </w:r>
             <w:r>
               <w:rPr>
@@ -2598,13 +2579,6 @@
           <w:lang w:val="es-419" w:eastAsia="es-CO"/>
         </w:rPr>
       </w:pPr>
-    </w:p>
-    <w:p>
-      <w:pPr>
-        <w:rPr>
-          <w:lang w:val="es-419" w:eastAsia="es-CO"/>
-        </w:rPr>
-      </w:pPr>
       <w:r>
         <w:rPr>
           <w:lang w:val="es-419" w:eastAsia="es-CO"/>
@@ -2641,13 +2615,6 @@
           <w:lang w:val="es-419" w:eastAsia="es-CO"/>
         </w:rPr>
       </w:pPr>
-    </w:p>
-    <w:p>
-      <w:pPr>
-        <w:rPr>
-          <w:lang w:val="es-419" w:eastAsia="es-CO"/>
-        </w:rPr>
-      </w:pPr>
       <w:r>
         <w:rPr>
           <w:lang w:val="es-419" w:eastAsia="es-CO"/>
@@ -2678,7 +2645,6 @@
         <w:rPr>
           <w:lang w:val="es-419" w:eastAsia="es-CO"/>
         </w:rPr>
-        <w:lastRenderedPageBreak/>
         <w:t xml:space="preserve">Todo proyecto debe estar orientado hacia un </w:t>
       </w:r>
       <w:r>
@@ -2715,7 +2681,16 @@
           <w:bCs/>
           <w:lang w:val="es-419" w:eastAsia="es-CO"/>
         </w:rPr>
-        <w:t>propuesta estructurada que responde a una problemática real del entorno profesional.</w:t>
+        <w:t xml:space="preserve">propuesta </w:t>
+      </w:r>
+      <w:r>
+        <w:rPr>
+          <w:b/>
+          <w:bCs/>
+          <w:lang w:val="es-419" w:eastAsia="es-CO"/>
+        </w:rPr>
+        <w:lastRenderedPageBreak/>
+        <w:t>estructurada que responde a una problemática real del entorno profesional.</w:t>
       </w:r>
       <w:r>
         <w:rPr>
@@ -2731,7 +2706,7 @@
           <w:ilvl w:val="0"/>
           <w:numId w:val="7"/>
         </w:numPr>
-        <w:ind w:left="567" w:hanging="283"/>
+        <w:ind w:left="567" w:hanging="425"/>
         <w:rPr>
           <w:lang w:val="es-419" w:eastAsia="es-CO"/>
         </w:rPr>
@@ -2764,7 +2739,7 @@
           <w:ilvl w:val="0"/>
           <w:numId w:val="7"/>
         </w:numPr>
-        <w:ind w:left="567" w:hanging="283"/>
+        <w:ind w:left="567" w:hanging="425"/>
         <w:rPr>
           <w:lang w:val="es-419" w:eastAsia="es-CO"/>
         </w:rPr>
@@ -2797,7 +2772,7 @@
           <w:ilvl w:val="0"/>
           <w:numId w:val="7"/>
         </w:numPr>
-        <w:ind w:left="567" w:hanging="283"/>
+        <w:ind w:left="567" w:hanging="425"/>
         <w:rPr>
           <w:lang w:val="es-419" w:eastAsia="es-CO"/>
         </w:rPr>
@@ -2830,7 +2805,7 @@
           <w:ilvl w:val="0"/>
           <w:numId w:val="7"/>
         </w:numPr>
-        <w:ind w:left="567" w:hanging="283"/>
+        <w:ind w:left="567" w:hanging="425"/>
         <w:rPr>
           <w:lang w:val="es-419" w:eastAsia="es-CO"/>
         </w:rPr>
@@ -2884,7 +2859,7 @@
           <w:ilvl w:val="0"/>
           <w:numId w:val="8"/>
         </w:numPr>
-        <w:ind w:left="567" w:hanging="283"/>
+        <w:ind w:left="567" w:hanging="425"/>
         <w:rPr>
           <w:lang w:val="es-419" w:eastAsia="es-CO"/>
         </w:rPr>
@@ -2903,7 +2878,7 @@
           <w:ilvl w:val="0"/>
           <w:numId w:val="8"/>
         </w:numPr>
-        <w:ind w:left="567" w:hanging="283"/>
+        <w:ind w:left="567" w:hanging="425"/>
         <w:rPr>
           <w:lang w:val="es-419" w:eastAsia="es-CO"/>
         </w:rPr>
@@ -2922,7 +2897,7 @@
           <w:ilvl w:val="0"/>
           <w:numId w:val="8"/>
         </w:numPr>
-        <w:ind w:left="567" w:hanging="283"/>
+        <w:ind w:left="567" w:hanging="425"/>
         <w:rPr>
           <w:lang w:val="es-419" w:eastAsia="es-CO"/>
         </w:rPr>
@@ -2941,7 +2916,7 @@
           <w:ilvl w:val="0"/>
           <w:numId w:val="8"/>
         </w:numPr>
-        <w:ind w:left="567" w:hanging="283"/>
+        <w:ind w:left="567" w:hanging="425"/>
         <w:rPr>
           <w:lang w:val="es-419" w:eastAsia="es-CO"/>
         </w:rPr>
@@ -2971,7 +2946,7 @@
         <w:tabs>
           <w:tab w:val="left" w:pos="915"/>
         </w:tabs>
-        <w:ind w:left="567" w:hanging="283"/>
+        <w:ind w:left="567" w:hanging="425"/>
         <w:rPr>
           <w:lang w:val="es-419" w:eastAsia="es-CO"/>
         </w:rPr>
@@ -2993,7 +2968,7 @@
         <w:tabs>
           <w:tab w:val="left" w:pos="915"/>
         </w:tabs>
-        <w:ind w:left="567" w:hanging="283"/>
+        <w:ind w:left="567" w:hanging="425"/>
         <w:rPr>
           <w:lang w:val="es-419" w:eastAsia="es-CO"/>
         </w:rPr>
@@ -3015,7 +2990,7 @@
         <w:tabs>
           <w:tab w:val="left" w:pos="915"/>
         </w:tabs>
-        <w:ind w:left="567" w:hanging="283"/>
+        <w:ind w:left="567" w:hanging="425"/>
         <w:rPr>
           <w:lang w:val="es-419" w:eastAsia="es-CO"/>
         </w:rPr>
@@ -3037,16 +3012,15 @@
         <w:tabs>
           <w:tab w:val="left" w:pos="915"/>
         </w:tabs>
-        <w:ind w:left="567" w:hanging="283"/>
-        <w:rPr>
-          <w:lang w:val="es-419" w:eastAsia="es-CO"/>
-        </w:rPr>
-      </w:pPr>
-      <w:r>
-        <w:rPr>
-          <w:lang w:val="es-419" w:eastAsia="es-CO"/>
-        </w:rPr>
-        <w:lastRenderedPageBreak/>
+        <w:ind w:left="567" w:hanging="425"/>
+        <w:rPr>
+          <w:lang w:val="es-419" w:eastAsia="es-CO"/>
+        </w:rPr>
+      </w:pPr>
+      <w:r>
+        <w:rPr>
+          <w:lang w:val="es-419" w:eastAsia="es-CO"/>
+        </w:rPr>
         <w:t>Se ejecuta bajo procedimientos ya definidos.</w:t>
       </w:r>
     </w:p>
@@ -3072,7 +3046,16 @@
           <w:bCs/>
           <w:lang w:val="es-419" w:eastAsia="es-CO"/>
         </w:rPr>
-        <w:t>un proceso estructurado que integra múltiples elementos y fases</w:t>
+        <w:t xml:space="preserve">un proceso estructurado que integra múltiples </w:t>
+      </w:r>
+      <w:r>
+        <w:rPr>
+          <w:b/>
+          <w:bCs/>
+          <w:lang w:val="es-419" w:eastAsia="es-CO"/>
+        </w:rPr>
+        <w:lastRenderedPageBreak/>
+        <w:t>elementos y fases</w:t>
       </w:r>
       <w:r>
         <w:rPr>
@@ -3104,14 +3087,6 @@
     </w:p>
     <w:p>
       <w:pPr>
-        <w:ind w:firstLine="0"/>
-        <w:rPr>
-          <w:lang w:val="es-419" w:eastAsia="es-CO"/>
-        </w:rPr>
-      </w:pPr>
-    </w:p>
-    <w:p>
-      <w:pPr>
         <w:rPr>
           <w:lang w:val="es-419" w:eastAsia="es-CO"/>
         </w:rPr>
@@ -3164,25 +3139,11 @@
           <w:lang w:val="es-419" w:eastAsia="es-CO"/>
         </w:rPr>
       </w:pPr>
-    </w:p>
-    <w:p>
-      <w:pPr>
-        <w:rPr>
-          <w:lang w:val="es-419" w:eastAsia="es-CO"/>
-        </w:rPr>
-      </w:pPr>
-      <w:r>
-        <w:rPr>
-          <w:lang w:val="es-419" w:eastAsia="es-CO"/>
-        </w:rPr>
-        <w:t xml:space="preserve">Formular proyectos es fundamental porque permite organizar ideas de manera estructurada y orientar las acciones hacia un propósito definido. A través de este proceso, una necesidad identificada se transforma en una propuesta clara, coherente y </w:t>
-      </w:r>
-      <w:r>
-        <w:rPr>
-          <w:lang w:val="es-419" w:eastAsia="es-CO"/>
-        </w:rPr>
-        <w:lastRenderedPageBreak/>
-        <w:t>comprensible, lo que facilita la planificación y el análisis previo a cualquier intervención. La formulación contribuye a:</w:t>
+      <w:r>
+        <w:rPr>
+          <w:lang w:val="es-419" w:eastAsia="es-CO"/>
+        </w:rPr>
+        <w:t>Formular proyectos es fundamental porque permite organizar ideas de manera estructurada y orientar las acciones hacia un propósito definido. A través de este proceso, una necesidad identificada se transforma en una propuesta clara, coherente y comprensible, lo que facilita la planificación y el análisis previo a cualquier intervención. La formulación contribuye a:</w:t>
       </w:r>
     </w:p>
     <w:p>
@@ -3199,7 +3160,7 @@
           <w:ilvl w:val="0"/>
           <w:numId w:val="10"/>
         </w:numPr>
-        <w:ind w:left="567" w:hanging="283"/>
+        <w:ind w:left="567" w:hanging="425"/>
         <w:rPr>
           <w:lang w:val="es-419" w:eastAsia="es-CO"/>
         </w:rPr>
@@ -3218,7 +3179,7 @@
           <w:ilvl w:val="0"/>
           <w:numId w:val="10"/>
         </w:numPr>
-        <w:ind w:left="567" w:hanging="283"/>
+        <w:ind w:left="567" w:hanging="425"/>
         <w:rPr>
           <w:lang w:val="es-419" w:eastAsia="es-CO"/>
         </w:rPr>
@@ -3237,7 +3198,7 @@
           <w:ilvl w:val="0"/>
           <w:numId w:val="10"/>
         </w:numPr>
-        <w:ind w:left="567" w:hanging="283"/>
+        <w:ind w:left="567" w:hanging="425"/>
         <w:rPr>
           <w:lang w:val="es-419" w:eastAsia="es-CO"/>
         </w:rPr>
@@ -3256,28 +3217,22 @@
           <w:ilvl w:val="0"/>
           <w:numId w:val="10"/>
         </w:numPr>
-        <w:ind w:left="567" w:hanging="283"/>
-        <w:rPr>
-          <w:lang w:val="es-419" w:eastAsia="es-CO"/>
-        </w:rPr>
-      </w:pPr>
-      <w:r>
-        <w:rPr>
-          <w:lang w:val="es-419" w:eastAsia="es-CO"/>
-        </w:rPr>
+        <w:ind w:left="567" w:hanging="425"/>
+        <w:rPr>
+          <w:lang w:val="es-419" w:eastAsia="es-CO"/>
+        </w:rPr>
+      </w:pPr>
+      <w:r>
+        <w:rPr>
+          <w:lang w:val="es-419" w:eastAsia="es-CO"/>
+        </w:rPr>
+        <w:lastRenderedPageBreak/>
         <w:t>Una comprensión integral del proceso.</w:t>
       </w:r>
     </w:p>
     <w:p>
       <w:pPr>
-        <w:ind w:firstLine="0"/>
-        <w:rPr>
-          <w:lang w:val="es-419" w:eastAsia="es-CO"/>
-        </w:rPr>
-      </w:pPr>
-    </w:p>
-    <w:p>
-      <w:pPr>
+        <w:ind w:hanging="425"/>
         <w:rPr>
           <w:lang w:val="es-419" w:eastAsia="es-CO"/>
         </w:rPr>
@@ -3310,26 +3265,12 @@
           <w:lang w:val="es-419" w:eastAsia="es-CO"/>
         </w:rPr>
       </w:pPr>
-    </w:p>
-    <w:p>
-      <w:pPr>
-        <w:rPr>
-          <w:lang w:val="es-419" w:eastAsia="es-CO"/>
-        </w:rPr>
-      </w:pPr>
       <w:r>
         <w:rPr>
           <w:lang w:val="es-419" w:eastAsia="es-CO"/>
         </w:rPr>
         <w:t>Cuando las ideas no se estructuran bajo un enfoque de proyecto, las acciones suelen desarrollarse de manera improvisada y desorganizada. La ausencia de una formulación clara puede generar:</w:t>
       </w:r>
-    </w:p>
-    <w:p>
-      <w:pPr>
-        <w:rPr>
-          <w:lang w:val="es-419" w:eastAsia="es-CO"/>
-        </w:rPr>
-      </w:pPr>
     </w:p>
     <w:p>
       <w:pPr>
@@ -3338,7 +3279,7 @@
           <w:ilvl w:val="0"/>
           <w:numId w:val="15"/>
         </w:numPr>
-        <w:ind w:left="567" w:hanging="283"/>
+        <w:ind w:left="567" w:hanging="425"/>
         <w:rPr>
           <w:lang w:val="es-419" w:eastAsia="es-CO"/>
         </w:rPr>
@@ -3357,7 +3298,7 @@
           <w:ilvl w:val="0"/>
           <w:numId w:val="15"/>
         </w:numPr>
-        <w:ind w:left="567" w:hanging="283"/>
+        <w:ind w:left="567" w:hanging="425"/>
         <w:rPr>
           <w:lang w:val="es-419" w:eastAsia="es-CO"/>
         </w:rPr>
@@ -3376,7 +3317,7 @@
           <w:ilvl w:val="0"/>
           <w:numId w:val="15"/>
         </w:numPr>
-        <w:ind w:left="567" w:hanging="283"/>
+        <w:ind w:left="567" w:hanging="425"/>
         <w:rPr>
           <w:lang w:val="es-419" w:eastAsia="es-CO"/>
         </w:rPr>
@@ -3395,7 +3336,7 @@
           <w:ilvl w:val="0"/>
           <w:numId w:val="15"/>
         </w:numPr>
-        <w:ind w:left="567" w:hanging="283"/>
+        <w:ind w:left="567" w:hanging="425"/>
         <w:rPr>
           <w:lang w:val="es-419" w:eastAsia="es-CO"/>
         </w:rPr>
@@ -3417,7 +3358,6 @@
         <w:rPr>
           <w:lang w:val="es-419" w:eastAsia="es-CO"/>
         </w:rPr>
-        <w:lastRenderedPageBreak/>
         <w:t>En estas condiciones, el propósito de las acciones puede perderse, afectando la efectividad de las iniciativas y reduciendo su impacto en el contexto de intervención. Para sintetizar estas diferencias, se presenta la siguiente comparación:</w:t>
       </w:r>
     </w:p>
@@ -3436,7 +3376,7 @@
           <w:ilvl w:val="0"/>
           <w:numId w:val="11"/>
         </w:numPr>
-        <w:ind w:left="567" w:hanging="283"/>
+        <w:ind w:left="567" w:hanging="425"/>
         <w:rPr>
           <w:lang w:val="es-419" w:eastAsia="es-CO"/>
         </w:rPr>
@@ -3455,7 +3395,7 @@
           <w:ilvl w:val="0"/>
           <w:numId w:val="11"/>
         </w:numPr>
-        <w:ind w:left="567" w:hanging="283"/>
+        <w:ind w:left="567" w:hanging="425"/>
         <w:rPr>
           <w:lang w:val="es-419" w:eastAsia="es-CO"/>
         </w:rPr>
@@ -3474,7 +3414,7 @@
           <w:ilvl w:val="0"/>
           <w:numId w:val="11"/>
         </w:numPr>
-        <w:ind w:left="567" w:hanging="283"/>
+        <w:ind w:left="567" w:hanging="425"/>
         <w:rPr>
           <w:lang w:val="es-419" w:eastAsia="es-CO"/>
         </w:rPr>
@@ -3493,7 +3433,7 @@
           <w:ilvl w:val="0"/>
           <w:numId w:val="11"/>
         </w:numPr>
-        <w:ind w:left="567" w:hanging="283"/>
+        <w:ind w:left="567" w:hanging="425"/>
         <w:rPr>
           <w:lang w:val="es-419" w:eastAsia="es-CO"/>
         </w:rPr>
@@ -3509,12 +3449,8 @@
       <w:pPr>
         <w:pStyle w:val="Ttulo5"/>
       </w:pPr>
-    </w:p>
-    <w:p>
-      <w:pPr>
-        <w:pStyle w:val="Ttulo5"/>
-      </w:pPr>
-      <w:r>
+      <w:r>
+        <w:lastRenderedPageBreak/>
         <w:t>Sin formulación de proyecto</w:t>
       </w:r>
     </w:p>
@@ -3525,7 +3461,7 @@
           <w:ilvl w:val="0"/>
           <w:numId w:val="12"/>
         </w:numPr>
-        <w:ind w:left="567" w:hanging="283"/>
+        <w:ind w:left="567" w:hanging="425"/>
         <w:rPr>
           <w:lang w:val="es-419" w:eastAsia="es-CO"/>
         </w:rPr>
@@ -3544,7 +3480,7 @@
           <w:ilvl w:val="0"/>
           <w:numId w:val="12"/>
         </w:numPr>
-        <w:ind w:left="567" w:hanging="283"/>
+        <w:ind w:left="567" w:hanging="425"/>
         <w:rPr>
           <w:lang w:val="es-419" w:eastAsia="es-CO"/>
         </w:rPr>
@@ -3563,7 +3499,7 @@
           <w:ilvl w:val="0"/>
           <w:numId w:val="12"/>
         </w:numPr>
-        <w:ind w:left="567" w:hanging="283"/>
+        <w:ind w:left="567" w:hanging="425"/>
         <w:rPr>
           <w:lang w:val="es-419" w:eastAsia="es-CO"/>
         </w:rPr>
@@ -3582,7 +3518,7 @@
           <w:ilvl w:val="0"/>
           <w:numId w:val="12"/>
         </w:numPr>
-        <w:ind w:left="567" w:hanging="283"/>
+        <w:ind w:left="567" w:hanging="425"/>
         <w:rPr>
           <w:lang w:val="es-419" w:eastAsia="es-CO"/>
         </w:rPr>
@@ -3596,14 +3532,6 @@
     </w:p>
     <w:p>
       <w:pPr>
-        <w:ind w:firstLine="0"/>
-        <w:rPr>
-          <w:lang w:val="es-419" w:eastAsia="es-CO"/>
-        </w:rPr>
-      </w:pPr>
-    </w:p>
-    <w:p>
-      <w:pPr>
         <w:rPr>
           <w:lang w:val="es-419" w:eastAsia="es-CO"/>
         </w:rPr>
@@ -3624,33 +3552,11 @@
     </w:p>
     <w:p>
       <w:pPr>
-        <w:rPr>
-          <w:lang w:val="es-419" w:eastAsia="es-CO"/>
-        </w:rPr>
-      </w:pPr>
-    </w:p>
-    <w:p>
-      <w:pPr>
-        <w:rPr>
-          <w:lang w:val="es-419" w:eastAsia="es-CO"/>
-        </w:rPr>
-      </w:pPr>
-    </w:p>
-    <w:p>
-      <w:pPr>
         <w:pStyle w:val="Ttulo3"/>
       </w:pPr>
       <w:r>
-        <w:lastRenderedPageBreak/>
         <w:t>¿Qué aporta a la profesión?</w:t>
       </w:r>
-    </w:p>
-    <w:p>
-      <w:pPr>
-        <w:rPr>
-          <w:lang w:val="es-419" w:eastAsia="es-CO"/>
-        </w:rPr>
-      </w:pPr>
     </w:p>
     <w:p>
       <w:pPr>
@@ -3755,6 +3661,7 @@
       </w:pPr>
       <w:bookmarkStart w:id="4" w:name="_Toc224715451"/>
       <w:r>
+        <w:lastRenderedPageBreak/>
         <w:t>Características de un proyecto</w:t>
       </w:r>
       <w:bookmarkEnd w:id="4"/>
@@ -3765,13 +3672,6 @@
           <w:lang w:val="es-419" w:eastAsia="es-CO"/>
         </w:rPr>
       </w:pPr>
-    </w:p>
-    <w:p>
-      <w:pPr>
-        <w:rPr>
-          <w:lang w:val="es-419" w:eastAsia="es-CO"/>
-        </w:rPr>
-      </w:pPr>
       <w:r>
         <w:rPr>
           <w:lang w:val="es-419" w:eastAsia="es-CO"/>
@@ -3788,20 +3688,6 @@
     </w:p>
     <w:p>
       <w:pPr>
-        <w:rPr>
-          <w:lang w:val="es-419" w:eastAsia="es-CO"/>
-        </w:rPr>
-      </w:pPr>
-    </w:p>
-    <w:p>
-      <w:pPr>
-        <w:rPr>
-          <w:lang w:val="es-419" w:eastAsia="es-CO"/>
-        </w:rPr>
-      </w:pPr>
-    </w:p>
-    <w:p>
-      <w:pPr>
         <w:pStyle w:val="Video"/>
         <w:rPr>
           <w:lang w:val="es-419" w:eastAsia="es-CO"/>
@@ -3811,12 +3697,13 @@
         <w:rPr>
           <w:lang w:val="es-419" w:eastAsia="es-CO"/>
         </w:rPr>
-        <w:lastRenderedPageBreak/>
-        <w:t>FORMULACIÓN DE PROYECTOS EN MI PROFESIÓN</w:t>
-      </w:r>
-    </w:p>
-    <w:p>
-      <w:pPr>
+        <w:t>Características de un proyecto</w:t>
+      </w:r>
+    </w:p>
+    <w:p>
+      <w:pPr>
+        <w:ind w:firstLine="0"/>
+        <w:jc w:val="center"/>
         <w:rPr>
           <w:lang w:val="es-419" w:eastAsia="es-CO"/>
         </w:rPr>
@@ -3824,13 +3711,18 @@
       <w:r>
         <w:rPr>
           <w:noProof/>
-          <w:lang w:val="es-419" w:eastAsia="es-CO"/>
         </w:rPr>
         <w:drawing>
-          <wp:inline distT="0" distB="0" distL="0" distR="0" wp14:anchorId="52436F63" wp14:editId="1D6F7487">
-            <wp:extent cx="10306050" cy="5797153"/>
-            <wp:effectExtent l="0" t="0" r="0" b="0"/>
-            <wp:docPr id="1" name="Imagen 1"/>
+          <wp:inline distT="0" distB="0" distL="0" distR="0" wp14:anchorId="6C642E45" wp14:editId="00210403">
+            <wp:extent cx="6332220" cy="3561874"/>
+            <wp:effectExtent l="0" t="0" r="0" b="635"/>
+            <wp:docPr id="1" name="Imagen 1">
+              <a:extLst xmlns:a="http://schemas.openxmlformats.org/drawingml/2006/main">
+                <a:ext uri="{C183D7F6-B498-43B3-948B-1728B52AA6E4}">
+                  <adec:decorative xmlns:adec="http://schemas.microsoft.com/office/drawing/2017/decorative" val="1"/>
+                </a:ext>
+              </a:extLst>
+            </wp:docPr>
             <wp:cNvGraphicFramePr>
               <a:graphicFrameLocks xmlns:a="http://schemas.openxmlformats.org/drawingml/2006/main" noChangeAspect="1"/>
             </wp:cNvGraphicFramePr>
@@ -3838,7 +3730,13 @@
               <a:graphicData uri="http://schemas.openxmlformats.org/drawingml/2006/picture">
                 <pic:pic xmlns:pic="http://schemas.openxmlformats.org/drawingml/2006/picture">
                   <pic:nvPicPr>
-                    <pic:cNvPr id="0" name="Picture 2"/>
+                    <pic:cNvPr id="1" name="Imagen 1">
+                      <a:extLst>
+                        <a:ext uri="{C183D7F6-B498-43B3-948B-1728B52AA6E4}">
+                          <adec:decorative xmlns:adec="http://schemas.microsoft.com/office/drawing/2017/decorative" val="1"/>
+                        </a:ext>
+                      </a:extLst>
+                    </pic:cNvPr>
                     <pic:cNvPicPr>
                       <a:picLocks noChangeAspect="1" noChangeArrowheads="1"/>
                     </pic:cNvPicPr>
@@ -3859,12 +3757,15 @@
                   <pic:spPr bwMode="auto">
                     <a:xfrm>
                       <a:off x="0" y="0"/>
-                      <a:ext cx="10322584" cy="5806453"/>
+                      <a:ext cx="6332220" cy="3561874"/>
                     </a:xfrm>
                     <a:prstGeom prst="rect">
                       <a:avLst/>
                     </a:prstGeom>
                     <a:noFill/>
+                    <a:ln>
+                      <a:noFill/>
+                    </a:ln>
                   </pic:spPr>
                 </pic:pic>
               </a:graphicData>
@@ -3907,12 +3808,27 @@
       <w:pPr>
         <w:ind w:firstLine="0"/>
         <w:jc w:val="center"/>
+        <w:rPr>
+          <w:b/>
+        </w:rPr>
       </w:pPr>
     </w:p>
     <w:p>
       <w:pPr>
         <w:ind w:firstLine="0"/>
         <w:jc w:val="center"/>
+        <w:rPr>
+          <w:b/>
+        </w:rPr>
+      </w:pPr>
+    </w:p>
+    <w:p>
+      <w:pPr>
+        <w:ind w:firstLine="0"/>
+        <w:jc w:val="center"/>
+        <w:rPr>
+          <w:b/>
+        </w:rPr>
       </w:pPr>
     </w:p>
     <w:tbl>
@@ -3960,7 +3876,7 @@
               <w:rPr>
                 <w:b/>
               </w:rPr>
-              <w:t>FORMULACIÓN DE PROYECTOS EN MI PROFESIÓN</w:t>
+              <w:t>Características de un proyecto</w:t>
             </w:r>
           </w:p>
         </w:tc>
@@ -3970,72 +3886,48 @@
           <w:tcPr>
             <w:tcW w:w="9962" w:type="dxa"/>
           </w:tcPr>
-          <w:p/>
           <w:p>
             <w:r>
-              <w:t>¡Hola!</w:t>
+              <w:t>Características de un proyecto.</w:t>
             </w:r>
           </w:p>
           <w:p>
             <w:r>
-              <w:t>En este video vamos a conocer las principales características de un proyecto dentro del ámbito de la gestión organizacional.</w:t>
+              <w:t>Hola, en este video vamos a conocer las principales características de un proyecto dentro del ámbito de la gestión organizacional.</w:t>
             </w:r>
           </w:p>
           <w:p>
             <w:r>
-              <w:t>Lo primero, es que un proyecto es una iniciativa temporal. A diferencia de las operaciones del día a día, los proyectos tienen un inicio y un fin claramente definidos</w:t>
+              <w:t>Lo primero es que un proyecto es una iniciativa temporal. A diferencia de las operaciones del día a día, los proyectos tienen un inicio y un fin claramente definidos.</w:t>
             </w:r>
           </w:p>
           <w:p>
             <w:r>
-              <w:t xml:space="preserve">Todo proyecto requiere un gerente y un equipo de trabajo. El gerente coordina tareas y vela por los objetivos, mientras el equipo aporta las competencias necesarias para sacar adelante el proyecto. </w:t>
+              <w:t>Todo proyecto requiere un gerente y un equipo de trabajo. El gerente coordina tareas y vela por los objetivos, mientras el equipo aporta las competencias necesarias para sacar adelante el proyecto. La diversidad del equipo es clave para abordar todas las dimensiones del proyecto.</w:t>
             </w:r>
           </w:p>
           <w:p>
             <w:r>
-              <w:t>La diversidad del equipo es clave para abordar todas las dimensiones del proyecto.</w:t>
+              <w:t>En tercer lugar, cada proyecto necesita un plan. Este documento establece los objetivos, el alcance, el cronograma, el presupuesto y los criterios de calidad. No es una simple lista de tareas, es una herramienta estratégica que guía al equipo sobre qué hacer, cómo hacerlo, cuándo y con qué recursos. Un buen plan es la base del éxito del proyecto.</w:t>
             </w:r>
           </w:p>
           <w:p>
             <w:r>
-              <w:t xml:space="preserve">En tercer lugar, cada proyecto necesita un plan. Este documento establece los objetivos, el alcance, el cronograma, el presupuesto y los criterios de calidad. </w:t>
+              <w:t>Otra característica de los proyectos es que siguen un ciclo de vida compuesto por cinco fases: iniciación, planificación, ejecución, monitoreo y cierre. En la iniciación se define la viabilidad; en la planificación se organizan actividades y recursos; en la ejecución se realizan las tareas; el monitoreo permite controlar avances; y en el cierre se evalúan resultados y aprendizajes.</w:t>
             </w:r>
           </w:p>
           <w:p>
             <w:r>
-              <w:t>No es una simple lista de tareas, es una herramienta estratégica que guía al equipo sobre qué hacer, cómo hacerlo, cuándo y con qué recursos. Un buen plan es la base del éxito del proyecto.</w:t>
+              <w:t xml:space="preserve">Ahora bien, todo proyecto tiene tres restricciones fundamentales conocidas como la triple restricción: tiempo, alcance y costo. El tiempo define el plazo de </w:t>
+            </w:r>
+            <w:r>
+              <w:lastRenderedPageBreak/>
+              <w:t>entrega; el alcance, los entregables y objetivos; y el costo, el presupuesto disponible. Estos tres factores están interrelacionados y mantener su equilibrio es el reto central del gerente.</w:t>
             </w:r>
           </w:p>
           <w:p>
             <w:r>
-              <w:t>Otra característica de los proyectos es que siguen un ciclo de vida compuesto por cinco fases: iniciación, planificación, ejecución, monitoreo y cierre.</w:t>
-            </w:r>
-          </w:p>
-          <w:p/>
-          <w:p>
-            <w:r>
-              <w:lastRenderedPageBreak/>
-              <w:t>En la iniciación se define la viabilidad; en la planificación se organizan actividades y recursos; en la ejecución se realizan las tareas; el monitoreo permite controlar avances; y en el cierre se evalúan resultados y aprendizajes.</w:t>
-            </w:r>
-          </w:p>
-          <w:p>
-            <w:r>
-              <w:t xml:space="preserve">Ahora bien, todo proyecto tiene tres restricciones fundamentales conocidas como la triple restricción: tiempo, alcance y costo. </w:t>
-            </w:r>
-          </w:p>
-          <w:p>
-            <w:r>
-              <w:t>El tiempo define el plazo de entrega; el alcance, los entregables y objetivos; y el costo, el presupuesto disponible.</w:t>
-            </w:r>
-          </w:p>
-          <w:p>
-            <w:r>
-              <w:t>Estos tres factores están interrelacionados y mantener su equilibrio es el reto central del gerente</w:t>
-            </w:r>
-          </w:p>
-          <w:p>
-            <w:r>
-              <w:t xml:space="preserve">Finalmente, todo proyecto requiere recursos: mano de obra, materiales, maquinaria, tecnología, tiempo y financiamiento. Gestionarlos bien evita retrasos y sobrecostos. </w:t>
+              <w:t>Finalmente, todo proyecto requiere recursos: mano de obra, materiales, maquinaria, tecnología, tiempo y financiamiento. Gestionarlos bien evita retrasos y sobrecostos.</w:t>
             </w:r>
           </w:p>
           <w:p>
@@ -4049,59 +3941,66 @@
     <w:p>
       <w:pPr>
         <w:pStyle w:val="Ttulo2"/>
+        <w:numPr>
+          <w:ilvl w:val="0"/>
+          <w:numId w:val="0"/>
+        </w:numPr>
       </w:pPr>
       <w:bookmarkStart w:id="5" w:name="_Toc224715452"/>
-      <w:r>
+    </w:p>
+    <w:p>
+      <w:pPr>
+        <w:pStyle w:val="Ttulo2"/>
+      </w:pPr>
+      <w:r>
+        <w:t>Relación entre el proyecto y el contexto profesional</w:t>
+      </w:r>
+      <w:bookmarkEnd w:id="5"/>
+    </w:p>
+    <w:p>
+      <w:pPr>
+        <w:rPr>
+          <w:lang w:val="es-419" w:eastAsia="es-CO"/>
+        </w:rPr>
+      </w:pPr>
+      <w:r>
+        <w:rPr>
+          <w:lang w:val="es-419" w:eastAsia="es-CO"/>
+        </w:rPr>
+        <w:t>El proyecto surge como una respuesta organizada a una necesidad identificada dentro de un contexto específico. En el ámbito profesional, dicho contexto está determinado por las dinámicas del sector productivo, las condiciones del entorno laboral y las problemáticas propias del ejercicio de la profesión. Comprender esta relación es fundamental para formular proyectos pertinentes, coherentes y alineados con la realidad profesional.</w:t>
+      </w:r>
+    </w:p>
+    <w:p>
+      <w:pPr>
+        <w:rPr>
+          <w:lang w:val="es-419" w:eastAsia="es-CO"/>
+        </w:rPr>
+      </w:pPr>
+      <w:r>
+        <w:rPr>
+          <w:lang w:val="es-419" w:eastAsia="es-CO"/>
+        </w:rPr>
+        <w:t>La identificación del contexto constituye un aspecto clave en la formulación, ya que permite reconocer los factores que influyen en la estructuración de la propuesta. Estos factores pueden ser de carácter técnico, organizacional, social o cultural, y condicionan tanto la definición del problema como la planificación de las acciones.</w:t>
+      </w:r>
+    </w:p>
+    <w:p>
+      <w:pPr>
+        <w:rPr>
+          <w:lang w:val="es-419" w:eastAsia="es-CO"/>
+        </w:rPr>
+      </w:pPr>
+      <w:r>
+        <w:rPr>
+          <w:lang w:val="es-419" w:eastAsia="es-CO"/>
+        </w:rPr>
+        <w:t xml:space="preserve">Desde la formación complementaria, el análisis del contexto profesional favorece la comprensión de que los proyectos no se formulan de manera aislada, sino que responden a situaciones reales que requieren soluciones estructuradas. Este enfoque </w:t>
+      </w:r>
+      <w:r>
+        <w:rPr>
+          <w:lang w:val="es-419" w:eastAsia="es-CO"/>
+        </w:rPr>
         <w:lastRenderedPageBreak/>
-        <w:t>Relación entre el proyecto y el contexto profesional</w:t>
-      </w:r>
-      <w:bookmarkEnd w:id="5"/>
-    </w:p>
-    <w:p>
-      <w:pPr>
-        <w:rPr>
-          <w:lang w:val="es-419" w:eastAsia="es-CO"/>
-        </w:rPr>
-      </w:pPr>
-    </w:p>
-    <w:p>
-      <w:pPr>
-        <w:rPr>
-          <w:lang w:val="es-419" w:eastAsia="es-CO"/>
-        </w:rPr>
-      </w:pPr>
-      <w:r>
-        <w:rPr>
-          <w:lang w:val="es-419" w:eastAsia="es-CO"/>
-        </w:rPr>
-        <w:t>El proyecto surge como una respuesta organizada a una necesidad identificada dentro de un contexto específico. En el ámbito profesional, dicho contexto está determinado por las dinámicas del sector productivo, las condiciones del entorno laboral y las problemáticas propias del ejercicio de la profesión. Comprender esta relación es fundamental para formular proyectos pertinentes, coherentes y alineados con la realidad profesional.</w:t>
-      </w:r>
-    </w:p>
-    <w:p>
-      <w:pPr>
-        <w:rPr>
-          <w:lang w:val="es-419" w:eastAsia="es-CO"/>
-        </w:rPr>
-      </w:pPr>
-      <w:r>
-        <w:rPr>
-          <w:lang w:val="es-419" w:eastAsia="es-CO"/>
-        </w:rPr>
-        <w:lastRenderedPageBreak/>
-        <w:t>La identificación del contexto constituye un aspecto clave en la formulación, ya que permite reconocer los factores que influyen en la estructuración de la propuesta. Estos factores pueden ser de carácter técnico, organizacional, social o cultural, y condicionan tanto la definición del problema como la planificación de las acciones.</w:t>
-      </w:r>
-    </w:p>
-    <w:p>
-      <w:pPr>
-        <w:rPr>
-          <w:lang w:val="es-419" w:eastAsia="es-CO"/>
-        </w:rPr>
-      </w:pPr>
-      <w:r>
-        <w:rPr>
-          <w:lang w:val="es-419" w:eastAsia="es-CO"/>
-        </w:rPr>
-        <w:t>Desde la formación complementaria, el análisis del contexto profesional favorece la comprensión de que los proyectos no se formulan de manera aislada, sino que responden a situaciones reales que requieren soluciones estructuradas. Este enfoque fortalece la articulación entre teoría y práctica, permitiendo que el aprendiz relacione los conceptos estudiados con su entorno laboral.</w:t>
+        <w:t>fortalece la articulación entre teoría y práctica, permitiendo que el aprendiz relacione los conceptos estudiados con su entorno laboral.</w:t>
       </w:r>
     </w:p>
     <w:p>
@@ -4131,7 +4030,7 @@
           <w:ilvl w:val="0"/>
           <w:numId w:val="14"/>
         </w:numPr>
-        <w:ind w:left="567" w:hanging="283"/>
+        <w:ind w:left="567" w:hanging="425"/>
         <w:rPr>
           <w:lang w:val="es-419" w:eastAsia="es-CO"/>
         </w:rPr>
@@ -4156,7 +4055,7 @@
           <w:ilvl w:val="0"/>
           <w:numId w:val="14"/>
         </w:numPr>
-        <w:ind w:left="567" w:hanging="283"/>
+        <w:ind w:left="567" w:hanging="425"/>
         <w:rPr>
           <w:lang w:val="es-419" w:eastAsia="es-CO"/>
         </w:rPr>
@@ -4181,7 +4080,7 @@
           <w:ilvl w:val="0"/>
           <w:numId w:val="14"/>
         </w:numPr>
-        <w:ind w:left="567" w:hanging="283"/>
+        <w:ind w:left="567" w:hanging="425"/>
         <w:rPr>
           <w:lang w:val="es-419" w:eastAsia="es-CO"/>
         </w:rPr>
@@ -4206,7 +4105,7 @@
           <w:ilvl w:val="0"/>
           <w:numId w:val="14"/>
         </w:numPr>
-        <w:ind w:left="567" w:hanging="283"/>
+        <w:ind w:left="567" w:hanging="425"/>
         <w:rPr>
           <w:lang w:val="es-419" w:eastAsia="es-CO"/>
         </w:rPr>
@@ -4215,7 +4114,6 @@
         <w:rPr>
           <w:rStyle w:val="Ttulo5Car"/>
         </w:rPr>
-        <w:lastRenderedPageBreak/>
         <w:t>Actores involucrados.</w:t>
       </w:r>
       <w:r>
@@ -4232,7 +4130,7 @@
           <w:ilvl w:val="0"/>
           <w:numId w:val="14"/>
         </w:numPr>
-        <w:ind w:left="567" w:hanging="283"/>
+        <w:ind w:left="567" w:hanging="425"/>
         <w:rPr>
           <w:lang w:val="es-419" w:eastAsia="es-CO"/>
         </w:rPr>
@@ -4256,19 +4154,110 @@
           <w:lang w:val="es-419" w:eastAsia="es-CO"/>
         </w:rPr>
       </w:pPr>
-    </w:p>
-    <w:p>
-      <w:pPr>
-        <w:rPr>
-          <w:lang w:val="es-419" w:eastAsia="es-CO"/>
-        </w:rPr>
-      </w:pPr>
-      <w:r>
-        <w:rPr>
-          <w:lang w:val="es-419" w:eastAsia="es-CO"/>
-        </w:rPr>
-        <w:t>Esta relación también fortalece la capacidad de análisis del aprendiz, al promover una aproximación crítica y reflexiva frente a su entorno profesional. A través de este ejercicio, se identifican problemáticas y oportunidades que pueden abordarse mediante proyectos estructurados, consolidando una visión profesional orientada a la solución de necesidades reales.</w:t>
-      </w:r>
+      <w:r>
+        <w:rPr>
+          <w:lang w:val="es-419" w:eastAsia="es-CO"/>
+        </w:rPr>
+        <w:t xml:space="preserve">Esta relación también fortalece la capacidad de análisis del aprendiz, al promover una aproximación crítica y reflexiva frente a su entorno profesional. A través de este ejercicio, se identifican problemáticas y oportunidades que pueden abordarse mediante </w:t>
+      </w:r>
+      <w:r>
+        <w:rPr>
+          <w:lang w:val="es-419" w:eastAsia="es-CO"/>
+        </w:rPr>
+        <w:lastRenderedPageBreak/>
+        <w:t>proyectos estructurados, consolidando una visión profesional orientada a la solución de necesidades reales.</w:t>
+      </w:r>
+    </w:p>
+    <w:p>
+      <w:pPr>
+        <w:rPr>
+          <w:lang w:val="es-419" w:eastAsia="es-CO"/>
+        </w:rPr>
+      </w:pPr>
+    </w:p>
+    <w:p>
+      <w:pPr>
+        <w:rPr>
+          <w:lang w:val="es-419" w:eastAsia="es-CO"/>
+        </w:rPr>
+      </w:pPr>
+    </w:p>
+    <w:p>
+      <w:pPr>
+        <w:rPr>
+          <w:lang w:val="es-419" w:eastAsia="es-CO"/>
+        </w:rPr>
+      </w:pPr>
+    </w:p>
+    <w:p>
+      <w:pPr>
+        <w:rPr>
+          <w:lang w:val="es-419" w:eastAsia="es-CO"/>
+        </w:rPr>
+      </w:pPr>
+    </w:p>
+    <w:p>
+      <w:pPr>
+        <w:rPr>
+          <w:lang w:val="es-419" w:eastAsia="es-CO"/>
+        </w:rPr>
+      </w:pPr>
+    </w:p>
+    <w:p>
+      <w:pPr>
+        <w:rPr>
+          <w:lang w:val="es-419" w:eastAsia="es-CO"/>
+        </w:rPr>
+      </w:pPr>
+    </w:p>
+    <w:p>
+      <w:pPr>
+        <w:rPr>
+          <w:lang w:val="es-419" w:eastAsia="es-CO"/>
+        </w:rPr>
+      </w:pPr>
+    </w:p>
+    <w:p>
+      <w:pPr>
+        <w:rPr>
+          <w:lang w:val="es-419" w:eastAsia="es-CO"/>
+        </w:rPr>
+      </w:pPr>
+    </w:p>
+    <w:p>
+      <w:pPr>
+        <w:rPr>
+          <w:lang w:val="es-419" w:eastAsia="es-CO"/>
+        </w:rPr>
+      </w:pPr>
+    </w:p>
+    <w:p>
+      <w:pPr>
+        <w:rPr>
+          <w:lang w:val="es-419" w:eastAsia="es-CO"/>
+        </w:rPr>
+      </w:pPr>
+    </w:p>
+    <w:p>
+      <w:pPr>
+        <w:rPr>
+          <w:lang w:val="es-419" w:eastAsia="es-CO"/>
+        </w:rPr>
+      </w:pPr>
+    </w:p>
+    <w:p>
+      <w:pPr>
+        <w:rPr>
+          <w:lang w:val="es-419" w:eastAsia="es-CO"/>
+        </w:rPr>
+      </w:pPr>
+    </w:p>
+    <w:p>
+      <w:pPr>
+        <w:rPr>
+          <w:lang w:val="es-419" w:eastAsia="es-CO"/>
+        </w:rPr>
+      </w:pPr>
     </w:p>
     <w:p>
       <w:pPr>
@@ -4304,6 +4293,7 @@
       </w:pPr>
       <w:bookmarkStart w:id="6" w:name="_Toc224715453"/>
       <w:r>
+        <w:lastRenderedPageBreak/>
         <w:t>Pensamiento proyectual y formulación de proyectos</w:t>
       </w:r>
       <w:bookmarkEnd w:id="6"/>
@@ -4338,7 +4328,6 @@
         <w:rPr>
           <w:lang w:val="es-419" w:eastAsia="es-CO"/>
         </w:rPr>
-        <w:lastRenderedPageBreak/>
         <w:t>Desde la formación complementaria, el pensamiento proyectual se constituye como una base conceptual que facilita la comprensión de los procesos necesarios para formular proyectos. A través de este enfoque, el aprendiz desarrolla la capacidad de organizar ideas de manera lógica, identificar relaciones entre conceptos y comprender el proyecto como una secuencia articulada de acciones orientadas a un propósito definido.</w:t>
       </w:r>
     </w:p>
@@ -4362,7 +4351,7 @@
           <w:ilvl w:val="0"/>
           <w:numId w:val="16"/>
         </w:numPr>
-        <w:ind w:left="567" w:hanging="283"/>
+        <w:ind w:left="567" w:hanging="425"/>
         <w:rPr>
           <w:lang w:val="es-419" w:eastAsia="es-CO"/>
         </w:rPr>
@@ -4387,7 +4376,7 @@
           <w:ilvl w:val="0"/>
           <w:numId w:val="16"/>
         </w:numPr>
-        <w:ind w:left="567" w:hanging="283"/>
+        <w:ind w:left="567" w:hanging="425"/>
         <w:rPr>
           <w:lang w:val="es-419" w:eastAsia="es-CO"/>
         </w:rPr>
@@ -4412,7 +4401,7 @@
           <w:ilvl w:val="0"/>
           <w:numId w:val="16"/>
         </w:numPr>
-        <w:ind w:left="567" w:hanging="283"/>
+        <w:ind w:left="567" w:hanging="425"/>
         <w:rPr>
           <w:lang w:val="es-419" w:eastAsia="es-CO"/>
         </w:rPr>
@@ -4437,7 +4426,7 @@
           <w:ilvl w:val="0"/>
           <w:numId w:val="16"/>
         </w:numPr>
-        <w:ind w:left="567" w:hanging="283"/>
+        <w:ind w:left="567" w:hanging="425"/>
         <w:rPr>
           <w:lang w:val="es-419" w:eastAsia="es-CO"/>
         </w:rPr>
@@ -4446,6 +4435,7 @@
         <w:rPr>
           <w:rStyle w:val="Ttulo5Car"/>
         </w:rPr>
+        <w:lastRenderedPageBreak/>
         <w:t>Organización lógica de ideas.</w:t>
       </w:r>
       <w:r>
@@ -4462,7 +4452,7 @@
           <w:ilvl w:val="0"/>
           <w:numId w:val="16"/>
         </w:numPr>
-        <w:ind w:left="567" w:hanging="283"/>
+        <w:ind w:left="567" w:hanging="425"/>
         <w:rPr>
           <w:lang w:val="es-419" w:eastAsia="es-CO"/>
         </w:rPr>
@@ -4487,7 +4477,7 @@
           <w:ilvl w:val="0"/>
           <w:numId w:val="16"/>
         </w:numPr>
-        <w:ind w:left="567" w:hanging="283"/>
+        <w:ind w:left="567" w:hanging="425"/>
         <w:rPr>
           <w:lang w:val="es-419" w:eastAsia="es-CO"/>
         </w:rPr>
@@ -4504,14 +4494,6 @@
         </w:rPr>
         <w:t xml:space="preserve"> Permite reconocer recursos y condiciones necesarias desde una perspectiva conceptual, sin profundizar en aspectos operativos.</w:t>
       </w:r>
-    </w:p>
-    <w:p>
-      <w:pPr>
-        <w:ind w:firstLine="0"/>
-        <w:rPr>
-          <w:lang w:val="es-419" w:eastAsia="es-CO"/>
-        </w:rPr>
-      </w:pPr>
     </w:p>
     <w:p>
       <w:pPr>
@@ -4638,10 +4620,18 @@
     </w:p>
     <w:p>
       <w:pPr>
+        <w:rPr>
+          <w:lang w:val="es-419" w:eastAsia="es-CO"/>
+        </w:rPr>
+      </w:pPr>
+    </w:p>
+    <w:p>
+      <w:pPr>
         <w:pStyle w:val="Ttulo2"/>
       </w:pPr>
       <w:bookmarkStart w:id="7" w:name="_Toc224715454"/>
       <w:r>
+        <w:lastRenderedPageBreak/>
         <w:t>Elementos fundamentales de un proyecto</w:t>
       </w:r>
       <w:bookmarkEnd w:id="7"/>
@@ -4652,25 +4642,11 @@
           <w:lang w:val="es-419" w:eastAsia="es-CO"/>
         </w:rPr>
       </w:pPr>
-    </w:p>
-    <w:p>
-      <w:pPr>
-        <w:rPr>
-          <w:lang w:val="es-419" w:eastAsia="es-CO"/>
-        </w:rPr>
-      </w:pPr>
-      <w:r>
-        <w:rPr>
-          <w:lang w:val="es-419" w:eastAsia="es-CO"/>
-        </w:rPr>
-        <w:t xml:space="preserve">Los elementos fundamentales del proyecto constituyen la base estructural sobre la cual se organiza cualquier propuesta. Su identificación y comprensión permiten estructurar de manera coherente la información, definir el propósito del proyecto y organizar las acciones necesarias para su desarrollo. Desde la formación </w:t>
-      </w:r>
-      <w:r>
-        <w:rPr>
-          <w:lang w:val="es-419" w:eastAsia="es-CO"/>
-        </w:rPr>
-        <w:lastRenderedPageBreak/>
-        <w:t>complementaria, estos elementos se abordan desde un enfoque conceptual, orientado a fortalecer la comprensión del proceso de formulación.</w:t>
+      <w:r>
+        <w:rPr>
+          <w:lang w:val="es-419" w:eastAsia="es-CO"/>
+        </w:rPr>
+        <w:t>Los elementos fundamentales del proyecto constituyen la base estructural sobre la cual se organiza cualquier propuesta. Su identificación y comprensión permiten estructurar de manera coherente la información, definir el propósito del proyecto y organizar las acciones necesarias para su desarrollo. Desde la formación complementaria, estos elementos se abordan desde un enfoque conceptual, orientado a fortalecer la comprensión del proceso de formulación.</w:t>
       </w:r>
     </w:p>
     <w:p>
@@ -4700,7 +4676,7 @@
           <w:ilvl w:val="0"/>
           <w:numId w:val="17"/>
         </w:numPr>
-        <w:ind w:left="567" w:hanging="283"/>
+        <w:ind w:left="567" w:hanging="425"/>
         <w:rPr>
           <w:lang w:val="es-419" w:eastAsia="es-CO"/>
         </w:rPr>
@@ -4725,7 +4701,7 @@
           <w:ilvl w:val="0"/>
           <w:numId w:val="17"/>
         </w:numPr>
-        <w:ind w:left="567" w:hanging="283"/>
+        <w:ind w:left="567" w:hanging="425"/>
         <w:rPr>
           <w:lang w:val="es-419" w:eastAsia="es-CO"/>
         </w:rPr>
@@ -4750,7 +4726,7 @@
           <w:ilvl w:val="0"/>
           <w:numId w:val="17"/>
         </w:numPr>
-        <w:ind w:left="567" w:hanging="283"/>
+        <w:ind w:left="567" w:hanging="425"/>
         <w:rPr>
           <w:lang w:val="es-419" w:eastAsia="es-CO"/>
         </w:rPr>
@@ -4759,6 +4735,7 @@
         <w:rPr>
           <w:rStyle w:val="Ttulo5Car"/>
         </w:rPr>
+        <w:lastRenderedPageBreak/>
         <w:t>Objetivos específicos.</w:t>
       </w:r>
       <w:r>
@@ -4775,7 +4752,7 @@
           <w:ilvl w:val="0"/>
           <w:numId w:val="17"/>
         </w:numPr>
-        <w:ind w:left="567" w:hanging="283"/>
+        <w:ind w:left="567" w:hanging="425"/>
         <w:rPr>
           <w:lang w:val="es-419" w:eastAsia="es-CO"/>
         </w:rPr>
@@ -4784,7 +4761,6 @@
         <w:rPr>
           <w:rStyle w:val="Ttulo5Car"/>
         </w:rPr>
-        <w:lastRenderedPageBreak/>
         <w:t>Justificación.</w:t>
       </w:r>
       <w:r>
@@ -4801,7 +4777,7 @@
           <w:ilvl w:val="0"/>
           <w:numId w:val="17"/>
         </w:numPr>
-        <w:ind w:left="567" w:hanging="283"/>
+        <w:ind w:left="567" w:hanging="425"/>
         <w:rPr>
           <w:lang w:val="es-419" w:eastAsia="es-CO"/>
         </w:rPr>
@@ -4826,7 +4802,7 @@
           <w:ilvl w:val="0"/>
           <w:numId w:val="17"/>
         </w:numPr>
-        <w:ind w:left="567" w:hanging="283"/>
+        <w:ind w:left="567" w:hanging="425"/>
         <w:rPr>
           <w:lang w:val="es-419" w:eastAsia="es-CO"/>
         </w:rPr>
@@ -4851,7 +4827,7 @@
           <w:ilvl w:val="0"/>
           <w:numId w:val="17"/>
         </w:numPr>
-        <w:ind w:left="567" w:hanging="283"/>
+        <w:ind w:left="567" w:hanging="425"/>
         <w:rPr>
           <w:lang w:val="es-419" w:eastAsia="es-CO"/>
         </w:rPr>
@@ -4876,7 +4852,7 @@
           <w:ilvl w:val="0"/>
           <w:numId w:val="17"/>
         </w:numPr>
-        <w:ind w:left="567" w:hanging="283"/>
+        <w:ind w:left="567" w:hanging="425"/>
         <w:rPr>
           <w:lang w:val="es-419" w:eastAsia="es-CO"/>
         </w:rPr>
@@ -4885,6 +4861,7 @@
         <w:rPr>
           <w:rStyle w:val="Ttulo5Car"/>
         </w:rPr>
+        <w:lastRenderedPageBreak/>
         <w:t>Resultados esperados.</w:t>
       </w:r>
       <w:r>
@@ -4904,7 +4881,6 @@
         <w:rPr>
           <w:lang w:val="es-419" w:eastAsia="es-CO"/>
         </w:rPr>
-        <w:lastRenderedPageBreak/>
         <w:t>La integración de estos elementos no debe entenderse como una suma de componentes aislados, sino como una estructura articulada. La necesidad identificada orienta la formulación del objetivo general; este se desglosa en objetivos específicos; estos, a su vez, determinan las actividades requeridas, las cuales demandan recursos y conducen a resultados esperados, todo ello delimitado por un alcance claro y sustentado en una justificación argumentada.</w:t>
       </w:r>
     </w:p>
@@ -4950,13 +4926,6 @@
         <w:t>Beneficios</w:t>
       </w:r>
       <w:bookmarkEnd w:id="8"/>
-    </w:p>
-    <w:p>
-      <w:pPr>
-        <w:rPr>
-          <w:lang w:val="es-419" w:eastAsia="es-CO"/>
-        </w:rPr>
-      </w:pPr>
     </w:p>
     <w:p>
       <w:pPr>
@@ -4982,7 +4951,14 @@
         <w:rPr>
           <w:lang w:val="es-419" w:eastAsia="es-CO"/>
         </w:rPr>
-        <w:t xml:space="preserve"> sobre cómo organizar ideas y transformar una necesidad del entorno en una propuesta coherente. Desde la formación complementaria, este proceso se consolida como una herramienta clave para fortalecer el </w:t>
+        <w:t xml:space="preserve"> sobre cómo organizar ideas y transformar una necesidad del entorno en una propuesta coherente. </w:t>
+      </w:r>
+      <w:r>
+        <w:rPr>
+          <w:lang w:val="es-419" w:eastAsia="es-CO"/>
+        </w:rPr>
+        <w:lastRenderedPageBreak/>
+        <w:t xml:space="preserve">Desde la formación complementaria, este proceso se consolida como una herramienta clave para fortalecer el </w:t>
       </w:r>
       <w:r>
         <w:rPr>
@@ -5023,7 +4999,6 @@
         <w:rPr>
           <w:lang w:val="es-419" w:eastAsia="es-CO"/>
         </w:rPr>
-        <w:lastRenderedPageBreak/>
         <w:t xml:space="preserve">Uno de los beneficios centrales es la </w:t>
       </w:r>
       <w:r>
@@ -5094,13 +5069,6 @@
         </w:rPr>
         <w:t xml:space="preserve"> El proceso exige estructurar objetivos, recursos, actividades y resultados previstos de manera coherente, considerando los requerimientos fundamentales de cada proyecto. Esta capacidad organizativa no se limita al ámbito de la formulación, sino que es transferible a diversos contextos académicos y laborales.</w:t>
       </w:r>
-    </w:p>
-    <w:p>
-      <w:pPr>
-        <w:rPr>
-          <w:lang w:val="es-419" w:eastAsia="es-CO"/>
-        </w:rPr>
-      </w:pPr>
     </w:p>
     <w:p>
       <w:pPr>
@@ -5157,7 +5125,7 @@
           <w:ilvl w:val="0"/>
           <w:numId w:val="18"/>
         </w:numPr>
-        <w:ind w:left="567" w:hanging="283"/>
+        <w:ind w:left="567" w:hanging="425"/>
         <w:rPr>
           <w:lang w:val="es-419" w:eastAsia="es-CO"/>
         </w:rPr>
@@ -5183,7 +5151,7 @@
           <w:ilvl w:val="0"/>
           <w:numId w:val="18"/>
         </w:numPr>
-        <w:ind w:left="567" w:hanging="283"/>
+        <w:ind w:left="567" w:hanging="425"/>
         <w:rPr>
           <w:lang w:val="es-419" w:eastAsia="es-CO"/>
         </w:rPr>
@@ -5208,7 +5176,7 @@
           <w:ilvl w:val="0"/>
           <w:numId w:val="18"/>
         </w:numPr>
-        <w:ind w:left="567" w:hanging="283"/>
+        <w:ind w:left="567" w:hanging="425"/>
         <w:rPr>
           <w:lang w:val="es-419" w:eastAsia="es-CO"/>
         </w:rPr>
@@ -5233,7 +5201,7 @@
           <w:ilvl w:val="0"/>
           <w:numId w:val="18"/>
         </w:numPr>
-        <w:ind w:left="567" w:hanging="283"/>
+        <w:ind w:left="567" w:hanging="425"/>
         <w:rPr>
           <w:lang w:val="es-419" w:eastAsia="es-CO"/>
         </w:rPr>
@@ -5258,7 +5226,7 @@
           <w:ilvl w:val="0"/>
           <w:numId w:val="18"/>
         </w:numPr>
-        <w:ind w:left="567" w:hanging="283"/>
+        <w:ind w:left="567" w:hanging="425"/>
         <w:rPr>
           <w:lang w:val="es-419" w:eastAsia="es-CO"/>
         </w:rPr>
@@ -5292,14 +5260,6 @@
         <w:t>Requerimientos de un proyecto</w:t>
       </w:r>
       <w:bookmarkEnd w:id="9"/>
-    </w:p>
-    <w:p>
-      <w:pPr>
-        <w:ind w:firstLine="0"/>
-        <w:rPr>
-          <w:lang w:val="es-419" w:eastAsia="es-CO"/>
-        </w:rPr>
-      </w:pPr>
     </w:p>
     <w:p>
       <w:pPr>
@@ -5338,7 +5298,6 @@
         <w:rPr>
           <w:lang w:val="es-419" w:eastAsia="es-CO"/>
         </w:rPr>
-        <w:lastRenderedPageBreak/>
         <w:t xml:space="preserve">Los requerimientos deben establecerse en la </w:t>
       </w:r>
       <w:r>
@@ -5367,7 +5326,14 @@
         <w:rPr>
           <w:lang w:val="es-419" w:eastAsia="es-CO"/>
         </w:rPr>
-        <w:t>, ya que contribuyen a fortalecer la visión estructural y a consolidar una idea clara y coherente antes de avanzar hacia la planificación detallada de las actividades. Su adecuada definición facilita la organización del proceso y orienta el desarrollo del proyecto hacia el cumplimiento de su propósito.</w:t>
+        <w:t xml:space="preserve">, ya que contribuyen a fortalecer la visión estructural y a consolidar una idea clara y coherente </w:t>
+      </w:r>
+      <w:r>
+        <w:rPr>
+          <w:lang w:val="es-419" w:eastAsia="es-CO"/>
+        </w:rPr>
+        <w:lastRenderedPageBreak/>
+        <w:t>antes de avanzar hacia la planificación detallada de las actividades. Su adecuada definición facilita la organización del proceso y orienta el desarrollo del proyecto hacia el cumplimiento de su propósito.</w:t>
       </w:r>
     </w:p>
     <w:p>
@@ -5412,7 +5378,7 @@
           <w:ilvl w:val="0"/>
           <w:numId w:val="19"/>
         </w:numPr>
-        <w:ind w:left="567" w:hanging="283"/>
+        <w:ind w:left="567" w:hanging="425"/>
         <w:rPr>
           <w:lang w:val="es-419" w:eastAsia="es-CO"/>
         </w:rPr>
@@ -5437,7 +5403,7 @@
           <w:ilvl w:val="0"/>
           <w:numId w:val="19"/>
         </w:numPr>
-        <w:ind w:left="567" w:hanging="283"/>
+        <w:ind w:left="567" w:hanging="425"/>
         <w:rPr>
           <w:lang w:val="es-419" w:eastAsia="es-CO"/>
         </w:rPr>
@@ -5462,7 +5428,7 @@
           <w:ilvl w:val="0"/>
           <w:numId w:val="19"/>
         </w:numPr>
-        <w:ind w:left="567" w:hanging="283"/>
+        <w:ind w:left="567" w:hanging="425"/>
         <w:rPr>
           <w:lang w:val="es-419" w:eastAsia="es-CO"/>
         </w:rPr>
@@ -5477,14 +5443,7 @@
         <w:rPr>
           <w:lang w:val="es-419" w:eastAsia="es-CO"/>
         </w:rPr>
-        <w:t xml:space="preserve"> Especifican el comportamiento esperado del producto o sistema. Detallan las funciones que debe cumplir y constituyen una </w:t>
-      </w:r>
-      <w:r>
-        <w:rPr>
-          <w:lang w:val="es-419" w:eastAsia="es-CO"/>
-        </w:rPr>
-        <w:lastRenderedPageBreak/>
-        <w:t>base para su desarrollo técnico. Permiten traducir necesidades en acciones concretas.</w:t>
+        <w:t xml:space="preserve"> Especifican el comportamiento esperado del producto o sistema. Detallan las funciones que debe cumplir y constituyen una base para su desarrollo técnico. Permiten traducir necesidades en acciones concretas.</w:t>
       </w:r>
     </w:p>
     <w:p>
@@ -5494,7 +5453,7 @@
           <w:ilvl w:val="0"/>
           <w:numId w:val="19"/>
         </w:numPr>
-        <w:ind w:left="567" w:hanging="283"/>
+        <w:ind w:left="567" w:hanging="425"/>
         <w:rPr>
           <w:lang w:val="es-419" w:eastAsia="es-CO"/>
         </w:rPr>
@@ -5503,6 +5462,7 @@
         <w:rPr>
           <w:rStyle w:val="Ttulo5Car"/>
         </w:rPr>
+        <w:lastRenderedPageBreak/>
         <w:t>Requerimientos de calidad.</w:t>
       </w:r>
       <w:r>
@@ -5519,7 +5479,7 @@
           <w:ilvl w:val="0"/>
           <w:numId w:val="19"/>
         </w:numPr>
-        <w:ind w:left="567" w:hanging="283"/>
+        <w:ind w:left="567" w:hanging="425"/>
         <w:rPr>
           <w:lang w:val="es-419" w:eastAsia="es-CO"/>
         </w:rPr>
@@ -5566,13 +5526,6 @@
         <w:t>Tipos de proyectos</w:t>
       </w:r>
       <w:bookmarkEnd w:id="10"/>
-    </w:p>
-    <w:p>
-      <w:pPr>
-        <w:rPr>
-          <w:lang w:val="es-419" w:eastAsia="es-CO"/>
-        </w:rPr>
-      </w:pPr>
     </w:p>
     <w:p>
       <w:pPr>
@@ -5616,7 +5569,7 @@
           <w:ilvl w:val="0"/>
           <w:numId w:val="20"/>
         </w:numPr>
-        <w:ind w:left="567" w:hanging="283"/>
+        <w:ind w:left="567" w:hanging="425"/>
         <w:rPr>
           <w:lang w:val="es-419" w:eastAsia="es-CO"/>
         </w:rPr>
@@ -5625,7 +5578,6 @@
         <w:rPr>
           <w:rStyle w:val="Ttulo5Car"/>
         </w:rPr>
-        <w:lastRenderedPageBreak/>
         <w:t>Proyectos productivos.</w:t>
       </w:r>
       <w:r>
@@ -5646,7 +5598,14 @@
         <w:rPr>
           <w:lang w:val="es-419" w:eastAsia="es-CO"/>
         </w:rPr>
-        <w:t xml:space="preserve"> para satisfacer una necesidad del mercado o de una comunidad específica. Se caracterizan por organizar recursos y actividades con el propósito de alcanzar un resultado concreto que aporte valor económico o social. En la formulación, permiten establecer con claridad la relación entre necesidad, objetivos, actividades y resultados esperados.</w:t>
+        <w:t xml:space="preserve"> para satisfacer una necesidad del mercado o de una comunidad específica. Se caracterizan por organizar recursos y actividades con el propósito de alcanzar un </w:t>
+      </w:r>
+      <w:r>
+        <w:rPr>
+          <w:lang w:val="es-419" w:eastAsia="es-CO"/>
+        </w:rPr>
+        <w:lastRenderedPageBreak/>
+        <w:t>resultado concreto que aporte valor económico o social. En la formulación, permiten establecer con claridad la relación entre necesidad, objetivos, actividades y resultados esperados.</w:t>
       </w:r>
     </w:p>
     <w:p>
@@ -5656,7 +5615,7 @@
           <w:ilvl w:val="0"/>
           <w:numId w:val="20"/>
         </w:numPr>
-        <w:ind w:left="567" w:hanging="283"/>
+        <w:ind w:left="567" w:hanging="425"/>
         <w:rPr>
           <w:lang w:val="es-419" w:eastAsia="es-CO"/>
         </w:rPr>
@@ -5695,7 +5654,7 @@
           <w:ilvl w:val="0"/>
           <w:numId w:val="20"/>
         </w:numPr>
-        <w:ind w:left="567" w:hanging="283"/>
+        <w:ind w:left="567" w:hanging="425"/>
         <w:rPr>
           <w:lang w:val="es-419" w:eastAsia="es-CO"/>
         </w:rPr>
@@ -5725,53 +5684,6 @@
           <w:lang w:val="es-419" w:eastAsia="es-CO"/>
         </w:rPr>
         <w:t xml:space="preserve"> en distintos contextos de aprendizaje. Incluyen la planificación de actividades formativas que respondan a necesidades de capacitación. En su formulación, cobran relevancia los objetivos de aprendizaje, las estrategias pedagógicas y los recursos didácticos.</w:t>
-      </w:r>
-    </w:p>
-    <w:p>
-      <w:pPr>
-        <w:rPr>
-          <w:lang w:val="es-419" w:eastAsia="es-CO"/>
-        </w:rPr>
-      </w:pPr>
-      <w:r>
-        <w:rPr>
-          <w:lang w:val="es-419" w:eastAsia="es-CO"/>
-        </w:rPr>
-        <w:t xml:space="preserve">Identificar los diferentes tipos de proyectos permite comprender que, aunque los contextos y propósitos varían, todos requieren una </w:t>
-      </w:r>
-      <w:r>
-        <w:rPr>
-          <w:b/>
-          <w:bCs/>
-          <w:lang w:val="es-419" w:eastAsia="es-CO"/>
-        </w:rPr>
-        <w:t>formulación estructurada y coherente</w:t>
-      </w:r>
-      <w:r>
-        <w:rPr>
-          <w:lang w:val="es-419" w:eastAsia="es-CO"/>
-        </w:rPr>
-        <w:t>. Esta comprensión facilita la adaptación del proceso de formulación a distintos entornos profesionales, manteniendo siempre la claridad en la necesidad identificada, los objetivos planteados y los resultados esperados.</w:t>
-      </w:r>
-    </w:p>
-    <w:p>
-      <w:pPr>
-        <w:rPr>
-          <w:lang w:val="es-419" w:eastAsia="es-CO"/>
-        </w:rPr>
-      </w:pPr>
-      <w:r>
-        <w:rPr>
-          <w:lang w:val="es-419" w:eastAsia="es-CO"/>
-        </w:rPr>
-        <w:t xml:space="preserve">Desde la formación complementaria, el reconocimiento de estos tipos fortalece la capacidad de análisis y favorece la apropiación de los conceptos abordados en el componente formativo. De esta manera, el aprendiz consolida una visión flexible y </w:t>
-      </w:r>
-      <w:r>
-        <w:rPr>
-          <w:lang w:val="es-419" w:eastAsia="es-CO"/>
-        </w:rPr>
-        <w:lastRenderedPageBreak/>
-        <w:t>contextualizada de la formulación de proyectos, aplicable a diversos escenarios del ejercicio profesional.</w:t>
       </w:r>
     </w:p>
     <w:p>
@@ -5781,7 +5693,7 @@
           <w:ilvl w:val="0"/>
           <w:numId w:val="21"/>
         </w:numPr>
-        <w:ind w:left="567" w:hanging="283"/>
+        <w:ind w:left="567" w:hanging="425"/>
       </w:pPr>
       <w:r>
         <w:rPr>
@@ -5819,7 +5731,7 @@
           <w:ilvl w:val="0"/>
           <w:numId w:val="20"/>
         </w:numPr>
-        <w:ind w:left="567" w:hanging="283"/>
+        <w:ind w:left="567" w:hanging="425"/>
       </w:pPr>
       <w:r>
         <w:rPr>
@@ -5841,7 +5753,7 @@
           <w:ilvl w:val="0"/>
           <w:numId w:val="20"/>
         </w:numPr>
-        <w:ind w:left="567" w:hanging="283"/>
+        <w:ind w:left="567" w:hanging="425"/>
         <w:rPr>
           <w:lang w:val="es-419" w:eastAsia="es-CO"/>
         </w:rPr>
@@ -5850,6 +5762,7 @@
         <w:rPr>
           <w:rStyle w:val="Ttulo5Car"/>
         </w:rPr>
+        <w:lastRenderedPageBreak/>
         <w:t>Proyectos comunitarios.</w:t>
       </w:r>
       <w:r>
@@ -5901,18 +5814,10 @@
           <w:lang w:val="es-419" w:eastAsia="es-CO"/>
         </w:rPr>
       </w:pPr>
-    </w:p>
-    <w:p>
-      <w:pPr>
-        <w:rPr>
-          <w:lang w:val="es-419" w:eastAsia="es-CO"/>
-        </w:rPr>
-      </w:pPr>
-      <w:r>
-        <w:rPr>
-          <w:lang w:val="es-419" w:eastAsia="es-CO"/>
-        </w:rPr>
-        <w:lastRenderedPageBreak/>
+      <w:r>
+        <w:rPr>
+          <w:lang w:val="es-419" w:eastAsia="es-CO"/>
+        </w:rPr>
         <w:t>Desde la formación complementaria, el reconocimiento de estos tipos fortalece la capacidad de análisis y favorece la apropiación de los conceptos abordados en el componente formativo. De esta manera, el aprendiz consolida una visión flexible y contextualizada de la formulación de proyectos, aplicable a diversos escenarios del ejercicio profesional.</w:t>
       </w:r>
     </w:p>
@@ -5974,7 +5879,7 @@
           <w:ilvl w:val="0"/>
           <w:numId w:val="22"/>
         </w:numPr>
-        <w:ind w:left="567" w:hanging="283"/>
+        <w:ind w:left="567" w:hanging="425"/>
         <w:rPr>
           <w:lang w:val="es-419" w:eastAsia="es-CO"/>
         </w:rPr>
@@ -5999,7 +5904,7 @@
           <w:ilvl w:val="0"/>
           <w:numId w:val="22"/>
         </w:numPr>
-        <w:ind w:left="567" w:hanging="283"/>
+        <w:ind w:left="567" w:hanging="425"/>
         <w:rPr>
           <w:lang w:val="es-419" w:eastAsia="es-CO"/>
         </w:rPr>
@@ -6024,7 +5929,7 @@
           <w:ilvl w:val="0"/>
           <w:numId w:val="22"/>
         </w:numPr>
-        <w:ind w:left="567" w:hanging="283"/>
+        <w:ind w:left="567" w:hanging="425"/>
         <w:rPr>
           <w:lang w:val="es-419" w:eastAsia="es-CO"/>
         </w:rPr>
@@ -6033,7 +5938,6 @@
         <w:rPr>
           <w:rStyle w:val="Ttulo5Car"/>
         </w:rPr>
-        <w:lastRenderedPageBreak/>
         <w:t>Entregables del proyecto.</w:t>
       </w:r>
       <w:r>
@@ -6050,7 +5954,7 @@
           <w:ilvl w:val="0"/>
           <w:numId w:val="22"/>
         </w:numPr>
-        <w:ind w:left="567" w:hanging="283"/>
+        <w:ind w:left="567" w:hanging="425"/>
         <w:rPr>
           <w:lang w:val="es-419" w:eastAsia="es-CO"/>
         </w:rPr>
@@ -6075,7 +5979,7 @@
           <w:ilvl w:val="0"/>
           <w:numId w:val="22"/>
         </w:numPr>
-        <w:ind w:left="567" w:hanging="283"/>
+        <w:ind w:left="567" w:hanging="425"/>
         <w:rPr>
           <w:lang w:val="es-419" w:eastAsia="es-CO"/>
         </w:rPr>
@@ -6096,7 +6000,14 @@
         <w:rPr>
           <w:lang w:val="es-419" w:eastAsia="es-CO"/>
         </w:rPr>
-        <w:t>Hacen referencia a la relación entre tareas o al uso compartido de recursos. Una dependencia existe cuando una actividad no puede iniciar hasta que otra haya finalizado. Comprender estas relaciones es fundamental para asegurar la disponibilidad adecuada de recursos y evitar retrasos.</w:t>
+        <w:t xml:space="preserve">Hacen referencia a la relación entre tareas o al uso compartido de recursos. Una dependencia existe cuando una actividad no puede iniciar hasta que otra haya finalizado. Comprender estas relaciones es </w:t>
+      </w:r>
+      <w:r>
+        <w:rPr>
+          <w:lang w:val="es-419" w:eastAsia="es-CO"/>
+        </w:rPr>
+        <w:lastRenderedPageBreak/>
+        <w:t>fundamental para asegurar la disponibilidad adecuada de recursos y evitar retrasos.</w:t>
       </w:r>
     </w:p>
     <w:p>
@@ -6106,7 +6017,7 @@
           <w:ilvl w:val="0"/>
           <w:numId w:val="22"/>
         </w:numPr>
-        <w:ind w:left="567" w:hanging="283"/>
+        <w:ind w:left="567" w:hanging="425"/>
         <w:rPr>
           <w:lang w:val="es-419" w:eastAsia="es-CO"/>
         </w:rPr>
@@ -6131,7 +6042,7 @@
           <w:ilvl w:val="0"/>
           <w:numId w:val="22"/>
         </w:numPr>
-        <w:ind w:left="567" w:hanging="283"/>
+        <w:ind w:left="567" w:hanging="425"/>
         <w:rPr>
           <w:lang w:val="es-419" w:eastAsia="es-CO"/>
         </w:rPr>
@@ -6151,23 +6062,14 @@
     </w:p>
     <w:p>
       <w:pPr>
-        <w:ind w:firstLine="0"/>
-        <w:rPr>
-          <w:lang w:val="es-419" w:eastAsia="es-CO"/>
-        </w:rPr>
-      </w:pPr>
-    </w:p>
-    <w:p>
-      <w:pPr>
-        <w:rPr>
-          <w:lang w:val="es-419" w:eastAsia="es-CO"/>
-        </w:rPr>
-      </w:pPr>
-      <w:r>
-        <w:rPr>
-          <w:lang w:val="es-419" w:eastAsia="es-CO"/>
-        </w:rPr>
-        <w:lastRenderedPageBreak/>
+        <w:rPr>
+          <w:lang w:val="es-419" w:eastAsia="es-CO"/>
+        </w:rPr>
+      </w:pPr>
+      <w:r>
+        <w:rPr>
+          <w:lang w:val="es-419" w:eastAsia="es-CO"/>
+        </w:rPr>
         <w:t>Estos términos permiten comprender que la formulación de proyectos no solo implica estructurar una propuesta, sino también manejar un conjunto de conceptos que orientan su planificación y gestión.</w:t>
       </w:r>
     </w:p>
@@ -6183,62 +6085,6 @@
         </w:rPr>
         <w:t>Desde la formación complementaria, la apropiación de este vocabulario fortalece la comprensión técnica del proceso y facilita la comunicación en contextos profesionales donde la gestión de proyectos constituye una práctica habitual.</w:t>
       </w:r>
-    </w:p>
-    <w:p>
-      <w:pPr>
-        <w:rPr>
-          <w:lang w:val="es-419" w:eastAsia="es-CO"/>
-        </w:rPr>
-      </w:pPr>
-    </w:p>
-    <w:p>
-      <w:pPr>
-        <w:rPr>
-          <w:lang w:val="es-419" w:eastAsia="es-CO"/>
-        </w:rPr>
-      </w:pPr>
-    </w:p>
-    <w:p>
-      <w:pPr>
-        <w:rPr>
-          <w:lang w:val="es-419" w:eastAsia="es-CO"/>
-        </w:rPr>
-      </w:pPr>
-    </w:p>
-    <w:p>
-      <w:pPr>
-        <w:rPr>
-          <w:lang w:val="es-419" w:eastAsia="es-CO"/>
-        </w:rPr>
-      </w:pPr>
-    </w:p>
-    <w:p>
-      <w:pPr>
-        <w:rPr>
-          <w:lang w:val="es-419" w:eastAsia="es-CO"/>
-        </w:rPr>
-      </w:pPr>
-    </w:p>
-    <w:p>
-      <w:pPr>
-        <w:rPr>
-          <w:lang w:val="es-419" w:eastAsia="es-CO"/>
-        </w:rPr>
-      </w:pPr>
-    </w:p>
-    <w:p>
-      <w:pPr>
-        <w:rPr>
-          <w:lang w:val="es-419" w:eastAsia="es-CO"/>
-        </w:rPr>
-      </w:pPr>
-    </w:p>
-    <w:p>
-      <w:pPr>
-        <w:rPr>
-          <w:lang w:val="es-419" w:eastAsia="es-CO"/>
-        </w:rPr>
-      </w:pPr>
     </w:p>
     <w:p>
       <w:pPr>
@@ -6292,13 +6138,6 @@
         <w:t>Mejores prácticas para la gestión de proyectos</w:t>
       </w:r>
       <w:bookmarkEnd w:id="12"/>
-    </w:p>
-    <w:p>
-      <w:pPr>
-        <w:rPr>
-          <w:lang w:val="es-419" w:eastAsia="es-CO"/>
-        </w:rPr>
-      </w:pPr>
     </w:p>
     <w:p>
       <w:pPr>
@@ -6333,7 +6172,7 @@
           <w:ilvl w:val="0"/>
           <w:numId w:val="23"/>
         </w:numPr>
-        <w:ind w:left="567" w:hanging="283"/>
+        <w:ind w:left="567" w:hanging="425"/>
         <w:rPr>
           <w:lang w:val="es-419" w:eastAsia="es-CO"/>
         </w:rPr>
@@ -6358,7 +6197,7 @@
           <w:ilvl w:val="0"/>
           <w:numId w:val="23"/>
         </w:numPr>
-        <w:ind w:left="567" w:hanging="283"/>
+        <w:ind w:left="567" w:hanging="425"/>
         <w:rPr>
           <w:lang w:val="es-419" w:eastAsia="es-CO"/>
         </w:rPr>
@@ -6383,7 +6222,7 @@
           <w:ilvl w:val="0"/>
           <w:numId w:val="23"/>
         </w:numPr>
-        <w:ind w:left="567" w:hanging="283"/>
+        <w:ind w:left="567" w:hanging="425"/>
         <w:rPr>
           <w:lang w:val="es-419" w:eastAsia="es-CO"/>
         </w:rPr>
@@ -6398,14 +6237,7 @@
         <w:rPr>
           <w:lang w:val="es-419" w:eastAsia="es-CO"/>
         </w:rPr>
-        <w:t xml:space="preserve"> Es fundamental que los integrantes conozcan las fortalezas, especialidades y áreas de mejora de sus compañeros. Esto facilita la asignación adecuada de tareas y reduce tiempos improductivos. Cuando el gerente </w:t>
-      </w:r>
-      <w:r>
-        <w:rPr>
-          <w:lang w:val="es-419" w:eastAsia="es-CO"/>
-        </w:rPr>
-        <w:lastRenderedPageBreak/>
-        <w:t>comprende las capacidades individuales, puede orientar el trabajo hacia el aprovechamiento de fortalezas, promoviendo un ambiente positivo y colaborativo.</w:t>
+        <w:t xml:space="preserve"> Es fundamental que los integrantes conozcan las fortalezas, especialidades y áreas de mejora de sus compañeros. Esto facilita la asignación adecuada de tareas y reduce tiempos improductivos. Cuando el gerente comprende las capacidades individuales, puede orientar el trabajo hacia el aprovechamiento de fortalezas, promoviendo un ambiente positivo y colaborativo.</w:t>
       </w:r>
     </w:p>
     <w:p>
@@ -6415,7 +6247,7 @@
           <w:ilvl w:val="0"/>
           <w:numId w:val="23"/>
         </w:numPr>
-        <w:ind w:left="567" w:hanging="283"/>
+        <w:ind w:left="567" w:hanging="425"/>
         <w:rPr>
           <w:lang w:val="es-419" w:eastAsia="es-CO"/>
         </w:rPr>
@@ -6424,6 +6256,7 @@
         <w:rPr>
           <w:rStyle w:val="Ttulo5Car"/>
         </w:rPr>
+        <w:lastRenderedPageBreak/>
         <w:t>Reconocer y celebrar los hitos alcanzados.</w:t>
       </w:r>
       <w:r>
@@ -6440,7 +6273,7 @@
           <w:ilvl w:val="0"/>
           <w:numId w:val="23"/>
         </w:numPr>
-        <w:ind w:left="567" w:hanging="283"/>
+        <w:ind w:left="567" w:hanging="425"/>
         <w:rPr>
           <w:lang w:val="es-419" w:eastAsia="es-CO"/>
         </w:rPr>
@@ -6501,43 +6334,32 @@
           <w:lang w:val="es-419" w:eastAsia="es-CO"/>
         </w:rPr>
       </w:pPr>
-    </w:p>
-    <w:p>
-      <w:pPr>
-        <w:rPr>
-          <w:lang w:val="es-419" w:eastAsia="es-CO"/>
-        </w:rPr>
-      </w:pPr>
-      <w:r>
-        <w:rPr>
-          <w:lang w:val="es-419" w:eastAsia="es-CO"/>
-        </w:rPr>
-        <w:t xml:space="preserve">Los diagramas de flujo son herramientas gráficas que permiten representar de manera secuencial las actividades, decisiones y procesos que hacen parte de un </w:t>
-      </w:r>
-      <w:r>
-        <w:rPr>
-          <w:lang w:val="es-419" w:eastAsia="es-CO"/>
+      <w:r>
+        <w:rPr>
+          <w:lang w:val="es-419" w:eastAsia="es-CO"/>
+        </w:rPr>
+        <w:t>Los diagramas de flujo son herramientas gráficas que permiten representar de manera secuencial las actividades, decisiones y procesos que hacen parte de un proyecto. En la formulación de proyectos, su uso facilita la comprensión del orden lógico de las acciones y la relación existente entre las diferentes etapas que conforman el proceso.</w:t>
+      </w:r>
+    </w:p>
+    <w:p>
+      <w:pPr>
+        <w:pStyle w:val="Figura"/>
+        <w:rPr>
+          <w:lang w:val="es-419"/>
+        </w:rPr>
+      </w:pPr>
+      <w:r>
+        <w:rPr>
+          <w:lang w:val="es-419"/>
         </w:rPr>
         <w:lastRenderedPageBreak/>
-        <w:t>proyecto. En la formulación de proyectos, su uso facilita la comprensión del orden lógico de las acciones y la relación existente entre las diferentes etapas que conforman el proceso.</w:t>
-      </w:r>
-    </w:p>
-    <w:p>
-      <w:pPr>
-        <w:pStyle w:val="Figura"/>
-        <w:rPr>
-          <w:lang w:val="es-419"/>
-        </w:rPr>
-      </w:pPr>
-      <w:r>
-        <w:rPr>
-          <w:lang w:val="es-419"/>
-        </w:rPr>
         <w:t>Ejemplo Diagrama de flujo</w:t>
       </w:r>
     </w:p>
     <w:p>
       <w:pPr>
+        <w:ind w:firstLine="0"/>
+        <w:jc w:val="center"/>
         <w:rPr>
           <w:lang w:val="es-419" w:eastAsia="es-CO"/>
         </w:rPr>
@@ -6548,10 +6370,16 @@
           <w:lang w:val="es-419" w:eastAsia="es-CO"/>
         </w:rPr>
         <w:drawing>
-          <wp:inline distT="0" distB="0" distL="0" distR="0" wp14:anchorId="3635547E" wp14:editId="43EA85CC">
+          <wp:inline distT="0" distB="0" distL="0" distR="0" wp14:anchorId="3635547E" wp14:editId="127D51DF">
             <wp:extent cx="3401695" cy="5913755"/>
             <wp:effectExtent l="0" t="0" r="8255" b="0"/>
-            <wp:docPr id="9" name="Imagen 9"/>
+            <wp:docPr id="9" name="Imagen 9">
+              <a:extLst xmlns:a="http://schemas.openxmlformats.org/drawingml/2006/main">
+                <a:ext uri="{C183D7F6-B498-43B3-948B-1728B52AA6E4}">
+                  <adec:decorative xmlns:adec="http://schemas.microsoft.com/office/drawing/2017/decorative" val="1"/>
+                </a:ext>
+              </a:extLst>
+            </wp:docPr>
             <wp:cNvGraphicFramePr>
               <a:graphicFrameLocks xmlns:a="http://schemas.openxmlformats.org/drawingml/2006/main" noChangeAspect="1"/>
             </wp:cNvGraphicFramePr>
@@ -6559,7 +6387,13 @@
               <a:graphicData uri="http://schemas.openxmlformats.org/drawingml/2006/picture">
                 <pic:pic xmlns:pic="http://schemas.openxmlformats.org/drawingml/2006/picture">
                   <pic:nvPicPr>
-                    <pic:cNvPr id="0" name="Picture 3"/>
+                    <pic:cNvPr id="9" name="Imagen 9">
+                      <a:extLst>
+                        <a:ext uri="{C183D7F6-B498-43B3-948B-1728B52AA6E4}">
+                          <adec:decorative xmlns:adec="http://schemas.microsoft.com/office/drawing/2017/decorative" val="1"/>
+                        </a:ext>
+                      </a:extLst>
+                    </pic:cNvPr>
                     <pic:cNvPicPr>
                       <a:picLocks noChangeAspect="1" noChangeArrowheads="1"/>
                     </pic:cNvPicPr>
@@ -6600,20 +6434,6 @@
           <w:lang w:val="es-419" w:eastAsia="es-CO"/>
         </w:rPr>
       </w:pPr>
-    </w:p>
-    <w:p>
-      <w:pPr>
-        <w:rPr>
-          <w:lang w:val="es-419" w:eastAsia="es-CO"/>
-        </w:rPr>
-      </w:pPr>
-    </w:p>
-    <w:p>
-      <w:pPr>
-        <w:rPr>
-          <w:lang w:val="es-419" w:eastAsia="es-CO"/>
-        </w:rPr>
-      </w:pPr>
       <w:r>
         <w:rPr>
           <w:lang w:val="es-419" w:eastAsia="es-CO"/>
@@ -6631,6 +6451,7 @@
         <w:rPr>
           <w:lang w:val="es-419" w:eastAsia="es-CO"/>
         </w:rPr>
+        <w:lastRenderedPageBreak/>
         <w:t>A continuación. Se presentan los aspectos relacionados con la importancia, relación, apoyo, beneficios y aplicación formativa de los diagramas de flujo en la formulación de proyectos.</w:t>
       </w:r>
     </w:p>
@@ -6641,7 +6462,7 @@
           <w:ilvl w:val="0"/>
           <w:numId w:val="24"/>
         </w:numPr>
-        <w:ind w:left="567" w:hanging="283"/>
+        <w:ind w:left="567" w:hanging="425"/>
         <w:rPr>
           <w:lang w:val="es-419" w:eastAsia="es-CO"/>
         </w:rPr>
@@ -6666,7 +6487,7 @@
           <w:ilvl w:val="0"/>
           <w:numId w:val="24"/>
         </w:numPr>
-        <w:ind w:left="567" w:hanging="283"/>
+        <w:ind w:left="567" w:hanging="425"/>
         <w:rPr>
           <w:lang w:val="es-419" w:eastAsia="es-CO"/>
         </w:rPr>
@@ -6691,7 +6512,7 @@
           <w:ilvl w:val="0"/>
           <w:numId w:val="24"/>
         </w:numPr>
-        <w:ind w:left="567" w:hanging="283"/>
+        <w:ind w:left="567" w:hanging="425"/>
         <w:rPr>
           <w:lang w:val="es-419" w:eastAsia="es-CO"/>
         </w:rPr>
@@ -6700,7 +6521,6 @@
         <w:rPr>
           <w:rStyle w:val="Ttulo5Car"/>
         </w:rPr>
-        <w:lastRenderedPageBreak/>
         <w:t>Apoyo en la formulación de proyectos.</w:t>
       </w:r>
       <w:r>
@@ -6717,7 +6537,7 @@
           <w:ilvl w:val="0"/>
           <w:numId w:val="24"/>
         </w:numPr>
-        <w:ind w:left="567" w:hanging="283"/>
+        <w:ind w:left="567" w:hanging="425"/>
         <w:rPr>
           <w:lang w:val="es-419" w:eastAsia="es-CO"/>
         </w:rPr>
@@ -6726,6 +6546,7 @@
         <w:rPr>
           <w:rStyle w:val="Ttulo5Car"/>
         </w:rPr>
+        <w:lastRenderedPageBreak/>
         <w:t>Beneficios en la formación complementaria.</w:t>
       </w:r>
       <w:r>
@@ -6742,7 +6563,7 @@
           <w:ilvl w:val="0"/>
           <w:numId w:val="24"/>
         </w:numPr>
-        <w:ind w:left="567" w:hanging="283"/>
+        <w:ind w:left="567" w:hanging="425"/>
         <w:rPr>
           <w:lang w:val="es-419" w:eastAsia="es-CO"/>
         </w:rPr>
@@ -6784,58 +6605,44 @@
           <w:lang w:val="es-419" w:eastAsia="es-CO"/>
         </w:rPr>
       </w:pPr>
-    </w:p>
-    <w:p>
-      <w:pPr>
-        <w:rPr>
-          <w:lang w:val="es-419" w:eastAsia="es-CO"/>
-        </w:rPr>
-      </w:pPr>
-      <w:r>
-        <w:rPr>
-          <w:lang w:val="es-419" w:eastAsia="es-CO"/>
-        </w:rPr>
-        <w:t xml:space="preserve">La metodología para la formulación de proyectos se entiende como el conjunto organizado de pasos que permiten estructurar una propuesta de manera lógica, </w:t>
+      <w:r>
+        <w:rPr>
+          <w:lang w:val="es-419" w:eastAsia="es-CO"/>
+        </w:rPr>
+        <w:t>La metodología para la formulación de proyectos se entiende como el conjunto organizado de pasos que permiten estructurar una propuesta de manera lógica, coherente y orientada a la solución de una necesidad identificada en el contexto profesional.</w:t>
+      </w:r>
+    </w:p>
+    <w:p>
+      <w:pPr>
+        <w:rPr>
+          <w:lang w:val="es-419" w:eastAsia="es-CO"/>
+        </w:rPr>
+      </w:pPr>
+      <w:r>
+        <w:rPr>
+          <w:lang w:val="es-419" w:eastAsia="es-CO"/>
+        </w:rPr>
+        <w:t>En el marco de la formación complementaria, esta metodología no se centra en la ejecución detallada del proyecto, sino en la identificación y organización conceptual de sus elementos fundamentales. Su propósito es fortalecer la capacidad de análisis, organización y estructuración de ideas por parte del aprendiz.</w:t>
+      </w:r>
+    </w:p>
+    <w:p>
+      <w:pPr>
+        <w:rPr>
+          <w:lang w:val="es-419" w:eastAsia="es-CO"/>
+        </w:rPr>
+      </w:pPr>
+      <w:r>
+        <w:rPr>
+          <w:lang w:val="es-419" w:eastAsia="es-CO"/>
+        </w:rPr>
+        <w:t xml:space="preserve">Comprender la metodología de formulación permite reconocer que un proyecto no surge de manera improvisada, sino que responde a un proceso estructurado que </w:t>
       </w:r>
       <w:r>
         <w:rPr>
           <w:lang w:val="es-419" w:eastAsia="es-CO"/>
         </w:rPr>
         <w:lastRenderedPageBreak/>
-        <w:t>coherente y orientada a la solución de una necesidad identificada en el contexto profesional.</w:t>
-      </w:r>
-    </w:p>
-    <w:p>
-      <w:pPr>
-        <w:rPr>
-          <w:lang w:val="es-419" w:eastAsia="es-CO"/>
-        </w:rPr>
-      </w:pPr>
-    </w:p>
-    <w:p>
-      <w:pPr>
-        <w:rPr>
-          <w:lang w:val="es-419" w:eastAsia="es-CO"/>
-        </w:rPr>
-      </w:pPr>
-      <w:r>
-        <w:rPr>
-          <w:lang w:val="es-419" w:eastAsia="es-CO"/>
-        </w:rPr>
-        <w:t>En el marco de la formación complementaria, esta metodología no se centra en la ejecución detallada del proyecto, sino en la identificación y organización conceptual de sus elementos fundamentales. Su propósito es fortalecer la capacidad de análisis, organización y estructuración de ideas por parte del aprendiz.</w:t>
-      </w:r>
-    </w:p>
-    <w:p>
-      <w:pPr>
-        <w:rPr>
-          <w:lang w:val="es-419" w:eastAsia="es-CO"/>
-        </w:rPr>
-      </w:pPr>
-      <w:r>
-        <w:rPr>
-          <w:lang w:val="es-419" w:eastAsia="es-CO"/>
-        </w:rPr>
-        <w:t>Comprender la metodología de formulación permite reconocer que un proyecto no surge de manera improvisada, sino que responde a un proceso estructurado que garantiza claridad, coherencia y pertinencia frente al entorno profesional. A continuación, se presentan las etapas que conforman la metodología para la formulación de proyectos.</w:t>
+        <w:t>garantiza claridad, coherencia y pertinencia frente al entorno profesional. A continuación, se presentan las etapas que conforman la metodología para la formulación de proyectos.</w:t>
       </w:r>
     </w:p>
     <w:p>
@@ -6852,6 +6659,7 @@
           <w:ilvl w:val="0"/>
           <w:numId w:val="25"/>
         </w:numPr>
+        <w:ind w:left="567" w:hanging="425"/>
         <w:rPr>
           <w:lang w:val="es-419" w:eastAsia="es-CO"/>
         </w:rPr>
@@ -6882,6 +6690,7 @@
           <w:ilvl w:val="0"/>
           <w:numId w:val="25"/>
         </w:numPr>
+        <w:ind w:left="567" w:hanging="425"/>
         <w:rPr>
           <w:lang w:val="es-419" w:eastAsia="es-CO"/>
         </w:rPr>
@@ -6902,14 +6711,7 @@
         <w:rPr>
           <w:lang w:val="es-419" w:eastAsia="es-CO"/>
         </w:rPr>
-        <w:t xml:space="preserve">Permite comprender las condiciones en las que surge la necesidad identificada. Puede incluir factores técnicos, organizacionales, sociales o económicos que influyen en la estructuración del </w:t>
-      </w:r>
-      <w:r>
-        <w:rPr>
-          <w:lang w:val="es-419" w:eastAsia="es-CO"/>
-        </w:rPr>
-        <w:lastRenderedPageBreak/>
-        <w:t>proyecto. Este análisis favorece la pertinencia de la propuesta y contribuye a delimitar su alcance.</w:t>
+        <w:t>Permite comprender las condiciones en las que surge la necesidad identificada. Puede incluir factores técnicos, organizacionales, sociales o económicos que influyen en la estructuración del proyecto. Este análisis favorece la pertinencia de la propuesta y contribuye a delimitar su alcance.</w:t>
       </w:r>
     </w:p>
     <w:p>
@@ -6919,6 +6721,7 @@
           <w:ilvl w:val="0"/>
           <w:numId w:val="25"/>
         </w:numPr>
+        <w:ind w:left="567" w:hanging="425"/>
         <w:rPr>
           <w:lang w:val="es-419" w:eastAsia="es-CO"/>
         </w:rPr>
@@ -6943,6 +6746,7 @@
           <w:ilvl w:val="0"/>
           <w:numId w:val="25"/>
         </w:numPr>
+        <w:ind w:left="567" w:hanging="425"/>
         <w:rPr>
           <w:lang w:val="es-419" w:eastAsia="es-CO"/>
         </w:rPr>
@@ -6973,6 +6777,7 @@
           <w:ilvl w:val="0"/>
           <w:numId w:val="25"/>
         </w:numPr>
+        <w:ind w:left="567" w:hanging="425"/>
         <w:rPr>
           <w:lang w:val="es-419" w:eastAsia="es-CO"/>
         </w:rPr>
@@ -6981,6 +6786,7 @@
         <w:rPr>
           <w:rStyle w:val="Ttulo5Car"/>
         </w:rPr>
+        <w:lastRenderedPageBreak/>
         <w:t>Delimitación del alcance.</w:t>
       </w:r>
       <w:r>
@@ -7003,6 +6809,7 @@
           <w:ilvl w:val="0"/>
           <w:numId w:val="25"/>
         </w:numPr>
+        <w:ind w:left="567" w:hanging="425"/>
         <w:rPr>
           <w:lang w:val="es-419" w:eastAsia="es-CO"/>
         </w:rPr>
@@ -7033,6 +6840,7 @@
           <w:ilvl w:val="0"/>
           <w:numId w:val="25"/>
         </w:numPr>
+        <w:ind w:left="567" w:hanging="425"/>
         <w:rPr>
           <w:lang w:val="es-419" w:eastAsia="es-CO"/>
         </w:rPr>
@@ -7052,32 +6860,16 @@
     </w:p>
     <w:p>
       <w:pPr>
-        <w:ind w:left="709" w:firstLine="0"/>
-        <w:rPr>
-          <w:lang w:val="es-419" w:eastAsia="es-CO"/>
-        </w:rPr>
-      </w:pPr>
-    </w:p>
-    <w:p>
-      <w:pPr>
-        <w:rPr>
-          <w:lang w:val="es-419" w:eastAsia="es-CO"/>
-        </w:rPr>
-      </w:pPr>
-      <w:r>
-        <w:rPr>
-          <w:lang w:val="es-419" w:eastAsia="es-CO"/>
-        </w:rPr>
-        <w:lastRenderedPageBreak/>
+        <w:rPr>
+          <w:lang w:val="es-419" w:eastAsia="es-CO"/>
+        </w:rPr>
+      </w:pPr>
+      <w:r>
+        <w:rPr>
+          <w:lang w:val="es-419" w:eastAsia="es-CO"/>
+        </w:rPr>
         <w:t>Estas etapas no deben entenderse como componentes aislados, sino como un proceso articulado en el que cada paso se relaciona con el anterior y orienta el siguiente. La correcta aplicación de esta metodología fortalece la coherencia interna del proyecto y consolida una base conceptual sólida para su desarrollo posterior.</w:t>
       </w:r>
-    </w:p>
-    <w:p>
-      <w:pPr>
-        <w:rPr>
-          <w:lang w:val="es-419" w:eastAsia="es-CO"/>
-        </w:rPr>
-      </w:pPr>
     </w:p>
     <w:p>
       <w:pPr>
@@ -7135,7 +6927,15 @@
                 <w:b/>
                 <w:bCs/>
               </w:rPr>
-              <w:t>Transcripción pódcast. Caracterización del sitio: fundamentos para el análisis ambiental integral.</w:t>
+              <w:lastRenderedPageBreak/>
+              <w:t xml:space="preserve">Transcripción pódcast. </w:t>
+            </w:r>
+            <w:r>
+              <w:rPr>
+                <w:b/>
+                <w:bCs/>
+              </w:rPr>
+              <w:t>Formulación de proyectos en mi profesión</w:t>
             </w:r>
           </w:p>
         </w:tc>
@@ -7185,7 +6985,6 @@
               <w:t>Claro, porque tener una buena intención no basta si no hay una forma clara de llevarla a la práctica. Y ahí es donde entra la metodología.</w:t>
             </w:r>
           </w:p>
-          <w:p/>
           <w:p>
             <w:pPr>
               <w:rPr>
@@ -7198,7 +6997,6 @@
                 <w:b/>
                 <w:bCs/>
               </w:rPr>
-              <w:lastRenderedPageBreak/>
               <w:t>Hombre</w:t>
             </w:r>
           </w:p>
@@ -7224,7 +7022,7 @@
           </w:p>
           <w:p>
             <w:r>
-              <w:t>Es como tener un mapa antes de empezar un viaje. Le permite saber por dónde arrancar, qué decisiones tomar y hacia dónde quiere llegar. (Efecto de sonido https://pixabay.com/sound-effects/musical-harp-transition-music-cue-6984/)</w:t>
+              <w:t xml:space="preserve">Es como tener un mapa antes de empezar un viaje. Le permite saber por dónde arrancar, qué decisiones tomar y hacia dónde quiere llegar. </w:t>
             </w:r>
           </w:p>
           <w:p>
@@ -7279,6 +7077,7 @@
                 <w:b/>
                 <w:bCs/>
               </w:rPr>
+              <w:lastRenderedPageBreak/>
               <w:t>Hombre</w:t>
             </w:r>
           </w:p>
@@ -7312,8 +7111,6 @@
               <w:t>En otras palabras, permite que el proyecto tenga lógica. Que cada parte responda a una necesidad real.</w:t>
             </w:r>
           </w:p>
-          <w:p/>
-          <w:p/>
           <w:p>
             <w:pPr>
               <w:rPr>
@@ -7392,26 +7189,6 @@
           <w:p>
             <w:r>
               <w:t>Por eso, más que un requisito académico, es una herramienta útil para la vida.</w:t>
-            </w:r>
-          </w:p>
-          <w:p>
-            <w:pPr>
-              <w:rPr>
-                <w:b/>
-                <w:bCs/>
-              </w:rPr>
-            </w:pPr>
-            <w:r>
-              <w:rPr>
-                <w:b/>
-                <w:bCs/>
-              </w:rPr>
-              <w:t>Hombre</w:t>
-            </w:r>
-          </w:p>
-          <w:p>
-            <w:r>
-              <w:t>Porque detrás de todo proyecto bien construido, siempre hay una metodología que lo respalda.</w:t>
             </w:r>
           </w:p>
           <w:p/>
@@ -7421,83 +7198,70 @@
     </w:tbl>
     <w:p>
       <w:pPr>
+        <w:rPr>
+          <w:lang w:eastAsia="es-CO"/>
+        </w:rPr>
+      </w:pPr>
+    </w:p>
+    <w:p>
+      <w:pPr>
         <w:pStyle w:val="Ttulo2"/>
+      </w:pPr>
+      <w:bookmarkStart w:id="15" w:name="_Toc224715462"/>
+      <w:r>
+        <w:lastRenderedPageBreak/>
+        <w:t>Errores frecuentes</w:t>
+      </w:r>
+      <w:bookmarkEnd w:id="15"/>
+    </w:p>
+    <w:p>
+      <w:pPr>
+        <w:rPr>
+          <w:lang w:val="es-419" w:eastAsia="es-CO"/>
+        </w:rPr>
+      </w:pPr>
+    </w:p>
+    <w:p>
+      <w:pPr>
+        <w:rPr>
+          <w:lang w:val="es-419" w:eastAsia="es-CO"/>
+        </w:rPr>
+      </w:pPr>
+      <w:r>
+        <w:rPr>
+          <w:lang w:val="es-419" w:eastAsia="es-CO"/>
+        </w:rPr>
+        <w:t>Durante la formulación de proyectos es común incurrir en errores que afectan la claridad, coherencia y estructuración de la propuesta. Reconocerlos permite fortalecer la comprensión de los conceptos y procesos involucrados, contribuyendo a una organización más sólida desde la etapa inicial.</w:t>
+      </w:r>
+    </w:p>
+    <w:p>
+      <w:pPr>
+        <w:rPr>
+          <w:lang w:val="es-419" w:eastAsia="es-CO"/>
+        </w:rPr>
+      </w:pPr>
+      <w:r>
+        <w:rPr>
+          <w:lang w:val="es-419" w:eastAsia="es-CO"/>
+        </w:rPr>
+        <w:t>Desde la formación complementaria, el análisis de estos errores no se orienta a la ejecución del proyecto, sino a la identificación de debilidades conceptuales y estructurales que pueden presentarse durante la formulación. Este reconocimiento favorece una mayor rigurosidad en la estructuración de la propuesta. A continuación, se presentan los errores más frecuentes en la formulación de proyectos y su impacto.</w:t>
+      </w:r>
+    </w:p>
+    <w:p>
+      <w:pPr>
+        <w:rPr>
+          <w:lang w:val="es-419" w:eastAsia="es-CO"/>
+        </w:rPr>
+      </w:pPr>
+    </w:p>
+    <w:p>
+      <w:pPr>
+        <w:pStyle w:val="Prrafodelista"/>
         <w:numPr>
           <w:ilvl w:val="0"/>
-          <w:numId w:val="0"/>
+          <w:numId w:val="28"/>
         </w:numPr>
-        <w:rPr>
-          <w:lang w:val="es-CO"/>
-        </w:rPr>
-      </w:pPr>
-    </w:p>
-    <w:p>
-      <w:pPr>
-        <w:rPr>
-          <w:lang w:eastAsia="es-CO"/>
-        </w:rPr>
-      </w:pPr>
-    </w:p>
-    <w:p>
-      <w:pPr>
-        <w:rPr>
-          <w:lang w:eastAsia="es-CO"/>
-        </w:rPr>
-      </w:pPr>
-    </w:p>
-    <w:p>
-      <w:pPr>
-        <w:pStyle w:val="Ttulo2"/>
-      </w:pPr>
-      <w:bookmarkStart w:id="15" w:name="_Toc224715462"/>
-      <w:r>
-        <w:lastRenderedPageBreak/>
-        <w:t>Errores frecuentes</w:t>
-      </w:r>
-      <w:bookmarkEnd w:id="15"/>
-    </w:p>
-    <w:p>
-      <w:pPr>
-        <w:rPr>
-          <w:lang w:val="es-419" w:eastAsia="es-CO"/>
-        </w:rPr>
-      </w:pPr>
-    </w:p>
-    <w:p>
-      <w:pPr>
-        <w:rPr>
-          <w:lang w:val="es-419" w:eastAsia="es-CO"/>
-        </w:rPr>
-      </w:pPr>
-      <w:r>
-        <w:rPr>
-          <w:lang w:val="es-419" w:eastAsia="es-CO"/>
-        </w:rPr>
-        <w:t>Durante la formulación de proyectos es común incurrir en errores que afectan la claridad, coherencia y estructuración de la propuesta. Reconocerlos permite fortalecer la comprensión de los conceptos y procesos involucrados, contribuyendo a una organización más sólida desde la etapa inicial.</w:t>
-      </w:r>
-    </w:p>
-    <w:p>
-      <w:pPr>
-        <w:rPr>
-          <w:lang w:val="es-419" w:eastAsia="es-CO"/>
-        </w:rPr>
-      </w:pPr>
-      <w:r>
-        <w:rPr>
-          <w:lang w:val="es-419" w:eastAsia="es-CO"/>
-        </w:rPr>
-        <w:t>Desde la formación complementaria, el análisis de estos errores no se orienta a la ejecución del proyecto, sino a la identificación de debilidades conceptuales y estructurales que pueden presentarse durante la formulación. Este reconocimiento favorece una mayor rigurosidad en la estructuración de la propuesta. A continuación, se presentan los errores más frecuentes en la formulación de proyectos y su impacto.</w:t>
-      </w:r>
-    </w:p>
-    <w:p>
-      <w:pPr>
-        <w:rPr>
-          <w:lang w:val="es-419" w:eastAsia="es-CO"/>
-        </w:rPr>
-      </w:pPr>
-    </w:p>
-    <w:p>
-      <w:pPr>
+        <w:ind w:left="567" w:hanging="425"/>
         <w:rPr>
           <w:lang w:val="es-419" w:eastAsia="es-CO"/>
         </w:rPr>
@@ -7506,7 +7270,15 @@
         <w:rPr>
           <w:rStyle w:val="Ttulo5Car"/>
         </w:rPr>
-        <w:t>Falta de claridad en la identificación de la necesidad o problema. Cuando</w:t>
+        <w:t xml:space="preserve">Falta de claridad en la identificación de la necesidad o problema. </w:t>
+      </w:r>
+      <w:r>
+        <w:rPr>
+          <w:rStyle w:val="Ttulo5Car"/>
+          <w:b w:val="0"/>
+          <w:bCs/>
+        </w:rPr>
+        <w:t>Cuando</w:t>
       </w:r>
       <w:r>
         <w:rPr>
@@ -7517,6 +7289,12 @@
     </w:p>
     <w:p>
       <w:pPr>
+        <w:pStyle w:val="Prrafodelista"/>
+        <w:numPr>
+          <w:ilvl w:val="0"/>
+          <w:numId w:val="28"/>
+        </w:numPr>
+        <w:ind w:left="567" w:hanging="425"/>
         <w:rPr>
           <w:lang w:val="es-419" w:eastAsia="es-CO"/>
         </w:rPr>
@@ -7531,17 +7309,17 @@
         <w:rPr>
           <w:lang w:val="es-419" w:eastAsia="es-CO"/>
         </w:rPr>
-        <w:t xml:space="preserve"> </w:t>
-      </w:r>
-      <w:r>
-        <w:rPr>
-          <w:lang w:val="es-419" w:eastAsia="es-CO"/>
-        </w:rPr>
-        <w:t>Objetivos demasiado amplios, ambiguos o que no guardan relación con la necesidad identificada afectan la comprensión del propósito del proyecto. Esta debilidad repercute en la estructuración de actividades y en la coherencia general de la propuesta.</w:t>
-      </w:r>
-    </w:p>
-    <w:p>
-      <w:pPr>
+        <w:t xml:space="preserve"> Objetivos demasiado amplios, ambiguos o que no guardan relación con la necesidad identificada afectan la comprensión del propósito del proyecto. Esta debilidad repercute en la estructuración de actividades y en la coherencia general de la propuesta.</w:t>
+      </w:r>
+    </w:p>
+    <w:p>
+      <w:pPr>
+        <w:pStyle w:val="Prrafodelista"/>
+        <w:numPr>
+          <w:ilvl w:val="0"/>
+          <w:numId w:val="28"/>
+        </w:numPr>
+        <w:ind w:left="567" w:hanging="425"/>
         <w:rPr>
           <w:lang w:val="es-419" w:eastAsia="es-CO"/>
         </w:rPr>
@@ -7556,13 +7334,7 @@
         <w:rPr>
           <w:lang w:val="es-419" w:eastAsia="es-CO"/>
         </w:rPr>
-        <w:t xml:space="preserve"> </w:t>
-      </w:r>
-      <w:r>
-        <w:rPr>
-          <w:lang w:val="es-419" w:eastAsia="es-CO"/>
-        </w:rPr>
-        <w:t xml:space="preserve">La desconexión entre necesidad, objetivos, actividades y resultados esperados impide comprender el </w:t>
+        <w:t xml:space="preserve"> La desconexión entre necesidad, objetivos, actividades y resultados esperados impide comprender el </w:t>
       </w:r>
       <w:r>
         <w:rPr>
@@ -7574,6 +7346,12 @@
     </w:p>
     <w:p>
       <w:pPr>
+        <w:pStyle w:val="Prrafodelista"/>
+        <w:numPr>
+          <w:ilvl w:val="0"/>
+          <w:numId w:val="28"/>
+        </w:numPr>
+        <w:ind w:left="567" w:hanging="425"/>
         <w:rPr>
           <w:lang w:val="es-419" w:eastAsia="es-CO"/>
         </w:rPr>
@@ -7588,17 +7366,17 @@
         <w:rPr>
           <w:lang w:val="es-419" w:eastAsia="es-CO"/>
         </w:rPr>
-        <w:t xml:space="preserve"> </w:t>
-      </w:r>
-      <w:r>
-        <w:rPr>
-          <w:lang w:val="es-419" w:eastAsia="es-CO"/>
-        </w:rPr>
-        <w:t>La ausencia de límites claros puede conducir a proyectos demasiado amplios o poco realistas. Definir el alcance permite delimitar la propuesta y evitar ambigüedades en la formulación.</w:t>
-      </w:r>
-    </w:p>
-    <w:p>
-      <w:pPr>
+        <w:t xml:space="preserve"> La ausencia de límites claros puede conducir a proyectos demasiado amplios o poco realistas. Definir el alcance permite delimitar la propuesta y evitar ambigüedades en la formulación.</w:t>
+      </w:r>
+    </w:p>
+    <w:p>
+      <w:pPr>
+        <w:pStyle w:val="Prrafodelista"/>
+        <w:numPr>
+          <w:ilvl w:val="0"/>
+          <w:numId w:val="28"/>
+        </w:numPr>
+        <w:ind w:left="567" w:hanging="425"/>
         <w:rPr>
           <w:lang w:val="es-419" w:eastAsia="es-CO"/>
         </w:rPr>
@@ -7613,17 +7391,17 @@
         <w:rPr>
           <w:lang w:val="es-419" w:eastAsia="es-CO"/>
         </w:rPr>
-        <w:t xml:space="preserve"> </w:t>
-      </w:r>
-      <w:r>
-        <w:rPr>
-          <w:lang w:val="es-419" w:eastAsia="es-CO"/>
-        </w:rPr>
-        <w:t>Actividades desordenadas o sin relación directa con los objetivos dificultan la comprensión del proyecto como una secuencia organizada de acciones. Su adecuada identificación permite estructurar el proceso de manera lógica.</w:t>
-      </w:r>
-    </w:p>
-    <w:p>
-      <w:pPr>
+        <w:t xml:space="preserve"> Actividades desordenadas o sin relación directa con los objetivos dificultan la comprensión del proyecto como una secuencia organizada de acciones. Su adecuada identificación permite estructurar el proceso de manera lógica.</w:t>
+      </w:r>
+    </w:p>
+    <w:p>
+      <w:pPr>
+        <w:pStyle w:val="Prrafodelista"/>
+        <w:numPr>
+          <w:ilvl w:val="0"/>
+          <w:numId w:val="28"/>
+        </w:numPr>
+        <w:ind w:left="567" w:hanging="425"/>
         <w:rPr>
           <w:lang w:val="es-419" w:eastAsia="es-CO"/>
         </w:rPr>
@@ -7638,17 +7416,17 @@
         <w:rPr>
           <w:lang w:val="es-419" w:eastAsia="es-CO"/>
         </w:rPr>
-        <w:t xml:space="preserve"> </w:t>
-      </w:r>
-      <w:r>
-        <w:rPr>
-          <w:lang w:val="es-419" w:eastAsia="es-CO"/>
-        </w:rPr>
-        <w:t>No reconocer los recursos necesarios limita la comprensión integral del proyecto y afecta su viabilidad conceptual. Aunque no se profundice en aspectos presupuestales, su identificación es fundamental para estructurar la propuesta.</w:t>
-      </w:r>
-    </w:p>
-    <w:p>
-      <w:pPr>
+        <w:t xml:space="preserve"> No reconocer los recursos necesarios limita la comprensión integral del proyecto y afecta su viabilidad conceptual. Aunque no se profundice en aspectos presupuestales, su identificación es fundamental para estructurar la propuesta.</w:t>
+      </w:r>
+    </w:p>
+    <w:p>
+      <w:pPr>
+        <w:pStyle w:val="Prrafodelista"/>
+        <w:numPr>
+          <w:ilvl w:val="0"/>
+          <w:numId w:val="28"/>
+        </w:numPr>
+        <w:ind w:left="567" w:hanging="425"/>
         <w:rPr>
           <w:lang w:val="es-419" w:eastAsia="es-CO"/>
         </w:rPr>
@@ -7663,17 +7441,17 @@
         <w:rPr>
           <w:lang w:val="es-419" w:eastAsia="es-CO"/>
         </w:rPr>
-        <w:t xml:space="preserve"> </w:t>
-      </w:r>
-      <w:r>
-        <w:rPr>
-          <w:lang w:val="es-419" w:eastAsia="es-CO"/>
-        </w:rPr>
-        <w:t>Ignorar que el proyecto se compone de fases conduce a una organización desordenada de las acciones. Reconocer el ciclo de vida fortalece la comprensión del proceso de formulación.</w:t>
-      </w:r>
-    </w:p>
-    <w:p>
-      <w:pPr>
+        <w:t xml:space="preserve"> Ignorar que el proyecto se compone de fases conduce a una organización desordenada de las acciones. Reconocer el ciclo de vida fortalece la comprensión del proceso de formulación.</w:t>
+      </w:r>
+    </w:p>
+    <w:p>
+      <w:pPr>
+        <w:pStyle w:val="Prrafodelista"/>
+        <w:numPr>
+          <w:ilvl w:val="0"/>
+          <w:numId w:val="28"/>
+        </w:numPr>
+        <w:ind w:left="567" w:hanging="425"/>
         <w:rPr>
           <w:lang w:val="es-419" w:eastAsia="es-CO"/>
         </w:rPr>
@@ -7688,40 +7466,34 @@
         <w:rPr>
           <w:lang w:val="es-419" w:eastAsia="es-CO"/>
         </w:rPr>
-        <w:t xml:space="preserve"> </w:t>
-      </w:r>
-      <w:r>
-        <w:rPr>
-          <w:lang w:val="es-419" w:eastAsia="es-CO"/>
-        </w:rPr>
-        <w:t>Abordar los elementos y fases de manera aislada dificulta la comprensión del proyecto como un todo coherente. Una visión integral permite articular cada componente dentro de una estructura organizada.</w:t>
-      </w:r>
-    </w:p>
-    <w:p>
-      <w:pPr>
-        <w:rPr>
-          <w:lang w:val="es-419" w:eastAsia="es-CO"/>
-        </w:rPr>
-      </w:pPr>
-    </w:p>
-    <w:p>
-      <w:pPr>
-        <w:rPr>
-          <w:lang w:val="es-419" w:eastAsia="es-CO"/>
-        </w:rPr>
-      </w:pPr>
-      <w:r>
-        <w:rPr>
-          <w:lang w:val="es-419" w:eastAsia="es-CO"/>
-        </w:rPr>
-        <w:t xml:space="preserve">Reconocer estos errores contribuye a fortalecer la comprensión de los conceptos abordados en el componente formativo y promueve una formulación más clara, </w:t>
+        <w:t xml:space="preserve"> Abordar los elementos y fases de manera aislada dificulta la comprensión del proyecto como un todo coherente. Una visión integral permite articular cada componente dentro de una estructura organizada.</w:t>
+      </w:r>
+    </w:p>
+    <w:p>
+      <w:pPr>
+        <w:rPr>
+          <w:lang w:val="es-419" w:eastAsia="es-CO"/>
+        </w:rPr>
+      </w:pPr>
+    </w:p>
+    <w:p>
+      <w:pPr>
+        <w:rPr>
+          <w:lang w:val="es-419" w:eastAsia="es-CO"/>
+        </w:rPr>
+      </w:pPr>
+      <w:r>
+        <w:rPr>
+          <w:lang w:val="es-419" w:eastAsia="es-CO"/>
+        </w:rPr>
+        <w:t xml:space="preserve">Reconocer estos errores contribuye a fortalecer la comprensión de los conceptos abordados en el componente formativo y promueve una formulación más clara, organizada y coherente. Este análisis permite al aprendiz identificar con mayor </w:t>
       </w:r>
       <w:r>
         <w:rPr>
           <w:lang w:val="es-419" w:eastAsia="es-CO"/>
         </w:rPr>
         <w:lastRenderedPageBreak/>
-        <w:t>organizada y coherente. Este análisis permite al aprendiz identificar con mayor precisión los elementos y fases necesarias para estructurar un proyecto alineado con el contexto profesional.</w:t>
+        <w:t>precisión los elementos y fases necesarias para estructurar un proyecto alineado con el contexto profesional.</w:t>
       </w:r>
     </w:p>
     <w:p>
@@ -7740,13 +7512,6 @@
         <w:t>Buenas prácticas</w:t>
       </w:r>
       <w:bookmarkEnd w:id="16"/>
-    </w:p>
-    <w:p>
-      <w:pPr>
-        <w:rPr>
-          <w:lang w:val="es-419" w:eastAsia="es-CO"/>
-        </w:rPr>
-      </w:pPr>
     </w:p>
     <w:p>
       <w:pPr>
@@ -7781,7 +7546,7 @@
           <w:ilvl w:val="0"/>
           <w:numId w:val="26"/>
         </w:numPr>
-        <w:ind w:left="567" w:hanging="283"/>
+        <w:ind w:left="567" w:hanging="425"/>
         <w:rPr>
           <w:lang w:val="es-419" w:eastAsia="es-CO"/>
         </w:rPr>
@@ -7798,14 +7563,6 @@
         </w:rPr>
         <w:t xml:space="preserve"> Definir con precisión la necesidad que da origen al proyecto permite establecer una base conceptual sólida. Esta identificación debe surgir del análisis del contexto profesional y orientar coherentemente la formulación de los objetivos y demás elementos del proyecto.</w:t>
       </w:r>
-    </w:p>
-    <w:p>
-      <w:pPr>
-        <w:ind w:left="567" w:hanging="283"/>
-        <w:rPr>
-          <w:lang w:val="es-419" w:eastAsia="es-CO"/>
-        </w:rPr>
-      </w:pPr>
     </w:p>
     <w:p>
       <w:pPr>
@@ -7814,7 +7571,7 @@
           <w:ilvl w:val="0"/>
           <w:numId w:val="26"/>
         </w:numPr>
-        <w:ind w:left="567" w:hanging="283"/>
+        <w:ind w:left="567" w:hanging="425"/>
         <w:rPr>
           <w:lang w:val="es-419" w:eastAsia="es-CO"/>
         </w:rPr>
@@ -7823,7 +7580,6 @@
         <w:rPr>
           <w:rStyle w:val="Ttulo5Car"/>
         </w:rPr>
-        <w:lastRenderedPageBreak/>
         <w:t>Coherencia entre los elementos del proyecto.</w:t>
       </w:r>
       <w:r>
@@ -7840,7 +7596,7 @@
           <w:ilvl w:val="0"/>
           <w:numId w:val="26"/>
         </w:numPr>
-        <w:ind w:left="567" w:hanging="283"/>
+        <w:ind w:left="567" w:hanging="425"/>
         <w:rPr>
           <w:lang w:val="es-419" w:eastAsia="es-CO"/>
         </w:rPr>
@@ -7849,6 +7605,7 @@
         <w:rPr>
           <w:rStyle w:val="Ttulo5Car"/>
         </w:rPr>
+        <w:lastRenderedPageBreak/>
         <w:t>Definición adecuada de los objetivos.</w:t>
       </w:r>
       <w:r>
@@ -7865,7 +7622,7 @@
           <w:ilvl w:val="0"/>
           <w:numId w:val="26"/>
         </w:numPr>
-        <w:ind w:left="567" w:hanging="283"/>
+        <w:ind w:left="567" w:hanging="425"/>
         <w:rPr>
           <w:lang w:val="es-419" w:eastAsia="es-CO"/>
         </w:rPr>
@@ -7882,14 +7639,6 @@
         </w:rPr>
         <w:t xml:space="preserve"> Establecer los límites del proyecto permite definir qué se incluye y qué se excluye en la propuesta. Esta delimitación evita ambigüedades y fortalece la organización estructural del proyecto.</w:t>
       </w:r>
-    </w:p>
-    <w:p>
-      <w:pPr>
-        <w:ind w:left="567" w:hanging="283"/>
-        <w:rPr>
-          <w:lang w:val="es-419" w:eastAsia="es-CO"/>
-        </w:rPr>
-      </w:pPr>
     </w:p>
     <w:p>
       <w:pPr>
@@ -7898,7 +7647,7 @@
           <w:ilvl w:val="0"/>
           <w:numId w:val="26"/>
         </w:numPr>
-        <w:ind w:left="567" w:hanging="283"/>
+        <w:ind w:left="567" w:hanging="425"/>
         <w:rPr>
           <w:lang w:val="es-419" w:eastAsia="es-CO"/>
         </w:rPr>
@@ -7915,23 +7664,6 @@
         </w:rPr>
         <w:t xml:space="preserve"> Las actividades deben plantearse de manera organizada y coherente con los objetivos. En la formulación, se estructuran de forma general, permitiendo comprender la secuencia lógica de acciones necesarias para alcanzar el propósito del proyecto.</w:t>
       </w:r>
-    </w:p>
-    <w:p>
-      <w:pPr>
-        <w:pStyle w:val="Prrafodelista"/>
-        <w:rPr>
-          <w:lang w:val="es-419" w:eastAsia="es-CO"/>
-        </w:rPr>
-      </w:pPr>
-    </w:p>
-    <w:p>
-      <w:pPr>
-        <w:pStyle w:val="Prrafodelista"/>
-        <w:ind w:left="1429" w:firstLine="0"/>
-        <w:rPr>
-          <w:lang w:val="es-419" w:eastAsia="es-CO"/>
-        </w:rPr>
-      </w:pPr>
     </w:p>
     <w:p>
       <w:pPr>
@@ -7940,7 +7672,7 @@
           <w:ilvl w:val="0"/>
           <w:numId w:val="26"/>
         </w:numPr>
-        <w:ind w:left="567" w:hanging="283"/>
+        <w:ind w:left="567" w:hanging="425"/>
         <w:rPr>
           <w:lang w:val="es-419" w:eastAsia="es-CO"/>
         </w:rPr>
@@ -7971,7 +7703,7 @@
           <w:ilvl w:val="0"/>
           <w:numId w:val="26"/>
         </w:numPr>
-        <w:ind w:left="567" w:hanging="283"/>
+        <w:ind w:left="567" w:hanging="425"/>
         <w:rPr>
           <w:lang w:val="es-419" w:eastAsia="es-CO"/>
         </w:rPr>
@@ -7998,14 +7730,7 @@
         <w:rPr>
           <w:lang w:val="es-419" w:eastAsia="es-CO"/>
         </w:rPr>
-        <w:t xml:space="preserve">Reconocer que el proyecto se desarrolla en fases permite organizarlo de manera secuencial y estructurada. Esta </w:t>
-      </w:r>
-      <w:r>
-        <w:rPr>
-          <w:lang w:val="es-419" w:eastAsia="es-CO"/>
-        </w:rPr>
-        <w:lastRenderedPageBreak/>
-        <w:t>práctica evita propuestas desarticuladas y favorece una comprensión ordenada del proceso.</w:t>
+        <w:t>Reconocer que el proyecto se desarrolla en fases permite organizarlo de manera secuencial y estructurada. Esta práctica evita propuestas desarticuladas y favorece una comprensión ordenada del proceso.</w:t>
       </w:r>
     </w:p>
     <w:p>
@@ -8015,7 +7740,7 @@
           <w:ilvl w:val="0"/>
           <w:numId w:val="26"/>
         </w:numPr>
-        <w:ind w:left="567" w:hanging="283"/>
+        <w:ind w:left="567" w:hanging="425"/>
         <w:rPr>
           <w:lang w:val="es-419" w:eastAsia="es-CO"/>
         </w:rPr>
@@ -8046,7 +7771,7 @@
           <w:ilvl w:val="0"/>
           <w:numId w:val="26"/>
         </w:numPr>
-        <w:ind w:left="567" w:hanging="283"/>
+        <w:ind w:left="567" w:hanging="425"/>
         <w:rPr>
           <w:lang w:val="es-419" w:eastAsia="es-CO"/>
         </w:rPr>
@@ -8055,6 +7780,7 @@
         <w:rPr>
           <w:rStyle w:val="Ttulo5Car"/>
         </w:rPr>
+        <w:lastRenderedPageBreak/>
         <w:t>Revisión y reflexión sobre la formulación.</w:t>
       </w:r>
       <w:r>
@@ -8390,14 +8116,6 @@
       </w:r>
     </w:p>
     <w:p>
-      <w:pPr>
-        <w:pStyle w:val="Prrafodelista"/>
-        <w:numPr>
-          <w:ilvl w:val="0"/>
-          <w:numId w:val="6"/>
-        </w:numPr>
-        <w:ind w:left="993"/>
-      </w:pPr>
       <w:r>
         <w:t xml:space="preserve">Callejas, L. C. (2020). Marco de referencia para la dirección de proyectos. Universidad Militar Nueva Granada. </w:t>
       </w:r>
@@ -8411,36 +8129,19 @@
       </w:hyperlink>
     </w:p>
     <w:p>
-      <w:pPr>
-        <w:pStyle w:val="Prrafodelista"/>
-        <w:numPr>
-          <w:ilvl w:val="0"/>
-          <w:numId w:val="6"/>
-        </w:numPr>
-        <w:ind w:left="993"/>
-      </w:pPr>
+      <w:r>
+        <w:t xml:space="preserve">Malsam, W. (2025). Definición de proyecto: ¿Qué es un proyecto y cómo debe gestionarse? </w:t>
+      </w:r>
       <w:proofErr w:type="spellStart"/>
       <w:r>
-        <w:t>Malsam</w:t>
+        <w:t>ProjectManager</w:t>
       </w:r>
       <w:proofErr w:type="spellEnd"/>
       <w:r>
-        <w:t xml:space="preserve">, W. (2025). Definición de proyecto: ¿Qué es un proyecto y cómo debe gestionarse? </w:t>
-      </w:r>
-      <w:proofErr w:type="spellStart"/>
-      <w:r>
-        <w:t>ProjectManager</w:t>
-      </w:r>
-      <w:proofErr w:type="spellEnd"/>
-      <w:r>
         <w:t xml:space="preserve">. </w:t>
       </w:r>
     </w:p>
     <w:p>
-      <w:pPr>
-        <w:pStyle w:val="Prrafodelista"/>
-        <w:ind w:left="993" w:firstLine="0"/>
-      </w:pPr>
       <w:hyperlink r:id="rId18" w:history="1">
         <w:r>
           <w:rPr>
@@ -8451,13 +8152,6 @@
       </w:hyperlink>
     </w:p>
     <w:p>
-      <w:pPr>
-        <w:pStyle w:val="Prrafodelista"/>
-        <w:numPr>
-          <w:ilvl w:val="0"/>
-          <w:numId w:val="27"/>
-        </w:numPr>
-      </w:pPr>
       <w:proofErr w:type="spellStart"/>
       <w:r>
         <w:t>Martins</w:t>
@@ -8468,10 +8162,6 @@
       </w:r>
     </w:p>
     <w:p>
-      <w:pPr>
-        <w:pStyle w:val="Prrafodelista"/>
-        <w:ind w:left="1095" w:firstLine="0"/>
-      </w:pPr>
       <w:hyperlink r:id="rId19" w:history="1">
         <w:r>
           <w:rPr>
@@ -8482,13 +8172,6 @@
       </w:hyperlink>
     </w:p>
     <w:p>
-      <w:pPr>
-        <w:pStyle w:val="Prrafodelista"/>
-        <w:numPr>
-          <w:ilvl w:val="0"/>
-          <w:numId w:val="27"/>
-        </w:numPr>
-      </w:pPr>
       <w:r>
         <w:t xml:space="preserve">Moya, D. P. (s. f.). Beneficios de la gestión de proyectos. Gestionar Fácil. </w:t>
       </w:r>
@@ -8502,24 +8185,12 @@
       </w:hyperlink>
     </w:p>
     <w:p>
-      <w:pPr>
-        <w:pStyle w:val="Prrafodelista"/>
-        <w:numPr>
-          <w:ilvl w:val="0"/>
-          <w:numId w:val="27"/>
-        </w:numPr>
-      </w:pPr>
       <w:r>
         <w:t>Proyectos A. (2025). ¿Cómo iniciar un proyecto y tener éxito? [Video]. YouTube.</w:t>
       </w:r>
     </w:p>
     <w:p>
       <w:pPr>
-        <w:pStyle w:val="Prrafodelista"/>
-        <w:numPr>
-          <w:ilvl w:val="0"/>
-          <w:numId w:val="27"/>
-        </w:numPr>
         <w:rPr>
           <w:lang w:val="en-US"/>
         </w:rPr>
@@ -8541,8 +8212,6 @@
     </w:p>
     <w:p>
       <w:pPr>
-        <w:pStyle w:val="Prrafodelista"/>
-        <w:ind w:left="1095" w:firstLine="0"/>
         <w:rPr>
           <w:lang w:val="en-US"/>
         </w:rPr>
@@ -8815,19 +8484,11 @@
                 <w:lang w:val="es-CO"/>
               </w:rPr>
             </w:pPr>
-            <w:proofErr w:type="spellStart"/>
             <w:r>
               <w:rPr>
                 <w:lang w:val="es-CO"/>
               </w:rPr>
-              <w:t>Joinner</w:t>
-            </w:r>
-            <w:proofErr w:type="spellEnd"/>
-            <w:r>
-              <w:rPr>
-                <w:lang w:val="es-CO"/>
-              </w:rPr>
-              <w:t xml:space="preserve"> Enrique Osorio </w:t>
+              <w:t xml:space="preserve">Joinner Enrique Osorio </w:t>
             </w:r>
             <w:proofErr w:type="spellStart"/>
             <w:r>
@@ -9296,6 +8957,12 @@
                 <w:lang w:val="es-CO"/>
               </w:rPr>
             </w:pPr>
+            <w:r>
+              <w:rPr>
+                <w:lang w:val="es-CO"/>
+              </w:rPr>
+              <w:t>Centro Agroempresarial y Desarrollo Pecuario - Regional Huila</w:t>
+            </w:r>
           </w:p>
         </w:tc>
       </w:tr>
@@ -9680,21 +9347,7 @@
               <w:rPr>
                 <w:lang w:val="es-CO"/>
               </w:rPr>
-              <w:t xml:space="preserve"> Wilfredo </w:t>
-            </w:r>
-            <w:proofErr w:type="spellStart"/>
-            <w:r>
-              <w:rPr>
-                <w:lang w:val="es-CO"/>
-              </w:rPr>
-              <w:t>Pizo</w:t>
-            </w:r>
-            <w:proofErr w:type="spellEnd"/>
-            <w:r>
-              <w:rPr>
-                <w:lang w:val="es-CO"/>
-              </w:rPr>
-              <w:t xml:space="preserve"> Ossa</w:t>
+              <w:t xml:space="preserve"> Wilfredo Pizo Ossa</w:t>
             </w:r>
           </w:p>
         </w:tc>
@@ -9855,7 +9508,7 @@
 </file>
 
 <file path=word/endnotes.xml><?xml version="1.0" encoding="utf-8"?>
-<w:endnotes xmlns:wpc="http://schemas.microsoft.com/office/word/2010/wordprocessingCanvas" xmlns:cx="http://schemas.microsoft.com/office/drawing/2014/chartex" xmlns:cx1="http://schemas.microsoft.com/office/drawing/2015/9/8/chartex" xmlns:cx2="http://schemas.microsoft.com/office/drawing/2015/10/21/chartex" xmlns:cx3="http://schemas.microsoft.com/office/drawing/2016/5/9/chartex" xmlns:cx4="http://schemas.microsoft.com/office/drawing/2016/5/10/chartex" xmlns:cx5="http://schemas.microsoft.com/office/drawing/2016/5/11/chartex" xmlns:cx6="http://schemas.microsoft.com/office/drawing/2016/5/12/chartex" xmlns:cx7="http://schemas.microsoft.com/office/drawing/2016/5/13/chartex" xmlns:cx8="http://schemas.microsoft.com/office/drawing/2016/5/14/chartex" xmlns:mc="http://schemas.openxmlformats.org/markup-compatibility/2006" xmlns:aink="http://schemas.microsoft.com/office/drawing/2016/ink" xmlns:am3d="http://schemas.microsoft.com/office/drawing/2017/model3d" xmlns:o="urn:schemas-microsoft-com:office:office" xmlns:r="http://schemas.openxmlformats.org/officeDocument/2006/relationships" xmlns:m="http://schemas.openxmlformats.org/officeDocument/2006/math" xmlns:v="urn:schemas-microsoft-com:vml" xmlns:wp14="http://schemas.microsoft.com/office/word/2010/wordprocessingDrawing" xmlns:wp="http://schemas.openxmlformats.org/drawingml/2006/wordprocessingDrawing" xmlns:w10="urn:schemas-microsoft-com:office:word" xmlns:w="http://schemas.openxmlformats.org/wordprocessingml/2006/main" xmlns:w14="http://schemas.microsoft.com/office/word/2010/wordml" xmlns:w15="http://schemas.microsoft.com/office/word/2012/wordml" xmlns:w16cex="http://schemas.microsoft.com/office/word/2018/wordml/cex" xmlns:w16cid="http://schemas.microsoft.com/office/word/2016/wordml/cid" xmlns:w16="http://schemas.microsoft.com/office/word/2018/wordml" xmlns:w16sdtdh="http://schemas.microsoft.com/office/word/2020/wordml/sdtdatahash" xmlns:w16se="http://schemas.microsoft.com/office/word/2015/wordml/symex" xmlns:wpg="http://schemas.microsoft.com/office/word/2010/wordprocessingGroup" xmlns:wpi="http://schemas.microsoft.com/office/word/2010/wordprocessingInk" xmlns:wne="http://schemas.microsoft.com/office/word/2006/wordml" xmlns:wps="http://schemas.microsoft.com/office/word/2010/wordprocessingShape" mc:Ignorable="w14 w15 w16se w16cid w16 w16cex w16sdtdh wp14">
+<w:endnotes xmlns:wpc="http://schemas.microsoft.com/office/word/2010/wordprocessingCanvas" xmlns:cx="http://schemas.microsoft.com/office/drawing/2014/chartex" xmlns:cx1="http://schemas.microsoft.com/office/drawing/2015/9/8/chartex" xmlns:cx2="http://schemas.microsoft.com/office/drawing/2015/10/21/chartex" xmlns:cx3="http://schemas.microsoft.com/office/drawing/2016/5/9/chartex" xmlns:cx4="http://schemas.microsoft.com/office/drawing/2016/5/10/chartex" xmlns:cx5="http://schemas.microsoft.com/office/drawing/2016/5/11/chartex" xmlns:cx6="http://schemas.microsoft.com/office/drawing/2016/5/12/chartex" xmlns:cx7="http://schemas.microsoft.com/office/drawing/2016/5/13/chartex" xmlns:cx8="http://schemas.microsoft.com/office/drawing/2016/5/14/chartex" xmlns:mc="http://schemas.openxmlformats.org/markup-compatibility/2006" xmlns:aink="http://schemas.microsoft.com/office/drawing/2016/ink" xmlns:am3d="http://schemas.microsoft.com/office/drawing/2017/model3d" xmlns:o="urn:schemas-microsoft-com:office:office" xmlns:oel="http://schemas.microsoft.com/office/2019/extlst" xmlns:r="http://schemas.openxmlformats.org/officeDocument/2006/relationships" xmlns:m="http://schemas.openxmlformats.org/officeDocument/2006/math" xmlns:v="urn:schemas-microsoft-com:vml" xmlns:wp14="http://schemas.microsoft.com/office/word/2010/wordprocessingDrawing" xmlns:wp="http://schemas.openxmlformats.org/drawingml/2006/wordprocessingDrawing" xmlns:w10="urn:schemas-microsoft-com:office:word" xmlns:w="http://schemas.openxmlformats.org/wordprocessingml/2006/main" xmlns:w14="http://schemas.microsoft.com/office/word/2010/wordml" xmlns:w15="http://schemas.microsoft.com/office/word/2012/wordml" xmlns:w16cex="http://schemas.microsoft.com/office/word/2018/wordml/cex" xmlns:w16cid="http://schemas.microsoft.com/office/word/2016/wordml/cid" xmlns:w16="http://schemas.microsoft.com/office/word/2018/wordml" xmlns:w16du="http://schemas.microsoft.com/office/word/2023/wordml/word16du" xmlns:w16sdtdh="http://schemas.microsoft.com/office/word/2020/wordml/sdtdatahash" xmlns:w16sdtfl="http://schemas.microsoft.com/office/word/2024/wordml/sdtformatlock" xmlns:w16se="http://schemas.microsoft.com/office/word/2015/wordml/symex" xmlns:wpg="http://schemas.microsoft.com/office/word/2010/wordprocessingGroup" xmlns:wpi="http://schemas.microsoft.com/office/word/2010/wordprocessingInk" xmlns:wne="http://schemas.microsoft.com/office/word/2006/wordml" xmlns:wps="http://schemas.microsoft.com/office/word/2010/wordprocessingShape" mc:Ignorable="w14 w15 w16se w16cid w16 w16cex w16sdtdh w16sdtfl w16du wp14">
   <w:endnote w:type="separator" w:id="-1">
     <w:p>
       <w:pPr>
@@ -9880,7 +9533,7 @@
 </file>
 
 <file path=word/footer1.xml><?xml version="1.0" encoding="utf-8"?>
-<w:ftr xmlns:wpc="http://schemas.microsoft.com/office/word/2010/wordprocessingCanvas" xmlns:cx="http://schemas.microsoft.com/office/drawing/2014/chartex" xmlns:cx1="http://schemas.microsoft.com/office/drawing/2015/9/8/chartex" xmlns:cx2="http://schemas.microsoft.com/office/drawing/2015/10/21/chartex" xmlns:cx3="http://schemas.microsoft.com/office/drawing/2016/5/9/chartex" xmlns:cx4="http://schemas.microsoft.com/office/drawing/2016/5/10/chartex" xmlns:cx5="http://schemas.microsoft.com/office/drawing/2016/5/11/chartex" xmlns:cx6="http://schemas.microsoft.com/office/drawing/2016/5/12/chartex" xmlns:cx7="http://schemas.microsoft.com/office/drawing/2016/5/13/chartex" xmlns:cx8="http://schemas.microsoft.com/office/drawing/2016/5/14/chartex" xmlns:mc="http://schemas.openxmlformats.org/markup-compatibility/2006" xmlns:aink="http://schemas.microsoft.com/office/drawing/2016/ink" xmlns:am3d="http://schemas.microsoft.com/office/drawing/2017/model3d" xmlns:o="urn:schemas-microsoft-com:office:office" xmlns:r="http://schemas.openxmlformats.org/officeDocument/2006/relationships" xmlns:m="http://schemas.openxmlformats.org/officeDocument/2006/math" xmlns:v="urn:schemas-microsoft-com:vml" xmlns:wp14="http://schemas.microsoft.com/office/word/2010/wordprocessingDrawing" xmlns:wp="http://schemas.openxmlformats.org/drawingml/2006/wordprocessingDrawing" xmlns:w10="urn:schemas-microsoft-com:office:word" xmlns:w="http://schemas.openxmlformats.org/wordprocessingml/2006/main" xmlns:w14="http://schemas.microsoft.com/office/word/2010/wordml" xmlns:w15="http://schemas.microsoft.com/office/word/2012/wordml" xmlns:w16cex="http://schemas.microsoft.com/office/word/2018/wordml/cex" xmlns:w16cid="http://schemas.microsoft.com/office/word/2016/wordml/cid" xmlns:w16="http://schemas.microsoft.com/office/word/2018/wordml" xmlns:w16sdtdh="http://schemas.microsoft.com/office/word/2020/wordml/sdtdatahash" xmlns:w16se="http://schemas.microsoft.com/office/word/2015/wordml/symex" xmlns:wpg="http://schemas.microsoft.com/office/word/2010/wordprocessingGroup" xmlns:wpi="http://schemas.microsoft.com/office/word/2010/wordprocessingInk" xmlns:wne="http://schemas.microsoft.com/office/word/2006/wordml" xmlns:wps="http://schemas.microsoft.com/office/word/2010/wordprocessingShape" mc:Ignorable="w14 w15 w16se w16cid w16 w16cex w16sdtdh wp14">
+<w:ftr xmlns:wpc="http://schemas.microsoft.com/office/word/2010/wordprocessingCanvas" xmlns:cx="http://schemas.microsoft.com/office/drawing/2014/chartex" xmlns:cx1="http://schemas.microsoft.com/office/drawing/2015/9/8/chartex" xmlns:cx2="http://schemas.microsoft.com/office/drawing/2015/10/21/chartex" xmlns:cx3="http://schemas.microsoft.com/office/drawing/2016/5/9/chartex" xmlns:cx4="http://schemas.microsoft.com/office/drawing/2016/5/10/chartex" xmlns:cx5="http://schemas.microsoft.com/office/drawing/2016/5/11/chartex" xmlns:cx6="http://schemas.microsoft.com/office/drawing/2016/5/12/chartex" xmlns:cx7="http://schemas.microsoft.com/office/drawing/2016/5/13/chartex" xmlns:cx8="http://schemas.microsoft.com/office/drawing/2016/5/14/chartex" xmlns:mc="http://schemas.openxmlformats.org/markup-compatibility/2006" xmlns:aink="http://schemas.microsoft.com/office/drawing/2016/ink" xmlns:am3d="http://schemas.microsoft.com/office/drawing/2017/model3d" xmlns:o="urn:schemas-microsoft-com:office:office" xmlns:oel="http://schemas.microsoft.com/office/2019/extlst" xmlns:r="http://schemas.openxmlformats.org/officeDocument/2006/relationships" xmlns:m="http://schemas.openxmlformats.org/officeDocument/2006/math" xmlns:v="urn:schemas-microsoft-com:vml" xmlns:wp14="http://schemas.microsoft.com/office/word/2010/wordprocessingDrawing" xmlns:wp="http://schemas.openxmlformats.org/drawingml/2006/wordprocessingDrawing" xmlns:w10="urn:schemas-microsoft-com:office:word" xmlns:w="http://schemas.openxmlformats.org/wordprocessingml/2006/main" xmlns:w14="http://schemas.microsoft.com/office/word/2010/wordml" xmlns:w15="http://schemas.microsoft.com/office/word/2012/wordml" xmlns:w16cex="http://schemas.microsoft.com/office/word/2018/wordml/cex" xmlns:w16cid="http://schemas.microsoft.com/office/word/2016/wordml/cid" xmlns:w16="http://schemas.microsoft.com/office/word/2018/wordml" xmlns:w16du="http://schemas.microsoft.com/office/word/2023/wordml/word16du" xmlns:w16sdtdh="http://schemas.microsoft.com/office/word/2020/wordml/sdtdatahash" xmlns:w16sdtfl="http://schemas.microsoft.com/office/word/2024/wordml/sdtformatlock" xmlns:w16se="http://schemas.microsoft.com/office/word/2015/wordml/symex" xmlns:wpg="http://schemas.microsoft.com/office/word/2010/wordprocessingGroup" xmlns:wpi="http://schemas.microsoft.com/office/word/2010/wordprocessingInk" xmlns:wne="http://schemas.microsoft.com/office/word/2006/wordml" xmlns:wps="http://schemas.microsoft.com/office/word/2010/wordprocessingShape" mc:Ignorable="w14 w15 w16se w16cid w16 w16cex w16sdtdh w16sdtfl w16du wp14">
   <w:sdt>
     <w:sdtPr>
       <w:id w:val="-1465197936"/>
@@ -9889,7 +9542,6 @@
         <w:docPartUnique/>
       </w:docPartObj>
     </w:sdtPr>
-    <w:sdtEndPr/>
     <w:sdtContent>
       <w:p>
         <w:pPr>
@@ -9926,7 +9578,7 @@
 </file>
 
 <file path=word/footnotes.xml><?xml version="1.0" encoding="utf-8"?>
-<w:footnotes xmlns:wpc="http://schemas.microsoft.com/office/word/2010/wordprocessingCanvas" xmlns:cx="http://schemas.microsoft.com/office/drawing/2014/chartex" xmlns:cx1="http://schemas.microsoft.com/office/drawing/2015/9/8/chartex" xmlns:cx2="http://schemas.microsoft.com/office/drawing/2015/10/21/chartex" xmlns:cx3="http://schemas.microsoft.com/office/drawing/2016/5/9/chartex" xmlns:cx4="http://schemas.microsoft.com/office/drawing/2016/5/10/chartex" xmlns:cx5="http://schemas.microsoft.com/office/drawing/2016/5/11/chartex" xmlns:cx6="http://schemas.microsoft.com/office/drawing/2016/5/12/chartex" xmlns:cx7="http://schemas.microsoft.com/office/drawing/2016/5/13/chartex" xmlns:cx8="http://schemas.microsoft.com/office/drawing/2016/5/14/chartex" xmlns:mc="http://schemas.openxmlformats.org/markup-compatibility/2006" xmlns:aink="http://schemas.microsoft.com/office/drawing/2016/ink" xmlns:am3d="http://schemas.microsoft.com/office/drawing/2017/model3d" xmlns:o="urn:schemas-microsoft-com:office:office" xmlns:r="http://schemas.openxmlformats.org/officeDocument/2006/relationships" xmlns:m="http://schemas.openxmlformats.org/officeDocument/2006/math" xmlns:v="urn:schemas-microsoft-com:vml" xmlns:wp14="http://schemas.microsoft.com/office/word/2010/wordprocessingDrawing" xmlns:wp="http://schemas.openxmlformats.org/drawingml/2006/wordprocessingDrawing" xmlns:w10="urn:schemas-microsoft-com:office:word" xmlns:w="http://schemas.openxmlformats.org/wordprocessingml/2006/main" xmlns:w14="http://schemas.microsoft.com/office/word/2010/wordml" xmlns:w15="http://schemas.microsoft.com/office/word/2012/wordml" xmlns:w16cex="http://schemas.microsoft.com/office/word/2018/wordml/cex" xmlns:w16cid="http://schemas.microsoft.com/office/word/2016/wordml/cid" xmlns:w16="http://schemas.microsoft.com/office/word/2018/wordml" xmlns:w16sdtdh="http://schemas.microsoft.com/office/word/2020/wordml/sdtdatahash" xmlns:w16se="http://schemas.microsoft.com/office/word/2015/wordml/symex" xmlns:wpg="http://schemas.microsoft.com/office/word/2010/wordprocessingGroup" xmlns:wpi="http://schemas.microsoft.com/office/word/2010/wordprocessingInk" xmlns:wne="http://schemas.microsoft.com/office/word/2006/wordml" xmlns:wps="http://schemas.microsoft.com/office/word/2010/wordprocessingShape" mc:Ignorable="w14 w15 w16se w16cid w16 w16cex w16sdtdh wp14">
+<w:footnotes xmlns:wpc="http://schemas.microsoft.com/office/word/2010/wordprocessingCanvas" xmlns:cx="http://schemas.microsoft.com/office/drawing/2014/chartex" xmlns:cx1="http://schemas.microsoft.com/office/drawing/2015/9/8/chartex" xmlns:cx2="http://schemas.microsoft.com/office/drawing/2015/10/21/chartex" xmlns:cx3="http://schemas.microsoft.com/office/drawing/2016/5/9/chartex" xmlns:cx4="http://schemas.microsoft.com/office/drawing/2016/5/10/chartex" xmlns:cx5="http://schemas.microsoft.com/office/drawing/2016/5/11/chartex" xmlns:cx6="http://schemas.microsoft.com/office/drawing/2016/5/12/chartex" xmlns:cx7="http://schemas.microsoft.com/office/drawing/2016/5/13/chartex" xmlns:cx8="http://schemas.microsoft.com/office/drawing/2016/5/14/chartex" xmlns:mc="http://schemas.openxmlformats.org/markup-compatibility/2006" xmlns:aink="http://schemas.microsoft.com/office/drawing/2016/ink" xmlns:am3d="http://schemas.microsoft.com/office/drawing/2017/model3d" xmlns:o="urn:schemas-microsoft-com:office:office" xmlns:oel="http://schemas.microsoft.com/office/2019/extlst" xmlns:r="http://schemas.openxmlformats.org/officeDocument/2006/relationships" xmlns:m="http://schemas.openxmlformats.org/officeDocument/2006/math" xmlns:v="urn:schemas-microsoft-com:vml" xmlns:wp14="http://schemas.microsoft.com/office/word/2010/wordprocessingDrawing" xmlns:wp="http://schemas.openxmlformats.org/drawingml/2006/wordprocessingDrawing" xmlns:w10="urn:schemas-microsoft-com:office:word" xmlns:w="http://schemas.openxmlformats.org/wordprocessingml/2006/main" xmlns:w14="http://schemas.microsoft.com/office/word/2010/wordml" xmlns:w15="http://schemas.microsoft.com/office/word/2012/wordml" xmlns:w16cex="http://schemas.microsoft.com/office/word/2018/wordml/cex" xmlns:w16cid="http://schemas.microsoft.com/office/word/2016/wordml/cid" xmlns:w16="http://schemas.microsoft.com/office/word/2018/wordml" xmlns:w16du="http://schemas.microsoft.com/office/word/2023/wordml/word16du" xmlns:w16sdtdh="http://schemas.microsoft.com/office/word/2020/wordml/sdtdatahash" xmlns:w16sdtfl="http://schemas.microsoft.com/office/word/2024/wordml/sdtformatlock" xmlns:w16se="http://schemas.microsoft.com/office/word/2015/wordml/symex" xmlns:wpg="http://schemas.microsoft.com/office/word/2010/wordprocessingGroup" xmlns:wpi="http://schemas.microsoft.com/office/word/2010/wordprocessingInk" xmlns:wne="http://schemas.microsoft.com/office/word/2006/wordml" xmlns:wps="http://schemas.microsoft.com/office/word/2010/wordprocessingShape" mc:Ignorable="w14 w15 w16se w16cid w16 w16cex w16sdtdh w16sdtfl w16du wp14">
   <w:footnote w:type="separator" w:id="-1">
     <w:p>
       <w:pPr>
@@ -9951,7 +9603,7 @@
 </file>
 
 <file path=word/header1.xml><?xml version="1.0" encoding="utf-8"?>
-<w:hdr xmlns:wpc="http://schemas.microsoft.com/office/word/2010/wordprocessingCanvas" xmlns:cx="http://schemas.microsoft.com/office/drawing/2014/chartex" xmlns:cx1="http://schemas.microsoft.com/office/drawing/2015/9/8/chartex" xmlns:cx2="http://schemas.microsoft.com/office/drawing/2015/10/21/chartex" xmlns:cx3="http://schemas.microsoft.com/office/drawing/2016/5/9/chartex" xmlns:cx4="http://schemas.microsoft.com/office/drawing/2016/5/10/chartex" xmlns:cx5="http://schemas.microsoft.com/office/drawing/2016/5/11/chartex" xmlns:cx6="http://schemas.microsoft.com/office/drawing/2016/5/12/chartex" xmlns:cx7="http://schemas.microsoft.com/office/drawing/2016/5/13/chartex" xmlns:cx8="http://schemas.microsoft.com/office/drawing/2016/5/14/chartex" xmlns:mc="http://schemas.openxmlformats.org/markup-compatibility/2006" xmlns:aink="http://schemas.microsoft.com/office/drawing/2016/ink" xmlns:am3d="http://schemas.microsoft.com/office/drawing/2017/model3d" xmlns:o="urn:schemas-microsoft-com:office:office" xmlns:r="http://schemas.openxmlformats.org/officeDocument/2006/relationships" xmlns:m="http://schemas.openxmlformats.org/officeDocument/2006/math" xmlns:v="urn:schemas-microsoft-com:vml" xmlns:wp14="http://schemas.microsoft.com/office/word/2010/wordprocessingDrawing" xmlns:wp="http://schemas.openxmlformats.org/drawingml/2006/wordprocessingDrawing" xmlns:w10="urn:schemas-microsoft-com:office:word" xmlns:w="http://schemas.openxmlformats.org/wordprocessingml/2006/main" xmlns:w14="http://schemas.microsoft.com/office/word/2010/wordml" xmlns:w15="http://schemas.microsoft.com/office/word/2012/wordml" xmlns:w16cex="http://schemas.microsoft.com/office/word/2018/wordml/cex" xmlns:w16cid="http://schemas.microsoft.com/office/word/2016/wordml/cid" xmlns:w16="http://schemas.microsoft.com/office/word/2018/wordml" xmlns:w16sdtdh="http://schemas.microsoft.com/office/word/2020/wordml/sdtdatahash" xmlns:w16se="http://schemas.microsoft.com/office/word/2015/wordml/symex" xmlns:wpg="http://schemas.microsoft.com/office/word/2010/wordprocessingGroup" xmlns:wpi="http://schemas.microsoft.com/office/word/2010/wordprocessingInk" xmlns:wne="http://schemas.microsoft.com/office/word/2006/wordml" xmlns:wps="http://schemas.microsoft.com/office/word/2010/wordprocessingShape" mc:Ignorable="w14 w15 w16se w16cid w16 w16cex w16sdtdh wp14">
+<w:hdr xmlns:wpc="http://schemas.microsoft.com/office/word/2010/wordprocessingCanvas" xmlns:cx="http://schemas.microsoft.com/office/drawing/2014/chartex" xmlns:cx1="http://schemas.microsoft.com/office/drawing/2015/9/8/chartex" xmlns:cx2="http://schemas.microsoft.com/office/drawing/2015/10/21/chartex" xmlns:cx3="http://schemas.microsoft.com/office/drawing/2016/5/9/chartex" xmlns:cx4="http://schemas.microsoft.com/office/drawing/2016/5/10/chartex" xmlns:cx5="http://schemas.microsoft.com/office/drawing/2016/5/11/chartex" xmlns:cx6="http://schemas.microsoft.com/office/drawing/2016/5/12/chartex" xmlns:cx7="http://schemas.microsoft.com/office/drawing/2016/5/13/chartex" xmlns:cx8="http://schemas.microsoft.com/office/drawing/2016/5/14/chartex" xmlns:mc="http://schemas.openxmlformats.org/markup-compatibility/2006" xmlns:aink="http://schemas.microsoft.com/office/drawing/2016/ink" xmlns:am3d="http://schemas.microsoft.com/office/drawing/2017/model3d" xmlns:o="urn:schemas-microsoft-com:office:office" xmlns:oel="http://schemas.microsoft.com/office/2019/extlst" xmlns:r="http://schemas.openxmlformats.org/officeDocument/2006/relationships" xmlns:m="http://schemas.openxmlformats.org/officeDocument/2006/math" xmlns:v="urn:schemas-microsoft-com:vml" xmlns:wp14="http://schemas.microsoft.com/office/word/2010/wordprocessingDrawing" xmlns:wp="http://schemas.openxmlformats.org/drawingml/2006/wordprocessingDrawing" xmlns:w10="urn:schemas-microsoft-com:office:word" xmlns:w="http://schemas.openxmlformats.org/wordprocessingml/2006/main" xmlns:w14="http://schemas.microsoft.com/office/word/2010/wordml" xmlns:w15="http://schemas.microsoft.com/office/word/2012/wordml" xmlns:w16cex="http://schemas.microsoft.com/office/word/2018/wordml/cex" xmlns:w16cid="http://schemas.microsoft.com/office/word/2016/wordml/cid" xmlns:w16="http://schemas.microsoft.com/office/word/2018/wordml" xmlns:w16du="http://schemas.microsoft.com/office/word/2023/wordml/word16du" xmlns:w16sdtdh="http://schemas.microsoft.com/office/word/2020/wordml/sdtdatahash" xmlns:w16sdtfl="http://schemas.microsoft.com/office/word/2024/wordml/sdtformatlock" xmlns:w16se="http://schemas.microsoft.com/office/word/2015/wordml/symex" xmlns:wpg="http://schemas.microsoft.com/office/word/2010/wordprocessingGroup" xmlns:wpi="http://schemas.microsoft.com/office/word/2010/wordprocessingInk" xmlns:wne="http://schemas.microsoft.com/office/word/2006/wordml" xmlns:wps="http://schemas.microsoft.com/office/word/2010/wordprocessingShape" mc:Ignorable="w14 w15 w16se w16cid w16 w16cex w16sdtdh w16sdtfl w16du wp14">
   <w:p>
     <w:pPr>
       <w:pStyle w:val="Encabezado"/>
@@ -10037,7 +9689,7 @@
 </file>
 
 <file path=word/numbering.xml><?xml version="1.0" encoding="utf-8"?>
-<w:numbering xmlns:wpc="http://schemas.microsoft.com/office/word/2010/wordprocessingCanvas" xmlns:cx="http://schemas.microsoft.com/office/drawing/2014/chartex" xmlns:cx1="http://schemas.microsoft.com/office/drawing/2015/9/8/chartex" xmlns:cx2="http://schemas.microsoft.com/office/drawing/2015/10/21/chartex" xmlns:cx3="http://schemas.microsoft.com/office/drawing/2016/5/9/chartex" xmlns:cx4="http://schemas.microsoft.com/office/drawing/2016/5/10/chartex" xmlns:cx5="http://schemas.microsoft.com/office/drawing/2016/5/11/chartex" xmlns:cx6="http://schemas.microsoft.com/office/drawing/2016/5/12/chartex" xmlns:cx7="http://schemas.microsoft.com/office/drawing/2016/5/13/chartex" xmlns:cx8="http://schemas.microsoft.com/office/drawing/2016/5/14/chartex" xmlns:mc="http://schemas.openxmlformats.org/markup-compatibility/2006" xmlns:aink="http://schemas.microsoft.com/office/drawing/2016/ink" xmlns:am3d="http://schemas.microsoft.com/office/drawing/2017/model3d" xmlns:o="urn:schemas-microsoft-com:office:office" xmlns:r="http://schemas.openxmlformats.org/officeDocument/2006/relationships" xmlns:m="http://schemas.openxmlformats.org/officeDocument/2006/math" xmlns:v="urn:schemas-microsoft-com:vml" xmlns:wp14="http://schemas.microsoft.com/office/word/2010/wordprocessingDrawing" xmlns:wp="http://schemas.openxmlformats.org/drawingml/2006/wordprocessingDrawing" xmlns:w10="urn:schemas-microsoft-com:office:word" xmlns:w="http://schemas.openxmlformats.org/wordprocessingml/2006/main" xmlns:w14="http://schemas.microsoft.com/office/word/2010/wordml" xmlns:w15="http://schemas.microsoft.com/office/word/2012/wordml" xmlns:w16cex="http://schemas.microsoft.com/office/word/2018/wordml/cex" xmlns:w16cid="http://schemas.microsoft.com/office/word/2016/wordml/cid" xmlns:w16="http://schemas.microsoft.com/office/word/2018/wordml" xmlns:w16sdtdh="http://schemas.microsoft.com/office/word/2020/wordml/sdtdatahash" xmlns:w16se="http://schemas.microsoft.com/office/word/2015/wordml/symex" xmlns:wpg="http://schemas.microsoft.com/office/word/2010/wordprocessingGroup" xmlns:wpi="http://schemas.microsoft.com/office/word/2010/wordprocessingInk" xmlns:wne="http://schemas.microsoft.com/office/word/2006/wordml" xmlns:wps="http://schemas.microsoft.com/office/word/2010/wordprocessingShape" mc:Ignorable="w14 w15 w16se w16cid w16 w16cex w16sdtdh wp14">
+<w:numbering xmlns:wpc="http://schemas.microsoft.com/office/word/2010/wordprocessingCanvas" xmlns:cx="http://schemas.microsoft.com/office/drawing/2014/chartex" xmlns:cx1="http://schemas.microsoft.com/office/drawing/2015/9/8/chartex" xmlns:cx2="http://schemas.microsoft.com/office/drawing/2015/10/21/chartex" xmlns:cx3="http://schemas.microsoft.com/office/drawing/2016/5/9/chartex" xmlns:cx4="http://schemas.microsoft.com/office/drawing/2016/5/10/chartex" xmlns:cx5="http://schemas.microsoft.com/office/drawing/2016/5/11/chartex" xmlns:cx6="http://schemas.microsoft.com/office/drawing/2016/5/12/chartex" xmlns:cx7="http://schemas.microsoft.com/office/drawing/2016/5/13/chartex" xmlns:cx8="http://schemas.microsoft.com/office/drawing/2016/5/14/chartex" xmlns:mc="http://schemas.openxmlformats.org/markup-compatibility/2006" xmlns:aink="http://schemas.microsoft.com/office/drawing/2016/ink" xmlns:am3d="http://schemas.microsoft.com/office/drawing/2017/model3d" xmlns:o="urn:schemas-microsoft-com:office:office" xmlns:oel="http://schemas.microsoft.com/office/2019/extlst" xmlns:r="http://schemas.openxmlformats.org/officeDocument/2006/relationships" xmlns:m="http://schemas.openxmlformats.org/officeDocument/2006/math" xmlns:v="urn:schemas-microsoft-com:vml" xmlns:wp14="http://schemas.microsoft.com/office/word/2010/wordprocessingDrawing" xmlns:wp="http://schemas.openxmlformats.org/drawingml/2006/wordprocessingDrawing" xmlns:w10="urn:schemas-microsoft-com:office:word" xmlns:w="http://schemas.openxmlformats.org/wordprocessingml/2006/main" xmlns:w14="http://schemas.microsoft.com/office/word/2010/wordml" xmlns:w15="http://schemas.microsoft.com/office/word/2012/wordml" xmlns:w16cex="http://schemas.microsoft.com/office/word/2018/wordml/cex" xmlns:w16cid="http://schemas.microsoft.com/office/word/2016/wordml/cid" xmlns:w16="http://schemas.microsoft.com/office/word/2018/wordml" xmlns:w16du="http://schemas.microsoft.com/office/word/2023/wordml/word16du" xmlns:w16sdtdh="http://schemas.microsoft.com/office/word/2020/wordml/sdtdatahash" xmlns:w16sdtfl="http://schemas.microsoft.com/office/word/2024/wordml/sdtformatlock" xmlns:w16se="http://schemas.microsoft.com/office/word/2015/wordml/symex" xmlns:wpg="http://schemas.microsoft.com/office/word/2010/wordprocessingGroup" xmlns:wpi="http://schemas.microsoft.com/office/word/2010/wordprocessingInk" xmlns:wne="http://schemas.microsoft.com/office/word/2006/wordml" xmlns:wps="http://schemas.microsoft.com/office/word/2010/wordprocessingShape" mc:Ignorable="w14 w15 w16se w16cid w16 w16cex w16sdtdh w16sdtfl w16du wp14">
   <w:abstractNum w:abstractNumId="0" w15:restartNumberingAfterBreak="0">
     <w:nsid w:val="FFFFFF89"/>
     <w:multiLevelType w:val="singleLevel"/>
@@ -10966,8 +10618,8 @@
   <w:abstractNum w:abstractNumId="9" w15:restartNumberingAfterBreak="0">
     <w:nsid w:val="27412B07"/>
     <w:multiLevelType w:val="hybridMultilevel"/>
-    <w:tmpl w:val="287EE6B2"/>
-    <w:lvl w:ilvl="0" w:tplc="C0C851BE">
+    <w:tmpl w:val="4FBC53A0"/>
+    <w:lvl w:ilvl="0" w:tplc="7A742522">
       <w:start w:val="1"/>
       <w:numFmt w:val="decimal"/>
       <w:pStyle w:val="Figura"/>
@@ -11488,6 +11140,119 @@
     </w:lvl>
   </w:abstractNum>
   <w:abstractNum w:abstractNumId="14" w15:restartNumberingAfterBreak="0">
+    <w:nsid w:val="38E2624F"/>
+    <w:multiLevelType w:val="hybridMultilevel"/>
+    <w:tmpl w:val="9C5AC8A2"/>
+    <w:lvl w:ilvl="0" w:tplc="240A0001">
+      <w:start w:val="1"/>
+      <w:numFmt w:val="bullet"/>
+      <w:lvlText w:val=""/>
+      <w:lvlJc w:val="left"/>
+      <w:pPr>
+        <w:ind w:left="1429" w:hanging="360"/>
+      </w:pPr>
+      <w:rPr>
+        <w:rFonts w:ascii="Symbol" w:hAnsi="Symbol" w:hint="default"/>
+      </w:rPr>
+    </w:lvl>
+    <w:lvl w:ilvl="1" w:tplc="240A0003" w:tentative="1">
+      <w:start w:val="1"/>
+      <w:numFmt w:val="bullet"/>
+      <w:lvlText w:val="o"/>
+      <w:lvlJc w:val="left"/>
+      <w:pPr>
+        <w:ind w:left="2149" w:hanging="360"/>
+      </w:pPr>
+      <w:rPr>
+        <w:rFonts w:ascii="Courier New" w:hAnsi="Courier New" w:cs="Courier New" w:hint="default"/>
+      </w:rPr>
+    </w:lvl>
+    <w:lvl w:ilvl="2" w:tplc="240A0005" w:tentative="1">
+      <w:start w:val="1"/>
+      <w:numFmt w:val="bullet"/>
+      <w:lvlText w:val=""/>
+      <w:lvlJc w:val="left"/>
+      <w:pPr>
+        <w:ind w:left="2869" w:hanging="360"/>
+      </w:pPr>
+      <w:rPr>
+        <w:rFonts w:ascii="Wingdings" w:hAnsi="Wingdings" w:hint="default"/>
+      </w:rPr>
+    </w:lvl>
+    <w:lvl w:ilvl="3" w:tplc="240A0001" w:tentative="1">
+      <w:start w:val="1"/>
+      <w:numFmt w:val="bullet"/>
+      <w:lvlText w:val=""/>
+      <w:lvlJc w:val="left"/>
+      <w:pPr>
+        <w:ind w:left="3589" w:hanging="360"/>
+      </w:pPr>
+      <w:rPr>
+        <w:rFonts w:ascii="Symbol" w:hAnsi="Symbol" w:hint="default"/>
+      </w:rPr>
+    </w:lvl>
+    <w:lvl w:ilvl="4" w:tplc="240A0003" w:tentative="1">
+      <w:start w:val="1"/>
+      <w:numFmt w:val="bullet"/>
+      <w:lvlText w:val="o"/>
+      <w:lvlJc w:val="left"/>
+      <w:pPr>
+        <w:ind w:left="4309" w:hanging="360"/>
+      </w:pPr>
+      <w:rPr>
+        <w:rFonts w:ascii="Courier New" w:hAnsi="Courier New" w:cs="Courier New" w:hint="default"/>
+      </w:rPr>
+    </w:lvl>
+    <w:lvl w:ilvl="5" w:tplc="240A0005" w:tentative="1">
+      <w:start w:val="1"/>
+      <w:numFmt w:val="bullet"/>
+      <w:lvlText w:val=""/>
+      <w:lvlJc w:val="left"/>
+      <w:pPr>
+        <w:ind w:left="5029" w:hanging="360"/>
+      </w:pPr>
+      <w:rPr>
+        <w:rFonts w:ascii="Wingdings" w:hAnsi="Wingdings" w:hint="default"/>
+      </w:rPr>
+    </w:lvl>
+    <w:lvl w:ilvl="6" w:tplc="240A0001" w:tentative="1">
+      <w:start w:val="1"/>
+      <w:numFmt w:val="bullet"/>
+      <w:lvlText w:val=""/>
+      <w:lvlJc w:val="left"/>
+      <w:pPr>
+        <w:ind w:left="5749" w:hanging="360"/>
+      </w:pPr>
+      <w:rPr>
+        <w:rFonts w:ascii="Symbol" w:hAnsi="Symbol" w:hint="default"/>
+      </w:rPr>
+    </w:lvl>
+    <w:lvl w:ilvl="7" w:tplc="240A0003" w:tentative="1">
+      <w:start w:val="1"/>
+      <w:numFmt w:val="bullet"/>
+      <w:lvlText w:val="o"/>
+      <w:lvlJc w:val="left"/>
+      <w:pPr>
+        <w:ind w:left="6469" w:hanging="360"/>
+      </w:pPr>
+      <w:rPr>
+        <w:rFonts w:ascii="Courier New" w:hAnsi="Courier New" w:cs="Courier New" w:hint="default"/>
+      </w:rPr>
+    </w:lvl>
+    <w:lvl w:ilvl="8" w:tplc="240A0005" w:tentative="1">
+      <w:start w:val="1"/>
+      <w:numFmt w:val="bullet"/>
+      <w:lvlText w:val=""/>
+      <w:lvlJc w:val="left"/>
+      <w:pPr>
+        <w:ind w:left="7189" w:hanging="360"/>
+      </w:pPr>
+      <w:rPr>
+        <w:rFonts w:ascii="Wingdings" w:hAnsi="Wingdings" w:hint="default"/>
+      </w:rPr>
+    </w:lvl>
+  </w:abstractNum>
+  <w:abstractNum w:abstractNumId="15" w15:restartNumberingAfterBreak="0">
     <w:nsid w:val="39E6646D"/>
     <w:multiLevelType w:val="hybridMultilevel"/>
     <w:tmpl w:val="CC94BF9A"/>
@@ -11600,7 +11365,7 @@
       </w:rPr>
     </w:lvl>
   </w:abstractNum>
-  <w:abstractNum w:abstractNumId="15" w15:restartNumberingAfterBreak="0">
+  <w:abstractNum w:abstractNumId="16" w15:restartNumberingAfterBreak="0">
     <w:nsid w:val="3B446EDD"/>
     <w:multiLevelType w:val="hybridMultilevel"/>
     <w:tmpl w:val="D5B03CB2"/>
@@ -11713,7 +11478,7 @@
       </w:rPr>
     </w:lvl>
   </w:abstractNum>
-  <w:abstractNum w:abstractNumId="16" w15:restartNumberingAfterBreak="0">
+  <w:abstractNum w:abstractNumId="17" w15:restartNumberingAfterBreak="0">
     <w:nsid w:val="3D930294"/>
     <w:multiLevelType w:val="hybridMultilevel"/>
     <w:tmpl w:val="43882616"/>
@@ -11826,7 +11591,7 @@
       </w:rPr>
     </w:lvl>
   </w:abstractNum>
-  <w:abstractNum w:abstractNumId="17" w15:restartNumberingAfterBreak="0">
+  <w:abstractNum w:abstractNumId="18" w15:restartNumberingAfterBreak="0">
     <w:nsid w:val="466E3243"/>
     <w:multiLevelType w:val="hybridMultilevel"/>
     <w:tmpl w:val="735885F0"/>
@@ -11939,7 +11704,7 @@
       </w:rPr>
     </w:lvl>
   </w:abstractNum>
-  <w:abstractNum w:abstractNumId="18" w15:restartNumberingAfterBreak="0">
+  <w:abstractNum w:abstractNumId="19" w15:restartNumberingAfterBreak="0">
     <w:nsid w:val="481B7FDF"/>
     <w:multiLevelType w:val="hybridMultilevel"/>
     <w:tmpl w:val="B9825766"/>
@@ -12052,7 +11817,7 @@
       </w:rPr>
     </w:lvl>
   </w:abstractNum>
-  <w:abstractNum w:abstractNumId="19" w15:restartNumberingAfterBreak="0">
+  <w:abstractNum w:abstractNumId="20" w15:restartNumberingAfterBreak="0">
     <w:nsid w:val="4A3A6998"/>
     <w:multiLevelType w:val="hybridMultilevel"/>
     <w:tmpl w:val="7E82DC3A"/>
@@ -12165,7 +11930,7 @@
       </w:rPr>
     </w:lvl>
   </w:abstractNum>
-  <w:abstractNum w:abstractNumId="20" w15:restartNumberingAfterBreak="0">
+  <w:abstractNum w:abstractNumId="21" w15:restartNumberingAfterBreak="0">
     <w:nsid w:val="4EBE1EF6"/>
     <w:multiLevelType w:val="hybridMultilevel"/>
     <w:tmpl w:val="AF3C2E24"/>
@@ -12256,7 +12021,7 @@
       </w:pPr>
     </w:lvl>
   </w:abstractNum>
-  <w:abstractNum w:abstractNumId="21" w15:restartNumberingAfterBreak="0">
+  <w:abstractNum w:abstractNumId="22" w15:restartNumberingAfterBreak="0">
     <w:nsid w:val="50AA526B"/>
     <w:multiLevelType w:val="hybridMultilevel"/>
     <w:tmpl w:val="151A079C"/>
@@ -12369,7 +12134,7 @@
       </w:rPr>
     </w:lvl>
   </w:abstractNum>
-  <w:abstractNum w:abstractNumId="22" w15:restartNumberingAfterBreak="0">
+  <w:abstractNum w:abstractNumId="23" w15:restartNumberingAfterBreak="0">
     <w:nsid w:val="52B22DE0"/>
     <w:multiLevelType w:val="hybridMultilevel"/>
     <w:tmpl w:val="8C1A3122"/>
@@ -12460,7 +12225,7 @@
       </w:pPr>
     </w:lvl>
   </w:abstractNum>
-  <w:abstractNum w:abstractNumId="23" w15:restartNumberingAfterBreak="0">
+  <w:abstractNum w:abstractNumId="24" w15:restartNumberingAfterBreak="0">
     <w:nsid w:val="5C9B6622"/>
     <w:multiLevelType w:val="hybridMultilevel"/>
     <w:tmpl w:val="DE1464A8"/>
@@ -12573,7 +12338,7 @@
       </w:rPr>
     </w:lvl>
   </w:abstractNum>
-  <w:abstractNum w:abstractNumId="24" w15:restartNumberingAfterBreak="0">
+  <w:abstractNum w:abstractNumId="25" w15:restartNumberingAfterBreak="0">
     <w:nsid w:val="62E7797C"/>
     <w:multiLevelType w:val="hybridMultilevel"/>
     <w:tmpl w:val="ACBC27D6"/>
@@ -12686,7 +12451,7 @@
       </w:rPr>
     </w:lvl>
   </w:abstractNum>
-  <w:abstractNum w:abstractNumId="25" w15:restartNumberingAfterBreak="0">
+  <w:abstractNum w:abstractNumId="26" w15:restartNumberingAfterBreak="0">
     <w:nsid w:val="650F3B38"/>
     <w:multiLevelType w:val="hybridMultilevel"/>
     <w:tmpl w:val="959AB816"/>
@@ -12799,7 +12564,7 @@
       </w:rPr>
     </w:lvl>
   </w:abstractNum>
-  <w:abstractNum w:abstractNumId="26" w15:restartNumberingAfterBreak="0">
+  <w:abstractNum w:abstractNumId="27" w15:restartNumberingAfterBreak="0">
     <w:nsid w:val="7C161D1C"/>
     <w:multiLevelType w:val="multilevel"/>
     <w:tmpl w:val="74FAF944"/>
@@ -12935,93 +12700,96 @@
       </w:pPr>
     </w:lvl>
   </w:abstractNum>
-  <w:num w:numId="1">
+  <w:num w:numId="1" w16cid:durableId="381172400">
+    <w:abstractNumId w:val="27"/>
+  </w:num>
+  <w:num w:numId="2" w16cid:durableId="534122973">
+    <w:abstractNumId w:val="0"/>
+  </w:num>
+  <w:num w:numId="3" w16cid:durableId="953250353">
+    <w:abstractNumId w:val="9"/>
+  </w:num>
+  <w:num w:numId="4" w16cid:durableId="1837459591">
+    <w:abstractNumId w:val="21"/>
+  </w:num>
+  <w:num w:numId="5" w16cid:durableId="835460579">
+    <w:abstractNumId w:val="12"/>
+  </w:num>
+  <w:num w:numId="6" w16cid:durableId="971448360">
+    <w:abstractNumId w:val="20"/>
+  </w:num>
+  <w:num w:numId="7" w16cid:durableId="416094703">
+    <w:abstractNumId w:val="11"/>
+  </w:num>
+  <w:num w:numId="8" w16cid:durableId="1877958841">
+    <w:abstractNumId w:val="19"/>
+  </w:num>
+  <w:num w:numId="9" w16cid:durableId="934896532">
+    <w:abstractNumId w:val="15"/>
+  </w:num>
+  <w:num w:numId="10" w16cid:durableId="1011419643">
+    <w:abstractNumId w:val="13"/>
+  </w:num>
+  <w:num w:numId="11" w16cid:durableId="845749941">
+    <w:abstractNumId w:val="10"/>
+  </w:num>
+  <w:num w:numId="12" w16cid:durableId="1746761640">
+    <w:abstractNumId w:val="2"/>
+  </w:num>
+  <w:num w:numId="13" w16cid:durableId="282880858">
+    <w:abstractNumId w:val="6"/>
+  </w:num>
+  <w:num w:numId="14" w16cid:durableId="674115918">
+    <w:abstractNumId w:val="1"/>
+  </w:num>
+  <w:num w:numId="15" w16cid:durableId="1597667567">
+    <w:abstractNumId w:val="24"/>
+  </w:num>
+  <w:num w:numId="16" w16cid:durableId="250241898">
+    <w:abstractNumId w:val="22"/>
+  </w:num>
+  <w:num w:numId="17" w16cid:durableId="804856511">
+    <w:abstractNumId w:val="5"/>
+  </w:num>
+  <w:num w:numId="18" w16cid:durableId="498883790">
+    <w:abstractNumId w:val="7"/>
+  </w:num>
+  <w:num w:numId="19" w16cid:durableId="137965220">
+    <w:abstractNumId w:val="8"/>
+  </w:num>
+  <w:num w:numId="20" w16cid:durableId="1731422632">
+    <w:abstractNumId w:val="18"/>
+  </w:num>
+  <w:num w:numId="21" w16cid:durableId="781074471">
+    <w:abstractNumId w:val="25"/>
+  </w:num>
+  <w:num w:numId="22" w16cid:durableId="647898218">
+    <w:abstractNumId w:val="16"/>
+  </w:num>
+  <w:num w:numId="23" w16cid:durableId="760032893">
+    <w:abstractNumId w:val="17"/>
+  </w:num>
+  <w:num w:numId="24" w16cid:durableId="1397164901">
+    <w:abstractNumId w:val="4"/>
+  </w:num>
+  <w:num w:numId="25" w16cid:durableId="537352322">
+    <w:abstractNumId w:val="23"/>
+  </w:num>
+  <w:num w:numId="26" w16cid:durableId="1839156942">
+    <w:abstractNumId w:val="3"/>
+  </w:num>
+  <w:num w:numId="27" w16cid:durableId="751506834">
     <w:abstractNumId w:val="26"/>
   </w:num>
-  <w:num w:numId="2">
-    <w:abstractNumId w:val="0"/>
-  </w:num>
-  <w:num w:numId="3">
-    <w:abstractNumId w:val="9"/>
-  </w:num>
-  <w:num w:numId="4">
-    <w:abstractNumId w:val="20"/>
-  </w:num>
-  <w:num w:numId="5">
-    <w:abstractNumId w:val="12"/>
-  </w:num>
-  <w:num w:numId="6">
-    <w:abstractNumId w:val="19"/>
-  </w:num>
-  <w:num w:numId="7">
-    <w:abstractNumId w:val="11"/>
-  </w:num>
-  <w:num w:numId="8">
-    <w:abstractNumId w:val="18"/>
-  </w:num>
-  <w:num w:numId="9">
+  <w:num w:numId="28" w16cid:durableId="2110269058">
     <w:abstractNumId w:val="14"/>
-  </w:num>
-  <w:num w:numId="10">
-    <w:abstractNumId w:val="13"/>
-  </w:num>
-  <w:num w:numId="11">
-    <w:abstractNumId w:val="10"/>
-  </w:num>
-  <w:num w:numId="12">
-    <w:abstractNumId w:val="2"/>
-  </w:num>
-  <w:num w:numId="13">
-    <w:abstractNumId w:val="6"/>
-  </w:num>
-  <w:num w:numId="14">
-    <w:abstractNumId w:val="1"/>
-  </w:num>
-  <w:num w:numId="15">
-    <w:abstractNumId w:val="23"/>
-  </w:num>
-  <w:num w:numId="16">
-    <w:abstractNumId w:val="21"/>
-  </w:num>
-  <w:num w:numId="17">
-    <w:abstractNumId w:val="5"/>
-  </w:num>
-  <w:num w:numId="18">
-    <w:abstractNumId w:val="7"/>
-  </w:num>
-  <w:num w:numId="19">
-    <w:abstractNumId w:val="8"/>
-  </w:num>
-  <w:num w:numId="20">
-    <w:abstractNumId w:val="17"/>
-  </w:num>
-  <w:num w:numId="21">
-    <w:abstractNumId w:val="24"/>
-  </w:num>
-  <w:num w:numId="22">
-    <w:abstractNumId w:val="15"/>
-  </w:num>
-  <w:num w:numId="23">
-    <w:abstractNumId w:val="16"/>
-  </w:num>
-  <w:num w:numId="24">
-    <w:abstractNumId w:val="4"/>
-  </w:num>
-  <w:num w:numId="25">
-    <w:abstractNumId w:val="22"/>
-  </w:num>
-  <w:num w:numId="26">
-    <w:abstractNumId w:val="3"/>
-  </w:num>
-  <w:num w:numId="27">
-    <w:abstractNumId w:val="25"/>
   </w:num>
   <w:numIdMacAtCleanup w:val="27"/>
 </w:numbering>
 </file>
 
 <file path=word/styles.xml><?xml version="1.0" encoding="utf-8"?>
-<w:styles xmlns:mc="http://schemas.openxmlformats.org/markup-compatibility/2006" xmlns:r="http://schemas.openxmlformats.org/officeDocument/2006/relationships" xmlns:w="http://schemas.openxmlformats.org/wordprocessingml/2006/main" xmlns:w14="http://schemas.microsoft.com/office/word/2010/wordml" xmlns:w15="http://schemas.microsoft.com/office/word/2012/wordml" xmlns:w16cex="http://schemas.microsoft.com/office/word/2018/wordml/cex" xmlns:w16cid="http://schemas.microsoft.com/office/word/2016/wordml/cid" xmlns:w16="http://schemas.microsoft.com/office/word/2018/wordml" xmlns:w16sdtdh="http://schemas.microsoft.com/office/word/2020/wordml/sdtdatahash" xmlns:w16se="http://schemas.microsoft.com/office/word/2015/wordml/symex" mc:Ignorable="w14 w15 w16se w16cid w16 w16cex w16sdtdh">
+<w:styles xmlns:mc="http://schemas.openxmlformats.org/markup-compatibility/2006" xmlns:r="http://schemas.openxmlformats.org/officeDocument/2006/relationships" xmlns:w="http://schemas.openxmlformats.org/wordprocessingml/2006/main" xmlns:w14="http://schemas.microsoft.com/office/word/2010/wordml" xmlns:w15="http://schemas.microsoft.com/office/word/2012/wordml" xmlns:w16cex="http://schemas.microsoft.com/office/word/2018/wordml/cex" xmlns:w16cid="http://schemas.microsoft.com/office/word/2016/wordml/cid" xmlns:w16="http://schemas.microsoft.com/office/word/2018/wordml" xmlns:w16du="http://schemas.microsoft.com/office/word/2023/wordml/word16du" xmlns:w16sdtdh="http://schemas.microsoft.com/office/word/2020/wordml/sdtdatahash" xmlns:w16sdtfl="http://schemas.microsoft.com/office/word/2024/wordml/sdtformatlock" xmlns:w16se="http://schemas.microsoft.com/office/word/2015/wordml/symex" mc:Ignorable="w14 w15 w16se w16cid w16 w16cex w16sdtdh w16sdtfl w16du">
   <w:docDefaults>
     <w:rPrDefault>
       <w:rPr>
@@ -13724,15 +13492,16 @@
     <w:link w:val="FiguraCar"/>
     <w:autoRedefine/>
     <w:qFormat/>
-    <w:rsid w:val="00753302"/>
+    <w:rsid w:val="007624FE"/>
     <w:pPr>
       <w:numPr>
         <w:numId w:val="3"/>
       </w:numPr>
       <w:tabs>
-        <w:tab w:val="left" w:pos="1134"/>
+        <w:tab w:val="left" w:pos="0"/>
       </w:tabs>
       <w:ind w:left="992" w:hanging="992"/>
+      <w:jc w:val="center"/>
     </w:pPr>
     <w:rPr>
       <w:rFonts w:ascii="Calibri" w:hAnsi="Calibri" w:cs="Times New Roman (Cuerpo en alfa"/>
@@ -13747,7 +13516,7 @@
     <w:name w:val="Figura Car"/>
     <w:basedOn w:val="Fuentedeprrafopredeter"/>
     <w:link w:val="Figura"/>
-    <w:rsid w:val="00753302"/>
+    <w:rsid w:val="007624FE"/>
     <w:rPr>
       <w:rFonts w:ascii="Calibri" w:hAnsi="Calibri" w:cs="Times New Roman (Cuerpo en alfa"/>
       <w:color w:val="000000" w:themeColor="text1"/>
@@ -14368,7 +14137,7 @@
       </w:rPr>
     </w:tblStylePr>
   </w:style>
-  <w:style w:type="character" w:styleId="Textoennegrita">
+  <w:style w:type="character" w:styleId="Fuerte">
     <w:name w:val="Strong"/>
     <w:basedOn w:val="Fuentedeprrafopredeter"/>
     <w:uiPriority w:val="22"/>
@@ -14751,6 +14520,17 @@
 </file>
 
 <file path=customXml/item1.xml><?xml version="1.0" encoding="utf-8"?>
+<p:properties xmlns:p="http://schemas.microsoft.com/office/2006/metadata/properties" xmlns:xsi="http://www.w3.org/2001/XMLSchema-instance" xmlns:pc="http://schemas.microsoft.com/office/infopath/2007/PartnerControls">
+  <documentManagement>
+    <TaxCatchAll xmlns="13c90a0b-73bc-4dc0-be5f-28d77b615beb" xsi:nil="true"/>
+    <lcf76f155ced4ddcb4097134ff3c332f xmlns="13c93bba-48ce-428c-bfe5-88b42c19b028">
+      <Terms xmlns="http://schemas.microsoft.com/office/infopath/2007/PartnerControls"/>
+    </lcf76f155ced4ddcb4097134ff3c332f>
+  </documentManagement>
+</p:properties>
+</file>
+
+<file path=customXml/item2.xml><?xml version="1.0" encoding="utf-8"?>
 <ct:contentTypeSchema xmlns:ct="http://schemas.microsoft.com/office/2006/metadata/contentType" xmlns:ma="http://schemas.microsoft.com/office/2006/metadata/properties/metaAttributes" ct:_="" ma:_="" ma:contentTypeName="Documento" ma:contentTypeID="0x0101006A81D6BD42E8DF4C91013959704817E1" ma:contentTypeVersion="15" ma:contentTypeDescription="Crear nuevo documento." ma:contentTypeScope="" ma:versionID="bf4f72ffd194f0963ff564daca6869f7">
   <xsd:schema xmlns:xsd="http://www.w3.org/2001/XMLSchema" xmlns:xs="http://www.w3.org/2001/XMLSchema" xmlns:p="http://schemas.microsoft.com/office/2006/metadata/properties" xmlns:ns2="13c90a0b-73bc-4dc0-be5f-28d77b615beb" xmlns:ns3="13c93bba-48ce-428c-bfe5-88b42c19b028" targetNamespace="http://schemas.microsoft.com/office/2006/metadata/properties" ma:root="true" ma:fieldsID="8718d6f4873a5b1392a45044efa78385" ns2:_="" ns3:_="">
     <xsd:import namespace="13c90a0b-73bc-4dc0-be5f-28d77b615beb"/>
@@ -14985,11 +14765,11 @@
 </ct:contentTypeSchema>
 </file>
 
-<file path=customXml/item2.xml><?xml version="1.0" encoding="utf-8"?>
+<file path=customXml/item3.xml><?xml version="1.0" encoding="utf-8"?>
 <b:Sources xmlns:b="http://schemas.openxmlformats.org/officeDocument/2006/bibliography" xmlns="http://schemas.openxmlformats.org/officeDocument/2006/bibliography" SelectedStyle="\APASixthEditionOfficeOnline.xsl" StyleName="APA" Version="6"/>
 </file>
 
-<file path=customXml/item3.xml><?xml version="1.0" encoding="utf-8"?>
+<file path=customXml/item4.xml><?xml version="1.0" encoding="utf-8"?>
 <?mso-contentType ?>
 <FormTemplates xmlns="http://schemas.microsoft.com/sharepoint/v3/contenttype/forms">
   <Display>DocumentLibraryForm</Display>
@@ -14998,22 +14778,37 @@
 </FormTemplates>
 </file>
 
-<file path=customXml/item4.xml><?xml version="1.0" encoding="utf-8"?>
-<p:properties xmlns:p="http://schemas.microsoft.com/office/2006/metadata/properties" xmlns:xsi="http://www.w3.org/2001/XMLSchema-instance" xmlns:pc="http://schemas.microsoft.com/office/infopath/2007/PartnerControls">
-  <documentManagement>
-    <TaxCatchAll xmlns="13c90a0b-73bc-4dc0-be5f-28d77b615beb" xsi:nil="true"/>
-    <lcf76f155ced4ddcb4097134ff3c332f xmlns="13c93bba-48ce-428c-bfe5-88b42c19b028">
-      <Terms xmlns="http://schemas.microsoft.com/office/infopath/2007/PartnerControls"/>
-    </lcf76f155ced4ddcb4097134ff3c332f>
-  </documentManagement>
-</p:properties>
-</file>
-
 <file path=customXml/itemProps1.xml><?xml version="1.0" encoding="utf-8"?>
-<ds:datastoreItem xmlns:ds="http://schemas.openxmlformats.org/officeDocument/2006/customXml" ds:itemID="{4E0E837A-9290-4749-88E9-A91F619B4B61}"/>
+<ds:datastoreItem xmlns:ds="http://schemas.openxmlformats.org/officeDocument/2006/customXml" ds:itemID="{1279454D-02BE-4A9C-A117-DCD1573E2608}">
+  <ds:schemaRefs>
+    <ds:schemaRef ds:uri="http://schemas.microsoft.com/office/2006/metadata/properties"/>
+    <ds:schemaRef ds:uri="http://schemas.microsoft.com/office/infopath/2007/PartnerControls"/>
+    <ds:schemaRef ds:uri="13c90a0b-73bc-4dc0-be5f-28d77b615beb"/>
+    <ds:schemaRef ds:uri="13c93bba-48ce-428c-bfe5-88b42c19b028"/>
+  </ds:schemaRefs>
+</ds:datastoreItem>
 </file>
 
 <file path=customXml/itemProps2.xml><?xml version="1.0" encoding="utf-8"?>
+<ds:datastoreItem xmlns:ds="http://schemas.openxmlformats.org/officeDocument/2006/customXml" ds:itemID="{1136B3A5-6484-4D7F-B2F4-F650B0343244}">
+  <ds:schemaRefs>
+    <ds:schemaRef ds:uri="http://schemas.microsoft.com/office/2006/metadata/contentType"/>
+    <ds:schemaRef ds:uri="http://schemas.microsoft.com/office/2006/metadata/properties/metaAttributes"/>
+    <ds:schemaRef ds:uri="http://www.w3.org/2001/XMLSchema"/>
+    <ds:schemaRef ds:uri="http://schemas.microsoft.com/office/2006/metadata/properties"/>
+    <ds:schemaRef ds:uri="13c90a0b-73bc-4dc0-be5f-28d77b615beb"/>
+    <ds:schemaRef ds:uri="13c93bba-48ce-428c-bfe5-88b42c19b028"/>
+    <ds:schemaRef ds:uri="http://schemas.microsoft.com/office/2006/documentManagement/types"/>
+    <ds:schemaRef ds:uri="http://schemas.microsoft.com/office/infopath/2007/PartnerControls"/>
+    <ds:schemaRef ds:uri="http://schemas.openxmlformats.org/package/2006/metadata/core-properties"/>
+    <ds:schemaRef ds:uri="http://purl.org/dc/elements/1.1/"/>
+    <ds:schemaRef ds:uri="http://purl.org/dc/terms/"/>
+    <ds:schemaRef ds:uri="http://schemas.microsoft.com/internal/obd"/>
+  </ds:schemaRefs>
+</ds:datastoreItem>
+</file>
+
+<file path=customXml/itemProps3.xml><?xml version="1.0" encoding="utf-8"?>
 <ds:datastoreItem xmlns:ds="http://schemas.openxmlformats.org/officeDocument/2006/customXml" ds:itemID="{EAE431FD-7059-4C09-804B-C9D69EB7B213}">
   <ds:schemaRefs>
     <ds:schemaRef ds:uri="http://schemas.openxmlformats.org/officeDocument/2006/bibliography"/>
@@ -15021,21 +14816,10 @@
 </ds:datastoreItem>
 </file>
 
-<file path=customXml/itemProps3.xml><?xml version="1.0" encoding="utf-8"?>
+<file path=customXml/itemProps4.xml><?xml version="1.0" encoding="utf-8"?>
 <ds:datastoreItem xmlns:ds="http://schemas.openxmlformats.org/officeDocument/2006/customXml" ds:itemID="{10663269-2064-4804-8290-36D4A57F5557}">
   <ds:schemaRefs>
     <ds:schemaRef ds:uri="http://schemas.microsoft.com/sharepoint/v3/contenttype/forms"/>
   </ds:schemaRefs>
 </ds:datastoreItem>
-</file>
-
-<file path=customXml/itemProps4.xml><?xml version="1.0" encoding="utf-8"?>
-<ds:datastoreItem xmlns:ds="http://schemas.openxmlformats.org/officeDocument/2006/customXml" ds:itemID="{1279454D-02BE-4A9C-A117-DCD1573E2608}">
-  <ds:schemaRefs>
-    <ds:schemaRef ds:uri="http://schemas.microsoft.com/office/2006/metadata/properties"/>
-    <ds:schemaRef ds:uri="http://schemas.microsoft.com/office/infopath/2007/PartnerControls"/>
-    <ds:schemaRef ds:uri="cb45339b-ced9-4d0d-8f64-77573914d53b"/>
-    <ds:schemaRef ds:uri="43a3ca16-9c26-4813-b83f-4aec9927b43f"/>
-  </ds:schemaRefs>
-</ds:datastoreItem>
 </file>
</xml_diff>

<commit_message>
CFA ajustado - repositorio
</commit_message>
<xml_diff>
--- a/fuentes/12310040_CF1_DU.docx
+++ b/fuentes/12310040_CF1_DU.docx
@@ -228,13 +228,13 @@
               </wp:anchor>
             </w:drawing>
           </mc:Choice>
-          <mc:Fallback>
+          <mc:Fallback xmlns:asvg="http://schemas.microsoft.com/office/drawing/2016/SVG/main" xmlns:a14="http://schemas.microsoft.com/office/drawing/2010/main" xmlns:pic="http://schemas.openxmlformats.org/drawingml/2006/picture" xmlns:adec="http://schemas.microsoft.com/office/drawing/2017/decorative" xmlns:a="http://schemas.openxmlformats.org/drawingml/2006/main">
             <w:pict>
-              <v:shapetype w14:anchorId="2E2DABF6" id="_x0000_t202" coordsize="21600,21600" o:spt="202" path="m,l,21600r21600,l21600,xe">
+              <v:shapetype id="_x0000_t202" coordsize="21600,21600" o:spt="202" path="m,l,21600r21600,l21600,xe" w14:anchorId="2E2DABF6">
                 <v:stroke joinstyle="miter"/>
                 <v:path gradientshapeok="t" o:connecttype="rect"/>
               </v:shapetype>
-              <v:shape id="Cuadro de texto 2" o:spid="_x0000_s1026" type="#_x0000_t202" alt="&quot;&quot;" style="position:absolute;left:0;text-align:left;margin-left:-19.2pt;margin-top:27.15pt;width:549pt;height:154.5pt;z-index:251663360;visibility:visible;mso-wrap-style:square;mso-width-percent:0;mso-height-percent:0;mso-wrap-distance-left:9pt;mso-wrap-distance-top:3.6pt;mso-wrap-distance-right:9pt;mso-wrap-distance-bottom:3.6pt;mso-position-horizontal:absolute;mso-position-horizontal-relative:text;mso-position-vertical:absolute;mso-position-vertical-relative:text;mso-width-percent:0;mso-height-percent:0;mso-width-relative:margin;mso-height-relative:margin;v-text-anchor:top" o:gfxdata="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" filled="f" stroked="f">
+              <v:shape id="Cuadro de texto 2" style="position:absolute;left:0;text-align:left;margin-left:-19.2pt;margin-top:27.15pt;width:549pt;height:154.5pt;z-index:251663360;visibility:visible;mso-wrap-style:square;mso-width-percent:0;mso-height-percent:0;mso-wrap-distance-left:9pt;mso-wrap-distance-top:3.6pt;mso-wrap-distance-right:9pt;mso-wrap-distance-bottom:3.6pt;mso-position-horizontal:absolute;mso-position-horizontal-relative:text;mso-position-vertical:absolute;mso-position-vertical-relative:text;mso-width-percent:0;mso-height-percent:0;mso-width-relative:margin;mso-height-relative:margin;v-text-anchor:top" alt="&quot;&quot;" o:spid="_x0000_s1026" filled="f" stroked="f" type="#_x0000_t202" o:gfxdata="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">
                 <v:textbox>
                   <w:txbxContent>
                     <w:p>
@@ -353,7 +353,7 @@
               </wp:anchor>
             </w:drawing>
           </mc:Choice>
-          <mc:Fallback xmlns:asvg="http://schemas.microsoft.com/office/drawing/2016/SVG/main" xmlns:a14="http://schemas.microsoft.com/office/drawing/2010/main" xmlns:pic="http://schemas.openxmlformats.org/drawingml/2006/picture" xmlns:adec="http://schemas.microsoft.com/office/drawing/2017/decorative" xmlns:a="http://schemas.openxmlformats.org/drawingml/2006/main">
+          <mc:Fallback xmlns:a="http://schemas.openxmlformats.org/drawingml/2006/main" xmlns:adec="http://schemas.microsoft.com/office/drawing/2017/decorative" xmlns:pic="http://schemas.openxmlformats.org/drawingml/2006/picture" xmlns:a14="http://schemas.microsoft.com/office/drawing/2010/main" xmlns:asvg="http://schemas.microsoft.com/office/drawing/2016/SVG/main">
             <w:pict>
               <v:rect id="Rectángulo 3" style="position:absolute;margin-left:-55.95pt;margin-top:26.4pt;width:613.85pt;height:164.25pt;z-index:-251655168;visibility:visible;mso-wrap-style:square;mso-height-percent:0;mso-wrap-distance-left:9pt;mso-wrap-distance-top:0;mso-wrap-distance-right:9pt;mso-wrap-distance-bottom:0;mso-position-horizontal:absolute;mso-position-horizontal-relative:text;mso-position-vertical:absolute;mso-position-vertical-relative:text;mso-height-percent:0;mso-height-relative:margin;v-text-anchor:middle" alt="&quot;&quot;" o:spid="_x0000_s1026" fillcolor="#00314d" stroked="f" strokeweight="1pt" w14:anchorId="44ECBD1E" o:gfxdata="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"/>
             </w:pict>
@@ -1487,7 +1487,7 @@
                 <w:noProof/>
                 <w:webHidden/>
               </w:rPr>
-              <w:t>21</w:t>
+              <w:t>22</w:t>
             </w:r>
             <w:r>
               <w:rPr>
@@ -1683,7 +1683,7 @@
                 <w:noProof/>
                 <w:webHidden/>
               </w:rPr>
-              <w:t>25</w:t>
+              <w:t>26</w:t>
             </w:r>
             <w:r>
               <w:rPr>
@@ -2601,6 +2601,13 @@
     </w:p>
     <w:p>
       <w:pPr>
+        <w:rPr>
+          <w:lang w:val="es-419" w:eastAsia="es-CO"/>
+        </w:rPr>
+      </w:pPr>
+    </w:p>
+    <w:p>
+      <w:pPr>
         <w:pStyle w:val="Ttulo2"/>
       </w:pPr>
       <w:bookmarkStart w:id="2" w:name="_Toc224715449"/>
@@ -2673,7 +2680,14 @@
         <w:rPr>
           <w:lang w:val="es-419" w:eastAsia="es-CO"/>
         </w:rPr>
-        <w:t xml:space="preserve">, el cual guía las decisiones que se toman tanto en su formulación como en su ejecución. En consecuencia, un proyecto no es una acción improvisada, sino una </w:t>
+        <w:t xml:space="preserve">, el cual guía las decisiones que se toman tanto en su formulación como en su ejecución. En </w:t>
+      </w:r>
+      <w:r>
+        <w:rPr>
+          <w:lang w:val="es-419" w:eastAsia="es-CO"/>
+        </w:rPr>
+        <w:lastRenderedPageBreak/>
+        <w:t xml:space="preserve">consecuencia, un proyecto no es una acción improvisada, sino una </w:t>
       </w:r>
       <w:r>
         <w:rPr>
@@ -2681,16 +2695,7 @@
           <w:bCs/>
           <w:lang w:val="es-419" w:eastAsia="es-CO"/>
         </w:rPr>
-        <w:t xml:space="preserve">propuesta </w:t>
-      </w:r>
-      <w:r>
-        <w:rPr>
-          <w:b/>
-          <w:bCs/>
-          <w:lang w:val="es-419" w:eastAsia="es-CO"/>
-        </w:rPr>
-        <w:lastRenderedPageBreak/>
-        <w:t>estructurada que responde a una problemática real del entorno profesional.</w:t>
+        <w:t>propuesta estructurada que responde a una problemática real del entorno profesional.</w:t>
       </w:r>
       <w:r>
         <w:rPr>
@@ -2846,6 +2851,13 @@
     </w:p>
     <w:p>
       <w:pPr>
+        <w:rPr>
+          <w:lang w:val="es-419" w:eastAsia="es-CO"/>
+        </w:rPr>
+      </w:pPr>
+    </w:p>
+    <w:p>
+      <w:pPr>
         <w:pStyle w:val="Ttulo5"/>
       </w:pPr>
       <w:r>
@@ -2927,6 +2939,15 @@
         </w:rPr>
         <w:t>Requiere planificación estructurada y análisis previo.</w:t>
       </w:r>
+    </w:p>
+    <w:p>
+      <w:pPr>
+        <w:pStyle w:val="Prrafodelista"/>
+        <w:ind w:left="567" w:firstLine="0"/>
+        <w:rPr>
+          <w:lang w:val="es-419" w:eastAsia="es-CO"/>
+        </w:rPr>
+      </w:pPr>
     </w:p>
     <w:p>
       <w:pPr>
@@ -3021,6 +3042,7 @@
         <w:rPr>
           <w:lang w:val="es-419" w:eastAsia="es-CO"/>
         </w:rPr>
+        <w:lastRenderedPageBreak/>
         <w:t>Se ejecuta bajo procedimientos ya definidos.</w:t>
       </w:r>
     </w:p>
@@ -3046,16 +3068,7 @@
           <w:bCs/>
           <w:lang w:val="es-419" w:eastAsia="es-CO"/>
         </w:rPr>
-        <w:t xml:space="preserve">un proceso estructurado que integra múltiples </w:t>
-      </w:r>
-      <w:r>
-        <w:rPr>
-          <w:b/>
-          <w:bCs/>
-          <w:lang w:val="es-419" w:eastAsia="es-CO"/>
-        </w:rPr>
-        <w:lastRenderedPageBreak/>
-        <w:t>elementos y fases</w:t>
+        <w:t>un proceso estructurado que integra múltiples elementos y fases</w:t>
       </w:r>
       <w:r>
         <w:rPr>
@@ -3127,6 +3140,13 @@
     </w:p>
     <w:p>
       <w:pPr>
+        <w:rPr>
+          <w:lang w:val="es-419" w:eastAsia="es-CO"/>
+        </w:rPr>
+      </w:pPr>
+    </w:p>
+    <w:p>
+      <w:pPr>
         <w:pStyle w:val="Ttulo3"/>
       </w:pPr>
       <w:r>
@@ -3145,13 +3165,6 @@
         </w:rPr>
         <w:t>Formular proyectos es fundamental porque permite organizar ideas de manera estructurada y orientar las acciones hacia un propósito definido. A través de este proceso, una necesidad identificada se transforma en una propuesta clara, coherente y comprensible, lo que facilita la planificación y el análisis previo a cualquier intervención. La formulación contribuye a:</w:t>
       </w:r>
-    </w:p>
-    <w:p>
-      <w:pPr>
-        <w:rPr>
-          <w:lang w:val="es-419" w:eastAsia="es-CO"/>
-        </w:rPr>
-      </w:pPr>
     </w:p>
     <w:p>
       <w:pPr>
@@ -3169,6 +3182,7 @@
         <w:rPr>
           <w:lang w:val="es-419" w:eastAsia="es-CO"/>
         </w:rPr>
+        <w:lastRenderedPageBreak/>
         <w:t>La claridad en la definición de objetivos.</w:t>
       </w:r>
     </w:p>
@@ -3226,7 +3240,6 @@
         <w:rPr>
           <w:lang w:val="es-419" w:eastAsia="es-CO"/>
         </w:rPr>
-        <w:lastRenderedPageBreak/>
         <w:t>Una comprensión integral del proceso.</w:t>
       </w:r>
     </w:p>
@@ -3363,6 +3376,13 @@
     </w:p>
     <w:p>
       <w:pPr>
+        <w:rPr>
+          <w:lang w:val="es-419" w:eastAsia="es-CO"/>
+        </w:rPr>
+      </w:pPr>
+    </w:p>
+    <w:p>
+      <w:pPr>
         <w:pStyle w:val="Ttulo5"/>
       </w:pPr>
       <w:r>
@@ -3404,6 +3424,7 @@
         <w:rPr>
           <w:lang w:val="es-419" w:eastAsia="es-CO"/>
         </w:rPr>
+        <w:lastRenderedPageBreak/>
         <w:t>Acciones planificadas y organizadas.</w:t>
       </w:r>
     </w:p>
@@ -3447,10 +3468,18 @@
     </w:p>
     <w:p>
       <w:pPr>
+        <w:pStyle w:val="Prrafodelista"/>
+        <w:ind w:left="567" w:firstLine="0"/>
+        <w:rPr>
+          <w:lang w:val="es-419" w:eastAsia="es-CO"/>
+        </w:rPr>
+      </w:pPr>
+    </w:p>
+    <w:p>
+      <w:pPr>
         <w:pStyle w:val="Ttulo5"/>
       </w:pPr>
       <w:r>
-        <w:lastRenderedPageBreak/>
         <w:t>Sin formulación de proyecto</w:t>
       </w:r>
     </w:p>
@@ -3644,6 +3673,7 @@
         <w:rPr>
           <w:lang w:val="es-419" w:eastAsia="es-CO"/>
         </w:rPr>
+        <w:lastRenderedPageBreak/>
         <w:t>Orientación hacia la solución de problemas reales.</w:t>
       </w:r>
     </w:p>
@@ -3661,7 +3691,6 @@
       </w:pPr>
       <w:bookmarkStart w:id="4" w:name="_Toc224715451"/>
       <w:r>
-        <w:lastRenderedPageBreak/>
         <w:t>Características de un proyecto</w:t>
       </w:r>
       <w:bookmarkEnd w:id="4"/>
@@ -3678,13 +3707,6 @@
         </w:rPr>
         <w:t>A continuación, se presenta un video que explica de manera clara y estructurada las principales características de los proyectos, destacando sus elementos distintivos dentro de la gestión organizacional.</w:t>
       </w:r>
-    </w:p>
-    <w:p>
-      <w:pPr>
-        <w:rPr>
-          <w:lang w:val="es-419" w:eastAsia="es-CO"/>
-        </w:rPr>
-      </w:pPr>
     </w:p>
     <w:p>
       <w:pPr>
@@ -4304,13 +4326,6 @@
           <w:lang w:val="es-419" w:eastAsia="es-CO"/>
         </w:rPr>
       </w:pPr>
-    </w:p>
-    <w:p>
-      <w:pPr>
-        <w:rPr>
-          <w:lang w:val="es-419" w:eastAsia="es-CO"/>
-        </w:rPr>
-      </w:pPr>
       <w:r>
         <w:rPr>
           <w:lang w:val="es-419" w:eastAsia="es-CO"/>
@@ -4873,6 +4888,15 @@
     </w:p>
     <w:p>
       <w:pPr>
+        <w:pStyle w:val="Prrafodelista"/>
+        <w:ind w:left="567" w:firstLine="0"/>
+        <w:rPr>
+          <w:lang w:val="es-419" w:eastAsia="es-CO"/>
+        </w:rPr>
+      </w:pPr>
+    </w:p>
+    <w:p>
+      <w:pPr>
         <w:rPr>
           <w:lang w:val="es-419" w:eastAsia="es-CO"/>
         </w:rPr>
@@ -4951,14 +4975,14 @@
         <w:rPr>
           <w:lang w:val="es-419" w:eastAsia="es-CO"/>
         </w:rPr>
-        <w:t xml:space="preserve"> sobre cómo organizar ideas y transformar una necesidad del entorno en una propuesta coherente. </w:t>
+        <w:t xml:space="preserve"> sobre cómo </w:t>
       </w:r>
       <w:r>
         <w:rPr>
           <w:lang w:val="es-419" w:eastAsia="es-CO"/>
         </w:rPr>
         <w:lastRenderedPageBreak/>
-        <w:t xml:space="preserve">Desde la formación complementaria, este proceso se consolida como una herramienta clave para fortalecer el </w:t>
+        <w:t xml:space="preserve">organizar ideas y transformar una necesidad del entorno en una propuesta coherente. Desde la formación complementaria, este proceso se consolida como una herramienta clave para fortalecer el </w:t>
       </w:r>
       <w:r>
         <w:rPr>
@@ -5109,14 +5133,6 @@
         </w:rPr>
         <w:t>A continuación, se presentan beneficios adicionales asociados a la formulación de proyectos y su impacto en el contexto formativo y profesional:</w:t>
       </w:r>
-    </w:p>
-    <w:p>
-      <w:pPr>
-        <w:ind w:left="567" w:hanging="283"/>
-        <w:rPr>
-          <w:lang w:val="es-419" w:eastAsia="es-CO"/>
-        </w:rPr>
-      </w:pPr>
     </w:p>
     <w:p>
       <w:pPr>
@@ -5246,6 +5262,28 @@
     </w:p>
     <w:p>
       <w:pPr>
+        <w:pStyle w:val="Prrafodelista"/>
+        <w:ind w:left="567" w:firstLine="0"/>
+        <w:rPr>
+          <w:lang w:val="es-419" w:eastAsia="es-CO"/>
+        </w:rPr>
+      </w:pPr>
+    </w:p>
+    <w:p>
+      <w:pPr>
+        <w:rPr>
+          <w:lang w:val="es-419" w:eastAsia="es-CO"/>
+        </w:rPr>
+      </w:pPr>
+      <w:r>
+        <w:rPr>
+          <w:lang w:val="es-419" w:eastAsia="es-CO"/>
+        </w:rPr>
+        <w:t>La formulación de proyectos no solo organiza ideas, sino que fortalece competencias clave para el desempeño profesional. Sus beneficios se reflejan en una mayor claridad, coherencia y capacidad de análisis, consolidando una base sólida para el desarrollo de propuestas pertinentes y estructuradas.</w:t>
+      </w:r>
+    </w:p>
+    <w:p>
+      <w:pPr>
         <w:rPr>
           <w:lang w:val="es-419" w:eastAsia="es-CO"/>
         </w:rPr>
@@ -5257,6 +5295,7 @@
       </w:pPr>
       <w:bookmarkStart w:id="9" w:name="_Toc224715456"/>
       <w:r>
+        <w:lastRenderedPageBreak/>
         <w:t>Requerimientos de un proyecto</w:t>
       </w:r>
       <w:bookmarkEnd w:id="9"/>
@@ -5285,7 +5324,21 @@
         <w:rPr>
           <w:lang w:val="es-419" w:eastAsia="es-CO"/>
         </w:rPr>
-        <w:t>En el contexto de la formulación de proyectos, los requerimientos permiten definir con claridad qué se espera lograr y bajo qué condiciones debe desarrollarse la propuesta.</w:t>
+        <w:t xml:space="preserve">En el contexto de la formulación de proyectos, los requerimientos permiten definir con claridad qué se espera lograr y </w:t>
+      </w:r>
+      <w:proofErr w:type="gramStart"/>
+      <w:r>
+        <w:rPr>
+          <w:lang w:val="es-419" w:eastAsia="es-CO"/>
+        </w:rPr>
+        <w:t>bajo qué condiciones</w:t>
+      </w:r>
+      <w:proofErr w:type="gramEnd"/>
+      <w:r>
+        <w:rPr>
+          <w:lang w:val="es-419" w:eastAsia="es-CO"/>
+        </w:rPr>
+        <w:t xml:space="preserve"> debe desarrollarse la propuesta.</w:t>
       </w:r>
     </w:p>
     <w:p>
@@ -5326,14 +5379,7 @@
         <w:rPr>
           <w:lang w:val="es-419" w:eastAsia="es-CO"/>
         </w:rPr>
-        <w:t xml:space="preserve">, ya que contribuyen a fortalecer la visión estructural y a consolidar una idea clara y coherente </w:t>
-      </w:r>
-      <w:r>
-        <w:rPr>
-          <w:lang w:val="es-419" w:eastAsia="es-CO"/>
-        </w:rPr>
-        <w:lastRenderedPageBreak/>
-        <w:t>antes de avanzar hacia la planificación detallada de las actividades. Su adecuada definición facilita la organización del proceso y orienta el desarrollo del proyecto hacia el cumplimiento de su propósito.</w:t>
+        <w:t>, ya que contribuyen a fortalecer la visión estructural y a consolidar una idea clara y coherente antes de avanzar hacia la planificación detallada de las actividades. Su adecuada definición facilita la organización del proceso y orienta el desarrollo del proyecto hacia el cumplimiento de su propósito.</w:t>
       </w:r>
     </w:p>
     <w:p>
@@ -5412,6 +5458,7 @@
         <w:rPr>
           <w:rStyle w:val="Ttulo5Car"/>
         </w:rPr>
+        <w:lastRenderedPageBreak/>
         <w:t>Requerimientos de los usuarios.</w:t>
       </w:r>
       <w:r>
@@ -5462,7 +5509,6 @@
         <w:rPr>
           <w:rStyle w:val="Ttulo5Car"/>
         </w:rPr>
-        <w:lastRenderedPageBreak/>
         <w:t>Requerimientos de calidad.</w:t>
       </w:r>
       <w:r>
@@ -5537,7 +5583,14 @@
         <w:rPr>
           <w:lang w:val="es-419" w:eastAsia="es-CO"/>
         </w:rPr>
-        <w:t xml:space="preserve">Los proyectos pueden adoptar diversas formas según su propósito, contexto y enfoque de desarrollo. Por esta razón, clasificarlos puede resultar complejo. No obstante, es posible agruparlos de acuerdo con su finalidad, su impacto y el sector en el que se desarrollan. Aunque varían en su naturaleza, todos comparten una </w:t>
+        <w:t xml:space="preserve">Los proyectos pueden adoptar diversas formas según su propósito, contexto y enfoque de desarrollo. Por esta razón, clasificarlos puede resultar complejo. No obstante, es posible agruparlos de acuerdo con su finalidad, su impacto y el sector en el </w:t>
+      </w:r>
+      <w:r>
+        <w:rPr>
+          <w:lang w:val="es-419" w:eastAsia="es-CO"/>
+        </w:rPr>
+        <w:lastRenderedPageBreak/>
+        <w:t xml:space="preserve">que se desarrollan. Aunque varían en su naturaleza, todos comparten una </w:t>
       </w:r>
       <w:r>
         <w:rPr>
@@ -5598,14 +5651,7 @@
         <w:rPr>
           <w:lang w:val="es-419" w:eastAsia="es-CO"/>
         </w:rPr>
-        <w:t xml:space="preserve"> para satisfacer una necesidad del mercado o de una comunidad específica. Se caracterizan por organizar recursos y actividades con el propósito de alcanzar un </w:t>
-      </w:r>
-      <w:r>
-        <w:rPr>
-          <w:lang w:val="es-419" w:eastAsia="es-CO"/>
-        </w:rPr>
-        <w:lastRenderedPageBreak/>
-        <w:t>resultado concreto que aporte valor económico o social. En la formulación, permiten establecer con claridad la relación entre necesidad, objetivos, actividades y resultados esperados.</w:t>
+        <w:t xml:space="preserve"> para satisfacer una necesidad del mercado o de una comunidad específica. Se caracterizan por organizar recursos y actividades con el propósito de alcanzar un resultado concreto que aporte valor económico o social. En la formulación, permiten establecer con claridad la relación entre necesidad, objetivos, actividades y resultados esperados.</w:t>
       </w:r>
     </w:p>
     <w:p>
@@ -5721,8 +5767,18 @@
         <w:t>generar conocimiento o analizar fenómenos específicos.</w:t>
       </w:r>
       <w:r>
-        <w:t xml:space="preserve"> Se caracterizan por la formulación de preguntas claras, objetivos definidos y una organización sistemática de actividades orientadas a la obtención y análisis de información. En la formulación, el énfasis se sitúa en la coherencia metodológica y la claridad conceptual.</w:t>
-      </w:r>
+        <w:t xml:space="preserve"> Se caracterizan por la formulación de preguntas claras, objetivos definidos y una organización sistemática de actividades orientadas a la obtención y </w:t>
+      </w:r>
+      <w:r>
+        <w:lastRenderedPageBreak/>
+        <w:t>análisis de información. En la formulación, el énfasis se sitúa en la coherencia metodológica y la claridad conceptual.</w:t>
+      </w:r>
+    </w:p>
+    <w:p>
+      <w:pPr>
+        <w:pStyle w:val="Prrafodelista"/>
+        <w:ind w:left="567" w:firstLine="0"/>
+      </w:pPr>
     </w:p>
     <w:p>
       <w:pPr>
@@ -5762,7 +5818,6 @@
         <w:rPr>
           <w:rStyle w:val="Ttulo5Car"/>
         </w:rPr>
-        <w:lastRenderedPageBreak/>
         <w:t>Proyectos comunitarios.</w:t>
       </w:r>
       <w:r>
@@ -5771,13 +5826,23 @@
         </w:rPr>
         <w:t xml:space="preserve"> Se desarrollan con la </w:t>
       </w:r>
+      <w:proofErr w:type="gramStart"/>
       <w:r>
         <w:rPr>
           <w:b/>
           <w:bCs/>
           <w:lang w:val="es-419" w:eastAsia="es-CO"/>
         </w:rPr>
-        <w:t>participación activa de una comunidad</w:t>
+        <w:t>participación activa</w:t>
+      </w:r>
+      <w:proofErr w:type="gramEnd"/>
+      <w:r>
+        <w:rPr>
+          <w:b/>
+          <w:bCs/>
+          <w:lang w:val="es-419" w:eastAsia="es-CO"/>
+        </w:rPr>
+        <w:t xml:space="preserve"> de una comunidad</w:t>
       </w:r>
       <w:r>
         <w:rPr>
@@ -5805,7 +5870,21 @@
         <w:rPr>
           <w:lang w:val="es-419" w:eastAsia="es-CO"/>
         </w:rPr>
-        <w:t>Identificar los diferentes tipos de proyectos permite comprender que, aunque los contextos y propósitos varían, todos requieren una formulación estructurada y coherente. Esta comprensión facilita la adaptación del proceso de formulación a distintos entornos profesionales, manteniendo siempre la claridad en la necesidad identificada, los objetivos planteados y los resultados esperados.</w:t>
+        <w:t xml:space="preserve">Identificar los diferentes tipos de proyectos permite comprender que, aunque los contextos y propósitos varían, todos requieren una formulación estructurada y </w:t>
+      </w:r>
+      <w:r>
+        <w:rPr>
+          <w:b/>
+          <w:bCs/>
+          <w:lang w:val="es-419" w:eastAsia="es-CO"/>
+        </w:rPr>
+        <w:t>coherente.</w:t>
+      </w:r>
+      <w:r>
+        <w:rPr>
+          <w:lang w:val="es-419" w:eastAsia="es-CO"/>
+        </w:rPr>
+        <w:t xml:space="preserve"> Esta comprensión facilita la adaptación del proceso de formulación a distintos entornos profesionales, manteniendo siempre la claridad en la necesidad identificada, los objetivos planteados y los resultados esperados.</w:t>
       </w:r>
     </w:p>
     <w:p>
@@ -5963,6 +6042,7 @@
         <w:rPr>
           <w:rStyle w:val="Ttulo5Car"/>
         </w:rPr>
+        <w:lastRenderedPageBreak/>
         <w:t>Hitos del proyecto.</w:t>
       </w:r>
       <w:r>
@@ -6000,14 +6080,7 @@
         <w:rPr>
           <w:lang w:val="es-419" w:eastAsia="es-CO"/>
         </w:rPr>
-        <w:t xml:space="preserve">Hacen referencia a la relación entre tareas o al uso compartido de recursos. Una dependencia existe cuando una actividad no puede iniciar hasta que otra haya finalizado. Comprender estas relaciones es </w:t>
-      </w:r>
-      <w:r>
-        <w:rPr>
-          <w:lang w:val="es-419" w:eastAsia="es-CO"/>
-        </w:rPr>
-        <w:lastRenderedPageBreak/>
-        <w:t>fundamental para asegurar la disponibilidad adecuada de recursos y evitar retrasos.</w:t>
+        <w:t>Hacen referencia a la relación entre tareas o al uso compartido de recursos. Una dependencia existe cuando una actividad no puede iniciar hasta que otra haya finalizado. Comprender estas relaciones es fundamental para asegurar la disponibilidad adecuada de recursos y evitar retrasos.</w:t>
       </w:r>
     </w:p>
     <w:p>
@@ -6062,6 +6135,15 @@
     </w:p>
     <w:p>
       <w:pPr>
+        <w:pStyle w:val="Prrafodelista"/>
+        <w:ind w:left="567" w:firstLine="0"/>
+        <w:rPr>
+          <w:lang w:val="es-419" w:eastAsia="es-CO"/>
+        </w:rPr>
+      </w:pPr>
+    </w:p>
+    <w:p>
+      <w:pPr>
         <w:rPr>
           <w:lang w:val="es-419" w:eastAsia="es-CO"/>
         </w:rPr>
@@ -6085,48 +6167,6 @@
         </w:rPr>
         <w:t>Desde la formación complementaria, la apropiación de este vocabulario fortalece la comprensión técnica del proceso y facilita la comunicación en contextos profesionales donde la gestión de proyectos constituye una práctica habitual.</w:t>
       </w:r>
-    </w:p>
-    <w:p>
-      <w:pPr>
-        <w:rPr>
-          <w:lang w:val="es-419" w:eastAsia="es-CO"/>
-        </w:rPr>
-      </w:pPr>
-    </w:p>
-    <w:p>
-      <w:pPr>
-        <w:rPr>
-          <w:lang w:val="es-419" w:eastAsia="es-CO"/>
-        </w:rPr>
-      </w:pPr>
-    </w:p>
-    <w:p>
-      <w:pPr>
-        <w:rPr>
-          <w:lang w:val="es-419" w:eastAsia="es-CO"/>
-        </w:rPr>
-      </w:pPr>
-    </w:p>
-    <w:p>
-      <w:pPr>
-        <w:rPr>
-          <w:lang w:val="es-419" w:eastAsia="es-CO"/>
-        </w:rPr>
-      </w:pPr>
-    </w:p>
-    <w:p>
-      <w:pPr>
-        <w:rPr>
-          <w:lang w:val="es-419" w:eastAsia="es-CO"/>
-        </w:rPr>
-      </w:pPr>
-    </w:p>
-    <w:p>
-      <w:pPr>
-        <w:rPr>
-          <w:lang w:val="es-419" w:eastAsia="es-CO"/>
-        </w:rPr>
-      </w:pPr>
     </w:p>
     <w:p>
       <w:pPr>
@@ -6457,6 +6497,14 @@
     </w:p>
     <w:p>
       <w:pPr>
+        <w:ind w:firstLine="0"/>
+        <w:rPr>
+          <w:lang w:val="es-419" w:eastAsia="es-CO"/>
+        </w:rPr>
+      </w:pPr>
+    </w:p>
+    <w:p>
+      <w:pPr>
         <w:pStyle w:val="Prrafodelista"/>
         <w:numPr>
           <w:ilvl w:val="0"/>
@@ -6527,7 +6575,14 @@
         <w:rPr>
           <w:lang w:val="es-419" w:eastAsia="es-CO"/>
         </w:rPr>
-        <w:t xml:space="preserve"> Durante la formulación, permiten organizar las actividades de manera lógica y establecer relaciones claras entre ellas. Facilitan la identificación de requerimientos básicos, como recursos y responsables, sin profundizar en niveles de detalle propios de la gestión operativa. Asimismo, integran elementos fundamentales como necesidad, objetivos, actividades y resultados esperados dentro de una estructura coherente, fortaleciendo la apropiación conceptual.</w:t>
+        <w:t xml:space="preserve"> Durante la formulación, permiten organizar las actividades de manera lógica y establecer relaciones claras entre ellas. Facilitan la identificación de requerimientos básicos, como recursos y responsables, sin profundizar en niveles de detalle propios de la gestión operativa. Asimismo, integran elementos fundamentales como necesidad, objetivos, </w:t>
+      </w:r>
+      <w:r>
+        <w:rPr>
+          <w:lang w:val="es-419" w:eastAsia="es-CO"/>
+        </w:rPr>
+        <w:lastRenderedPageBreak/>
+        <w:t>actividades y resultados esperados dentro de una estructura coherente, fortaleciendo la apropiación conceptual.</w:t>
       </w:r>
     </w:p>
     <w:p>
@@ -6546,7 +6601,6 @@
         <w:rPr>
           <w:rStyle w:val="Ttulo5Car"/>
         </w:rPr>
-        <w:lastRenderedPageBreak/>
         <w:t>Beneficios en la formación complementaria.</w:t>
       </w:r>
       <w:r>
@@ -6635,14 +6689,8 @@
         <w:rPr>
           <w:lang w:val="es-419" w:eastAsia="es-CO"/>
         </w:rPr>
-        <w:t xml:space="preserve">Comprender la metodología de formulación permite reconocer que un proyecto no surge de manera improvisada, sino que responde a un proceso estructurado que </w:t>
-      </w:r>
-      <w:r>
-        <w:rPr>
-          <w:lang w:val="es-419" w:eastAsia="es-CO"/>
-        </w:rPr>
         <w:lastRenderedPageBreak/>
-        <w:t>garantiza claridad, coherencia y pertinencia frente al entorno profesional. A continuación, se presentan las etapas que conforman la metodología para la formulación de proyectos.</w:t>
+        <w:t>Comprender la metodología de formulación permite reconocer que un proyecto no surge de manera improvisada, sino que responde a un proceso estructurado que garantiza claridad, coherencia y pertinencia frente al entorno profesional. A continuación, se presentan las etapas que conforman la metodología para la formulación de proyectos.</w:t>
       </w:r>
     </w:p>
     <w:p>
@@ -6767,7 +6815,14 @@
         <w:rPr>
           <w:lang w:val="es-419" w:eastAsia="es-CO"/>
         </w:rPr>
-        <w:t>Consiste en argumentar las razones por las cuales el proyecto debe desarrollarse. Explica su importancia y su aporte al contexto profesional, fortaleciendo la relación entre la necesidad identificada y la solución planteada.</w:t>
+        <w:t xml:space="preserve">Consiste en argumentar las razones por las cuales el proyecto debe desarrollarse. Explica su importancia y su aporte al contexto </w:t>
+      </w:r>
+      <w:r>
+        <w:rPr>
+          <w:lang w:val="es-419" w:eastAsia="es-CO"/>
+        </w:rPr>
+        <w:lastRenderedPageBreak/>
+        <w:t>profesional, fortaleciendo la relación entre la necesidad identificada y la solución planteada.</w:t>
       </w:r>
     </w:p>
     <w:p>
@@ -6786,7 +6841,6 @@
         <w:rPr>
           <w:rStyle w:val="Ttulo5Car"/>
         </w:rPr>
-        <w:lastRenderedPageBreak/>
         <w:t>Delimitación del alcance.</w:t>
       </w:r>
       <w:r>
@@ -6860,6 +6914,15 @@
     </w:p>
     <w:p>
       <w:pPr>
+        <w:pStyle w:val="Prrafodelista"/>
+        <w:ind w:left="567" w:firstLine="0"/>
+        <w:rPr>
+          <w:lang w:val="es-419" w:eastAsia="es-CO"/>
+        </w:rPr>
+      </w:pPr>
+    </w:p>
+    <w:p>
+      <w:pPr>
         <w:rPr>
           <w:lang w:val="es-419" w:eastAsia="es-CO"/>
         </w:rPr>
@@ -6892,14 +6955,6 @@
         <w:t>A continuación, se presenta un pódcast que explica la importancia de la metodología en la formulación de proyectos, destacando su aporte en la organización, coherencia y pertinencia de las propuestas dentro del contexto formativo y profesional.</w:t>
       </w:r>
     </w:p>
-    <w:p>
-      <w:pPr>
-        <w:rPr>
-          <w:lang w:val="es-419" w:eastAsia="es-CO"/>
-        </w:rPr>
-      </w:pPr>
-    </w:p>
-    <w:p/>
     <w:tbl>
       <w:tblPr>
         <w:tblStyle w:val="Tablaconcuadrcula"/>
@@ -7220,13 +7275,6 @@
           <w:lang w:val="es-419" w:eastAsia="es-CO"/>
         </w:rPr>
       </w:pPr>
-    </w:p>
-    <w:p>
-      <w:pPr>
-        <w:rPr>
-          <w:lang w:val="es-419" w:eastAsia="es-CO"/>
-        </w:rPr>
-      </w:pPr>
       <w:r>
         <w:rPr>
           <w:lang w:val="es-419" w:eastAsia="es-CO"/>
@@ -7334,14 +7382,7 @@
         <w:rPr>
           <w:lang w:val="es-419" w:eastAsia="es-CO"/>
         </w:rPr>
-        <w:t xml:space="preserve"> La desconexión entre necesidad, objetivos, actividades y resultados esperados impide comprender el </w:t>
-      </w:r>
-      <w:r>
-        <w:rPr>
-          <w:lang w:val="es-419" w:eastAsia="es-CO"/>
-        </w:rPr>
-        <w:lastRenderedPageBreak/>
-        <w:t>proyecto como un proceso articulado. Esta fragmentación afecta la claridad y dificulta la estructuración lógica.</w:t>
+        <w:t xml:space="preserve"> La desconexión entre necesidad, objetivos, actividades y resultados esperados impide comprender el proyecto como un proceso articulado. Esta fragmentación afecta la claridad y dificulta la estructuración lógica.</w:t>
       </w:r>
     </w:p>
     <w:p>
@@ -7360,6 +7401,7 @@
         <w:rPr>
           <w:rStyle w:val="Ttulo5Car"/>
         </w:rPr>
+        <w:lastRenderedPageBreak/>
         <w:t>Alcance mal definido o inexistente.</w:t>
       </w:r>
       <w:r>
@@ -7486,29 +7528,23 @@
         <w:rPr>
           <w:lang w:val="es-419" w:eastAsia="es-CO"/>
         </w:rPr>
-        <w:t xml:space="preserve">Reconocer estos errores contribuye a fortalecer la comprensión de los conceptos abordados en el componente formativo y promueve una formulación más clara, organizada y coherente. Este análisis permite al aprendiz identificar con mayor </w:t>
-      </w:r>
-      <w:r>
-        <w:rPr>
-          <w:lang w:val="es-419" w:eastAsia="es-CO"/>
-        </w:rPr>
+        <w:t>Reconocer estos errores contribuye a fortalecer la comprensión de los conceptos abordados en el componente formativo y promueve una formulación más clara, organizada y coherente. Este análisis permite al aprendiz identificar con mayor precisión los elementos y fases necesarias para estructurar un proyecto alineado con el contexto profesional.</w:t>
+      </w:r>
+    </w:p>
+    <w:p>
+      <w:pPr>
+        <w:rPr>
+          <w:lang w:val="es-419" w:eastAsia="es-CO"/>
+        </w:rPr>
+      </w:pPr>
+    </w:p>
+    <w:p>
+      <w:pPr>
+        <w:pStyle w:val="Ttulo2"/>
+      </w:pPr>
+      <w:bookmarkStart w:id="16" w:name="_Toc224715463"/>
+      <w:r>
         <w:lastRenderedPageBreak/>
-        <w:t>precisión los elementos y fases necesarias para estructurar un proyecto alineado con el contexto profesional.</w:t>
-      </w:r>
-    </w:p>
-    <w:p>
-      <w:pPr>
-        <w:rPr>
-          <w:lang w:val="es-419" w:eastAsia="es-CO"/>
-        </w:rPr>
-      </w:pPr>
-    </w:p>
-    <w:p>
-      <w:pPr>
-        <w:pStyle w:val="Ttulo2"/>
-      </w:pPr>
-      <w:bookmarkStart w:id="16" w:name="_Toc224715463"/>
-      <w:r>
         <w:t>Buenas prácticas</w:t>
       </w:r>
       <w:bookmarkEnd w:id="16"/>
@@ -7605,7 +7641,6 @@
         <w:rPr>
           <w:rStyle w:val="Ttulo5Car"/>
         </w:rPr>
-        <w:lastRenderedPageBreak/>
         <w:t>Definición adecuada de los objetivos.</w:t>
       </w:r>
       <w:r>
@@ -7631,6 +7666,7 @@
         <w:rPr>
           <w:rStyle w:val="Ttulo5Car"/>
         </w:rPr>
+        <w:lastRenderedPageBreak/>
         <w:t>Delimitación clara del alcance.</w:t>
       </w:r>
       <w:r>
@@ -7726,11 +7762,19 @@
         </w:rPr>
         <w:t xml:space="preserve"> </w:t>
       </w:r>
-      <w:r>
-        <w:rPr>
-          <w:lang w:val="es-419" w:eastAsia="es-CO"/>
-        </w:rPr>
-        <w:t>Reconocer que el proyecto se desarrolla en fases permite organizarlo de manera secuencial y estructurada. Esta práctica evita propuestas desarticuladas y favorece una comprensión ordenada del proceso.</w:t>
+      <w:proofErr w:type="gramStart"/>
+      <w:r>
+        <w:rPr>
+          <w:lang w:val="es-419" w:eastAsia="es-CO"/>
+        </w:rPr>
+        <w:t>Reconocer</w:t>
+      </w:r>
+      <w:proofErr w:type="gramEnd"/>
+      <w:r>
+        <w:rPr>
+          <w:lang w:val="es-419" w:eastAsia="es-CO"/>
+        </w:rPr>
+        <w:t xml:space="preserve"> que el proyecto se desarrolla en fases permite organizarlo de manera secuencial y estructurada. Esta práctica evita propuestas desarticuladas y favorece una comprensión ordenada del proceso.</w:t>
       </w:r>
     </w:p>
     <w:p>
@@ -7780,33 +7824,39 @@
         <w:rPr>
           <w:rStyle w:val="Ttulo5Car"/>
         </w:rPr>
+        <w:t>Revisión y reflexión sobre la formulación.</w:t>
+      </w:r>
+      <w:r>
+        <w:rPr>
+          <w:lang w:val="es-419" w:eastAsia="es-CO"/>
+        </w:rPr>
+        <w:t xml:space="preserve"> </w:t>
+      </w:r>
+      <w:r>
+        <w:rPr>
+          <w:lang w:val="es-419" w:eastAsia="es-CO"/>
+        </w:rPr>
+        <w:t>Revisar la propuesta permite identificar inconsistencias, mejorar la claridad y fortalecer la coherencia interna del proyecto. Esta práctica promueve una actitud reflexiva frente al proceso de formulación.</w:t>
+      </w:r>
+    </w:p>
+    <w:p>
+      <w:pPr>
+        <w:rPr>
+          <w:lang w:val="es-419" w:eastAsia="es-CO"/>
+        </w:rPr>
+      </w:pPr>
+      <w:r>
+        <w:rPr>
+          <w:lang w:val="es-419" w:eastAsia="es-CO"/>
+        </w:rPr>
+        <w:t xml:space="preserve">La incorporación de estas buenas prácticas contribuye a consolidar una formulación clara, organizada y coherente con el contexto profesional. Además, </w:t>
+      </w:r>
+      <w:r>
+        <w:rPr>
+          <w:lang w:val="es-419" w:eastAsia="es-CO"/>
+        </w:rPr>
         <w:lastRenderedPageBreak/>
-        <w:t>Revisión y reflexión sobre la formulación.</w:t>
-      </w:r>
-      <w:r>
-        <w:rPr>
-          <w:lang w:val="es-419" w:eastAsia="es-CO"/>
-        </w:rPr>
-        <w:t xml:space="preserve"> </w:t>
-      </w:r>
-      <w:r>
-        <w:rPr>
-          <w:lang w:val="es-419" w:eastAsia="es-CO"/>
-        </w:rPr>
-        <w:t>Revisar la propuesta permite identificar inconsistencias, mejorar la claridad y fortalecer la coherencia interna del proyecto. Esta práctica promueve una actitud reflexiva frente al proceso de formulación.</w:t>
-      </w:r>
-    </w:p>
-    <w:p>
-      <w:pPr>
-        <w:rPr>
-          <w:lang w:val="es-419" w:eastAsia="es-CO"/>
-        </w:rPr>
-      </w:pPr>
-      <w:r>
-        <w:rPr>
-          <w:lang w:val="es-419" w:eastAsia="es-CO"/>
-        </w:rPr>
-        <w:t>La incorporación de estas buenas prácticas contribuye a consolidar una formulación clara, organizada y coherente con el contexto profesional. Además, fortalece habilidades de análisis, estructuración y reflexión, fundamentales en el proceso formativo.</w:t>
+        <w:t>fortalece habilidades de análisis, estructuración y reflexión, fundamentales en el proceso formativo.</w:t>
       </w:r>
     </w:p>
     <w:p>
@@ -7857,16 +7907,14 @@
     <w:p>
       <w:pPr>
         <w:rPr>
-          <w:noProof/>
           <w:lang w:eastAsia="es-CO"/>
         </w:rPr>
       </w:pPr>
       <w:r>
         <w:rPr>
-          <w:noProof/>
           <w:lang w:eastAsia="es-CO"/>
         </w:rPr>
-        <w:t>A continuación, se presenta una síntesis de la temática estudiada en el componente formativo:</w:t>
+        <w:t>Este esquema representa de manera gráfica los conceptos fundamentales desarrollados en el componente formativo, integrando la importancia de la formulación, los elementos estructurales del proyecto, el pensamiento proyectual y los resultados esperados. Además, presenta cómo estos aspectos se relacionan entre sí para facilitar la comprensión del proceso de formulación y fortalecer la estructuración de propuestas orientadas a la solución de necesidades del contexto profesional.</w:t>
       </w:r>
     </w:p>
     <w:p>
@@ -7875,6 +7923,7 @@
           <w:tab w:val="left" w:pos="4035"/>
         </w:tabs>
         <w:ind w:firstLine="0"/>
+        <w:jc w:val="center"/>
         <w:rPr>
           <w:noProof/>
           <w:lang w:eastAsia="es-CO"/>
@@ -7885,18 +7934,11 @@
           <w:noProof/>
           <w:lang w:eastAsia="es-CO"/>
         </w:rPr>
-        <w:tab/>
-      </w:r>
-      <w:r>
-        <w:rPr>
-          <w:noProof/>
-          <w:lang w:eastAsia="es-CO"/>
-        </w:rPr>
         <w:drawing>
-          <wp:inline distT="0" distB="0" distL="0" distR="0" wp14:anchorId="0645E9F0" wp14:editId="74730C88">
-            <wp:extent cx="5527205" cy="6212840"/>
+          <wp:inline distT="0" distB="0" distL="0" distR="0" wp14:anchorId="7F2CA1E4" wp14:editId="56D1D3BB">
+            <wp:extent cx="4578699" cy="5146675"/>
             <wp:effectExtent l="0" t="0" r="0" b="0"/>
-            <wp:docPr id="11" name="Gráfico 11" descr="Síntesis sobre formulación de proyectos que incluye importancia de la formulación, definición de proyecto con necesidad y propósito, pensamiento proyectual, etapas de ejecución, tipos de proyectos, buenas prácticas y resultados finales como comprensión, organización y estructuración."/>
+            <wp:docPr id="1020179272" name="Gráfico 3" descr="Síntesis sobre formulación de proyectos que incluye importancia de la formulación, definición de proyecto con necesidad y propósito, pensamiento proyectual, etapas de ejecución, tipos de proyectos, buenas prácticas y resultados finales como comprensión, organización y estructuración."/>
             <wp:cNvGraphicFramePr>
               <a:graphicFrameLocks xmlns:a="http://schemas.openxmlformats.org/drawingml/2006/main" noChangeAspect="1"/>
             </wp:cNvGraphicFramePr>
@@ -7904,15 +7946,12 @@
               <a:graphicData uri="http://schemas.openxmlformats.org/drawingml/2006/picture">
                 <pic:pic xmlns:pic="http://schemas.openxmlformats.org/drawingml/2006/picture">
                   <pic:nvPicPr>
-                    <pic:cNvPr id="11" name="Gráfico 11" descr="Síntesis sobre formulación de proyectos que incluye importancia de la formulación, definición de proyecto con necesidad y propósito, pensamiento proyectual, etapas de ejecución, tipos de proyectos, buenas prácticas y resultados finales como comprensión, organización y estructuración."/>
+                    <pic:cNvPr id="1020179272" name="Gráfico 3" descr="Síntesis sobre formulación de proyectos que incluye importancia de la formulación, definición de proyecto con necesidad y propósito, pensamiento proyectual, etapas de ejecución, tipos de proyectos, buenas prácticas y resultados finales como comprensión, organización y estructuración."/>
                     <pic:cNvPicPr/>
                   </pic:nvPicPr>
                   <pic:blipFill>
                     <a:blip r:embed="rId15">
                       <a:extLst>
-                        <a:ext uri="{28A0092B-C50C-407E-A947-70E740481C1C}">
-                          <a14:useLocalDpi xmlns:a14="http://schemas.microsoft.com/office/drawing/2010/main" val="0"/>
-                        </a:ext>
                         <a:ext uri="{96DAC541-7B7A-43D3-8B79-37D633B846F1}">
                           <asvg:svgBlip xmlns:asvg="http://schemas.microsoft.com/office/drawing/2016/SVG/main" r:embed="rId16"/>
                         </a:ext>
@@ -7925,7 +7964,7 @@
                   <pic:spPr>
                     <a:xfrm>
                       <a:off x="0" y="0"/>
-                      <a:ext cx="5533227" cy="6219609"/>
+                      <a:ext cx="4578699" cy="5146675"/>
                     </a:xfrm>
                     <a:prstGeom prst="rect">
                       <a:avLst/>
@@ -8129,36 +8168,54 @@
       </w:hyperlink>
     </w:p>
     <w:p>
+      <w:pPr>
+        <w:rPr>
+          <w:lang w:val="en-US"/>
+        </w:rPr>
+      </w:pPr>
       <w:r>
         <w:t xml:space="preserve">Malsam, W. (2025). Definición de proyecto: ¿Qué es un proyecto y cómo debe gestionarse? </w:t>
       </w:r>
       <w:proofErr w:type="spellStart"/>
       <w:r>
+        <w:rPr>
+          <w:lang w:val="en-US"/>
+        </w:rPr>
         <w:t>ProjectManager</w:t>
       </w:r>
       <w:proofErr w:type="spellEnd"/>
       <w:r>
+        <w:rPr>
+          <w:lang w:val="en-US"/>
+        </w:rPr>
         <w:t xml:space="preserve">. </w:t>
       </w:r>
     </w:p>
     <w:p>
+      <w:pPr>
+        <w:rPr>
+          <w:lang w:val="en-US"/>
+        </w:rPr>
+      </w:pPr>
       <w:hyperlink r:id="rId18" w:history="1">
         <w:r>
           <w:rPr>
             <w:rStyle w:val="Hipervnculo"/>
+            <w:lang w:val="en-US"/>
           </w:rPr>
           <w:t>https://www.projectmanager.com/es/definicion-de-proyecto</w:t>
         </w:r>
       </w:hyperlink>
     </w:p>
     <w:p>
-      <w:proofErr w:type="spellStart"/>
-      <w:r>
-        <w:t>Martins</w:t>
-      </w:r>
-      <w:proofErr w:type="spellEnd"/>
-      <w:r>
-        <w:t xml:space="preserve">, J. (2025). Cómo redactar objetivos de un proyecto que sean eficaces. Asana. </w:t>
+      <w:r>
+        <w:rPr>
+          <w:lang w:val="en-US"/>
+        </w:rPr>
+        <w:t xml:space="preserve">Martins, J. (2025). </w:t>
+      </w:r>
+      <w:r>
+        <w:t xml:space="preserve">Cómo redactar objetivos de un proyecto que sean eficaces. Asana. </w:t>
       </w:r>
     </w:p>
     <w:p>
@@ -8418,16 +8475,8 @@
               <w:rPr>
                 <w:lang w:val="es-CO"/>
               </w:rPr>
-              <w:t xml:space="preserve">Olga Constanza Bermúdez </w:t>
-            </w:r>
-            <w:proofErr w:type="spellStart"/>
-            <w:r>
-              <w:rPr>
-                <w:lang w:val="es-CO"/>
-              </w:rPr>
-              <w:t>Jaimes</w:t>
-            </w:r>
-            <w:proofErr w:type="spellEnd"/>
+              <w:t>Olga Constanza Bermúdez Jaimes</w:t>
+            </w:r>
           </w:p>
         </w:tc>
         <w:tc>
@@ -8488,16 +8537,8 @@
               <w:rPr>
                 <w:lang w:val="es-CO"/>
               </w:rPr>
-              <w:t xml:space="preserve">Joinner Enrique Osorio </w:t>
-            </w:r>
-            <w:proofErr w:type="spellStart"/>
-            <w:r>
-              <w:rPr>
-                <w:lang w:val="es-CO"/>
-              </w:rPr>
-              <w:t>Martinez</w:t>
-            </w:r>
-            <w:proofErr w:type="spellEnd"/>
+              <w:t>Joinner Enrique Osorio Martinez</w:t>
+            </w:r>
           </w:p>
         </w:tc>
         <w:tc>
@@ -9040,28 +9081,12 @@
                 <w:lang w:val="es-CO"/>
               </w:rPr>
             </w:pPr>
-            <w:proofErr w:type="spellStart"/>
             <w:r>
               <w:rPr>
                 <w:lang w:val="es-CO"/>
               </w:rPr>
-              <w:t>Maria</w:t>
-            </w:r>
-            <w:proofErr w:type="spellEnd"/>
-            <w:r>
-              <w:rPr>
-                <w:lang w:val="es-CO"/>
-              </w:rPr>
-              <w:t xml:space="preserve"> Carolina Tamayo </w:t>
-            </w:r>
-            <w:proofErr w:type="spellStart"/>
-            <w:r>
-              <w:rPr>
-                <w:lang w:val="es-CO"/>
-              </w:rPr>
-              <w:t>Lopez</w:t>
-            </w:r>
-            <w:proofErr w:type="spellEnd"/>
+              <w:t>Maria Carolina Tamayo Lopez</w:t>
+            </w:r>
           </w:p>
         </w:tc>
         <w:tc>
@@ -12700,88 +12725,88 @@
       </w:pPr>
     </w:lvl>
   </w:abstractNum>
-  <w:num w:numId="1" w16cid:durableId="381172400">
+  <w:num w:numId="1" w16cid:durableId="1152137339">
     <w:abstractNumId w:val="27"/>
   </w:num>
-  <w:num w:numId="2" w16cid:durableId="534122973">
+  <w:num w:numId="2" w16cid:durableId="760220906">
     <w:abstractNumId w:val="0"/>
   </w:num>
-  <w:num w:numId="3" w16cid:durableId="953250353">
+  <w:num w:numId="3" w16cid:durableId="2069302061">
     <w:abstractNumId w:val="9"/>
   </w:num>
-  <w:num w:numId="4" w16cid:durableId="1837459591">
+  <w:num w:numId="4" w16cid:durableId="1538810638">
     <w:abstractNumId w:val="21"/>
   </w:num>
-  <w:num w:numId="5" w16cid:durableId="835460579">
+  <w:num w:numId="5" w16cid:durableId="1982534617">
     <w:abstractNumId w:val="12"/>
   </w:num>
-  <w:num w:numId="6" w16cid:durableId="971448360">
+  <w:num w:numId="6" w16cid:durableId="1000699672">
     <w:abstractNumId w:val="20"/>
   </w:num>
-  <w:num w:numId="7" w16cid:durableId="416094703">
+  <w:num w:numId="7" w16cid:durableId="1469586827">
     <w:abstractNumId w:val="11"/>
   </w:num>
-  <w:num w:numId="8" w16cid:durableId="1877958841">
+  <w:num w:numId="8" w16cid:durableId="997617828">
     <w:abstractNumId w:val="19"/>
   </w:num>
-  <w:num w:numId="9" w16cid:durableId="934896532">
+  <w:num w:numId="9" w16cid:durableId="808666211">
     <w:abstractNumId w:val="15"/>
   </w:num>
-  <w:num w:numId="10" w16cid:durableId="1011419643">
+  <w:num w:numId="10" w16cid:durableId="1722706572">
     <w:abstractNumId w:val="13"/>
   </w:num>
-  <w:num w:numId="11" w16cid:durableId="845749941">
+  <w:num w:numId="11" w16cid:durableId="1083988173">
     <w:abstractNumId w:val="10"/>
   </w:num>
-  <w:num w:numId="12" w16cid:durableId="1746761640">
+  <w:num w:numId="12" w16cid:durableId="178592371">
     <w:abstractNumId w:val="2"/>
   </w:num>
-  <w:num w:numId="13" w16cid:durableId="282880858">
+  <w:num w:numId="13" w16cid:durableId="743649650">
     <w:abstractNumId w:val="6"/>
   </w:num>
-  <w:num w:numId="14" w16cid:durableId="674115918">
+  <w:num w:numId="14" w16cid:durableId="863521639">
     <w:abstractNumId w:val="1"/>
   </w:num>
-  <w:num w:numId="15" w16cid:durableId="1597667567">
+  <w:num w:numId="15" w16cid:durableId="795565782">
     <w:abstractNumId w:val="24"/>
   </w:num>
-  <w:num w:numId="16" w16cid:durableId="250241898">
+  <w:num w:numId="16" w16cid:durableId="1068115929">
     <w:abstractNumId w:val="22"/>
   </w:num>
-  <w:num w:numId="17" w16cid:durableId="804856511">
+  <w:num w:numId="17" w16cid:durableId="1165246593">
     <w:abstractNumId w:val="5"/>
   </w:num>
-  <w:num w:numId="18" w16cid:durableId="498883790">
+  <w:num w:numId="18" w16cid:durableId="383483868">
     <w:abstractNumId w:val="7"/>
   </w:num>
-  <w:num w:numId="19" w16cid:durableId="137965220">
+  <w:num w:numId="19" w16cid:durableId="1380324003">
     <w:abstractNumId w:val="8"/>
   </w:num>
-  <w:num w:numId="20" w16cid:durableId="1731422632">
+  <w:num w:numId="20" w16cid:durableId="1386640248">
     <w:abstractNumId w:val="18"/>
   </w:num>
-  <w:num w:numId="21" w16cid:durableId="781074471">
+  <w:num w:numId="21" w16cid:durableId="1506820946">
     <w:abstractNumId w:val="25"/>
   </w:num>
-  <w:num w:numId="22" w16cid:durableId="647898218">
+  <w:num w:numId="22" w16cid:durableId="264114702">
     <w:abstractNumId w:val="16"/>
   </w:num>
-  <w:num w:numId="23" w16cid:durableId="760032893">
+  <w:num w:numId="23" w16cid:durableId="2069066612">
     <w:abstractNumId w:val="17"/>
   </w:num>
-  <w:num w:numId="24" w16cid:durableId="1397164901">
+  <w:num w:numId="24" w16cid:durableId="955284401">
     <w:abstractNumId w:val="4"/>
   </w:num>
-  <w:num w:numId="25" w16cid:durableId="537352322">
+  <w:num w:numId="25" w16cid:durableId="41296874">
     <w:abstractNumId w:val="23"/>
   </w:num>
-  <w:num w:numId="26" w16cid:durableId="1839156942">
+  <w:num w:numId="26" w16cid:durableId="415782432">
     <w:abstractNumId w:val="3"/>
   </w:num>
-  <w:num w:numId="27" w16cid:durableId="751506834">
+  <w:num w:numId="27" w16cid:durableId="485391443">
     <w:abstractNumId w:val="26"/>
   </w:num>
-  <w:num w:numId="28" w16cid:durableId="2110269058">
+  <w:num w:numId="28" w16cid:durableId="667563487">
     <w:abstractNumId w:val="14"/>
   </w:num>
   <w:numIdMacAtCleanup w:val="27"/>
@@ -14520,14 +14545,7 @@
 </file>
 
 <file path=customXml/item1.xml><?xml version="1.0" encoding="utf-8"?>
-<p:properties xmlns:p="http://schemas.microsoft.com/office/2006/metadata/properties" xmlns:xsi="http://www.w3.org/2001/XMLSchema-instance" xmlns:pc="http://schemas.microsoft.com/office/infopath/2007/PartnerControls">
-  <documentManagement>
-    <TaxCatchAll xmlns="13c90a0b-73bc-4dc0-be5f-28d77b615beb" xsi:nil="true"/>
-    <lcf76f155ced4ddcb4097134ff3c332f xmlns="13c93bba-48ce-428c-bfe5-88b42c19b028">
-      <Terms xmlns="http://schemas.microsoft.com/office/infopath/2007/PartnerControls"/>
-    </lcf76f155ced4ddcb4097134ff3c332f>
-  </documentManagement>
-</p:properties>
+<b:Sources xmlns:b="http://schemas.openxmlformats.org/officeDocument/2006/bibliography" xmlns="http://schemas.openxmlformats.org/officeDocument/2006/bibliography" SelectedStyle="\APASixthEditionOfficeOnline.xsl" StyleName="APA" Version="6"/>
 </file>
 
 <file path=customXml/item2.xml><?xml version="1.0" encoding="utf-8"?>
@@ -14766,7 +14784,14 @@
 </file>
 
 <file path=customXml/item3.xml><?xml version="1.0" encoding="utf-8"?>
-<b:Sources xmlns:b="http://schemas.openxmlformats.org/officeDocument/2006/bibliography" xmlns="http://schemas.openxmlformats.org/officeDocument/2006/bibliography" SelectedStyle="\APASixthEditionOfficeOnline.xsl" StyleName="APA" Version="6"/>
+<p:properties xmlns:p="http://schemas.microsoft.com/office/2006/metadata/properties" xmlns:xsi="http://www.w3.org/2001/XMLSchema-instance" xmlns:pc="http://schemas.microsoft.com/office/infopath/2007/PartnerControls">
+  <documentManagement>
+    <TaxCatchAll xmlns="13c90a0b-73bc-4dc0-be5f-28d77b615beb" xsi:nil="true"/>
+    <lcf76f155ced4ddcb4097134ff3c332f xmlns="13c93bba-48ce-428c-bfe5-88b42c19b028">
+      <Terms xmlns="http://schemas.microsoft.com/office/infopath/2007/PartnerControls"/>
+    </lcf76f155ced4ddcb4097134ff3c332f>
+  </documentManagement>
+</p:properties>
 </file>
 
 <file path=customXml/item4.xml><?xml version="1.0" encoding="utf-8"?>
@@ -14779,12 +14804,9 @@
 </file>
 
 <file path=customXml/itemProps1.xml><?xml version="1.0" encoding="utf-8"?>
-<ds:datastoreItem xmlns:ds="http://schemas.openxmlformats.org/officeDocument/2006/customXml" ds:itemID="{1279454D-02BE-4A9C-A117-DCD1573E2608}">
+<ds:datastoreItem xmlns:ds="http://schemas.openxmlformats.org/officeDocument/2006/customXml" ds:itemID="{EAE431FD-7059-4C09-804B-C9D69EB7B213}">
   <ds:schemaRefs>
-    <ds:schemaRef ds:uri="http://schemas.microsoft.com/office/2006/metadata/properties"/>
-    <ds:schemaRef ds:uri="http://schemas.microsoft.com/office/infopath/2007/PartnerControls"/>
-    <ds:schemaRef ds:uri="13c90a0b-73bc-4dc0-be5f-28d77b615beb"/>
-    <ds:schemaRef ds:uri="13c93bba-48ce-428c-bfe5-88b42c19b028"/>
+    <ds:schemaRef ds:uri="http://schemas.openxmlformats.org/officeDocument/2006/bibliography"/>
   </ds:schemaRefs>
 </ds:datastoreItem>
 </file>
@@ -14809,9 +14831,12 @@
 </file>
 
 <file path=customXml/itemProps3.xml><?xml version="1.0" encoding="utf-8"?>
-<ds:datastoreItem xmlns:ds="http://schemas.openxmlformats.org/officeDocument/2006/customXml" ds:itemID="{EAE431FD-7059-4C09-804B-C9D69EB7B213}">
+<ds:datastoreItem xmlns:ds="http://schemas.openxmlformats.org/officeDocument/2006/customXml" ds:itemID="{1279454D-02BE-4A9C-A117-DCD1573E2608}">
   <ds:schemaRefs>
-    <ds:schemaRef ds:uri="http://schemas.openxmlformats.org/officeDocument/2006/bibliography"/>
+    <ds:schemaRef ds:uri="http://schemas.microsoft.com/office/2006/metadata/properties"/>
+    <ds:schemaRef ds:uri="http://schemas.microsoft.com/office/infopath/2007/PartnerControls"/>
+    <ds:schemaRef ds:uri="13c90a0b-73bc-4dc0-be5f-28d77b615beb"/>
+    <ds:schemaRef ds:uri="13c93bba-48ce-428c-bfe5-88b42c19b028"/>
   </ds:schemaRefs>
 </ds:datastoreItem>
 </file>

</xml_diff>